<commit_message>
Szakdolgozat - végső simítások
</commit_message>
<xml_diff>
--- a/Szakdolgozat/szakdolgozat.docx
+++ b/Szakdolgozat/szakdolgozat.docx
@@ -11,7 +11,7 @@
           <w:lang w:val="hu-HU"/>
         </w:rPr>
       </w:pPr>
-      <w:bookmarkStart w:id="0" w:name="_Toc230145000"/>
+      <w:bookmarkStart w:id="0" w:name="_Toc230163344"/>
       <w:r>
         <w:rPr>
           <w:lang w:val="hu-HU"/>
@@ -32,34 +32,253 @@
     <w:p>
       <w:pPr>
         <w:pStyle w:val="dfk2"/>
-        <w:spacing w:line="240" w:lineRule="auto"/>
-      </w:pPr>
-      <w:r>
-        <w:rPr>
-          <w:lang w:val="hu-HU"/>
-        </w:rPr>
-        <w:t>A témavezető által megfogalmazott feladatkiírás. Önálló oldalon szerepel.</w:t>
-      </w:r>
-      <w:r>
+        <w:rPr>
+          <w:sz w:val="24"/>
+          <w:lang w:val="hu-HU"/>
+        </w:rPr>
+      </w:pPr>
+      <w:r>
+        <w:rPr>
+          <w:lang w:val="hu-HU"/>
+        </w:rPr>
+        <w:t></w:t>
+      </w:r>
+      <w:r>
+        <w:rPr>
+          <w:b/>
+          <w:bCs/>
+          <w:sz w:val="24"/>
+          <w:lang w:val="hu-HU"/>
+        </w:rPr>
+        <w:t>Szakirodalmi kutatás és az elméleti háttér feltárása:</w:t>
+      </w:r>
+      <w:r>
+        <w:rPr>
+          <w:sz w:val="24"/>
+          <w:lang w:val="hu-HU"/>
+        </w:rPr>
+        <w:t xml:space="preserve"> A multidimenzionális idősorok reprezentációtanulásával kapcsolatos nemzetközi szakirodalom kritikus áttekintése. Kiemelt figyelem fordítása a modern idősoros alapmodellekre (különösen a Transformer-alapú MOMENT modellre), valamint a hagyományos és mélytanulás-alapú felügyelet nélküli klaszterezési eljárások elméleti hátterére.</w:t>
+      </w:r>
+    </w:p>
+    <w:p>
+      <w:pPr>
+        <w:pStyle w:val="dfk2"/>
+        <w:rPr>
+          <w:sz w:val="24"/>
+          <w:lang w:val="hu-HU"/>
+        </w:rPr>
+      </w:pPr>
+      <w:r>
+        <w:rPr>
+          <w:sz w:val="24"/>
+          <w:lang w:val="hu-HU"/>
+        </w:rPr>
+        <w:t></w:t>
+      </w:r>
+      <w:r>
+        <w:rPr>
+          <w:b/>
+          <w:bCs/>
+          <w:sz w:val="24"/>
+          <w:lang w:val="hu-HU"/>
+        </w:rPr>
+        <w:t>Az adathalmaz előkészítése és kezelése:</w:t>
+      </w:r>
+      <w:r>
+        <w:rPr>
+          <w:sz w:val="24"/>
+          <w:lang w:val="hu-HU"/>
+        </w:rPr>
+        <w:t xml:space="preserve"> A PTB-XL klinikai EKG adathalmaz strukturális elemzése, tisztítása és standardizálása. Az orvosi adatokra jellemző súlyos osztály-kiegyensúlyozatlanság elméleti és gyakorlati problémáinak kezelése célzott mintavételezési stratégiák kidolgozásával.</w:t>
+      </w:r>
+    </w:p>
+    <w:p>
+      <w:pPr>
+        <w:pStyle w:val="dfk2"/>
+        <w:rPr>
+          <w:sz w:val="24"/>
+          <w:lang w:val="hu-HU"/>
+        </w:rPr>
+      </w:pPr>
+      <w:r>
+        <w:rPr>
+          <w:sz w:val="24"/>
+          <w:lang w:val="hu-HU"/>
+        </w:rPr>
+        <w:t></w:t>
+      </w:r>
+      <w:r>
+        <w:rPr>
+          <w:b/>
+          <w:bCs/>
+          <w:sz w:val="24"/>
+          <w:lang w:val="hu-HU"/>
+        </w:rPr>
+        <w:t>Jellemzőkinyerés alapmodellel:</w:t>
+      </w:r>
+      <w:r>
+        <w:rPr>
+          <w:sz w:val="24"/>
+          <w:lang w:val="hu-HU"/>
+        </w:rPr>
+        <w:t xml:space="preserve"> A nyers, 12 elvezetéses EKG-idősorok leképezése sűrű, magas dimenziós (1024 dimenziós) jellemzővektorokká a pre-trained MOMENT alapmodell segítségével.</w:t>
+      </w:r>
+    </w:p>
+    <w:p>
+      <w:pPr>
+        <w:pStyle w:val="dfk2"/>
+        <w:rPr>
+          <w:sz w:val="24"/>
+          <w:lang w:val="hu-HU"/>
+        </w:rPr>
+      </w:pPr>
+      <w:r>
+        <w:rPr>
+          <w:sz w:val="24"/>
+          <w:lang w:val="hu-HU"/>
+        </w:rPr>
+        <w:t></w:t>
+      </w:r>
+      <w:r>
+        <w:rPr>
+          <w:b/>
+          <w:bCs/>
+          <w:sz w:val="24"/>
+          <w:lang w:val="hu-HU"/>
+        </w:rPr>
+        <w:t>Dimenziócsökkentés és hagyományos klaszterezés:</w:t>
+      </w:r>
+      <w:r>
+        <w:rPr>
+          <w:sz w:val="24"/>
+          <w:lang w:val="hu-HU"/>
+        </w:rPr>
+        <w:t xml:space="preserve"> A „dimenziók átkának” kezelésére lineáris (PCA) és, nemlineáris (UMAP) dimenziócsökkentési eljárások alkalmazása. Alapvonal</w:t>
+      </w:r>
+      <w:r>
+        <w:rPr>
+          <w:sz w:val="24"/>
+          <w:lang w:val="hu-HU"/>
+        </w:rPr>
         <w:t xml:space="preserve"> </w:t>
       </w:r>
+      <w:r>
+        <w:rPr>
+          <w:sz w:val="24"/>
+          <w:lang w:val="hu-HU"/>
+        </w:rPr>
+        <w:t>és fejlett felügyelet nélküli algoritmusok (K-Means, DBSCAN, HDBSCAN, GMM) implementálása, valamint hiperparamétereik automatizált optimalizálása (Optuna keretrendszerrel) a teljes és a kiegyensúlyozott adattereken.</w:t>
+      </w:r>
     </w:p>
     <w:p>
       <w:pPr>
         <w:pStyle w:val="dfk2"/>
-        <w:spacing w:line="240" w:lineRule="auto"/>
-      </w:pPr>
+        <w:rPr>
+          <w:sz w:val="24"/>
+          <w:lang w:val="hu-HU"/>
+        </w:rPr>
+      </w:pPr>
+      <w:r>
+        <w:rPr>
+          <w:sz w:val="24"/>
+          <w:lang w:val="hu-HU"/>
+        </w:rPr>
+        <w:t></w:t>
+      </w:r>
+      <w:r>
+        <w:rPr>
+          <w:b/>
+          <w:bCs/>
+          <w:sz w:val="24"/>
+          <w:lang w:val="hu-HU"/>
+        </w:rPr>
+        <w:t>Mély beágyazott klaszterezés megvalósítása:</w:t>
+      </w:r>
+      <w:r>
+        <w:rPr>
+          <w:sz w:val="24"/>
+          <w:lang w:val="hu-HU"/>
+        </w:rPr>
+        <w:t xml:space="preserve"> Deep Embedded Clustering (DEC) és Improved Deep Embedded Clustering (IDEC) architektúrák tervezése és szoftveres implementációja PyTorch környezetben. Az autoenkóderes előtanítás és a KL-divergencia alapú klaszterezési finomhangolás kétlépcsős folyamatának kidolgozása a látens tér dinamikus átrendezése érdekében.</w:t>
+      </w:r>
     </w:p>
     <w:p>
       <w:pPr>
         <w:pStyle w:val="dfk2"/>
-        <w:spacing w:line="240" w:lineRule="auto"/>
-      </w:pPr>
+        <w:rPr>
+          <w:sz w:val="24"/>
+          <w:lang w:val="hu-HU"/>
+        </w:rPr>
+      </w:pPr>
+      <w:r>
+        <w:rPr>
+          <w:sz w:val="24"/>
+          <w:lang w:val="hu-HU"/>
+        </w:rPr>
+        <w:t></w:t>
+      </w:r>
+      <w:r>
+        <w:rPr>
+          <w:b/>
+          <w:bCs/>
+          <w:sz w:val="24"/>
+          <w:lang w:val="hu-HU"/>
+        </w:rPr>
+        <w:t>Kiértékelés és összehasonlító elemzés:</w:t>
+      </w:r>
+      <w:r>
+        <w:rPr>
+          <w:sz w:val="24"/>
+          <w:lang w:val="hu-HU"/>
+        </w:rPr>
+        <w:t xml:space="preserve"> A vizsgált modellek teljesítményének kvantitatív (ARI, NMI, Purity, Classification Report) és kvalitatív (tévesztési mátrixok, eloszlásábrák) kiértékelése. A statisztikai/valószínűségi megközelítések és a mélytanulásos tér-átrendezés eredményeinek kritikai </w:t>
+      </w:r>
+      <w:r>
+        <w:rPr>
+          <w:sz w:val="24"/>
+          <w:lang w:val="hu-HU"/>
+        </w:rPr>
+        <w:t>elemzése</w:t>
+      </w:r>
+      <w:r>
+        <w:rPr>
+          <w:sz w:val="24"/>
+          <w:lang w:val="hu-HU"/>
+        </w:rPr>
+        <w:t>, különös tekintettel a klinikai kategóriák közötti természetes átfedésekre.</w:t>
+      </w:r>
+    </w:p>
+    <w:p>
+      <w:pPr>
+        <w:pStyle w:val="dfk2"/>
+      </w:pPr>
+      <w:r>
+        <w:rPr>
+          <w:sz w:val="24"/>
+          <w:lang w:val="hu-HU"/>
+        </w:rPr>
+        <w:t></w:t>
+      </w:r>
+      <w:r>
+        <w:rPr>
+          <w:b/>
+          <w:bCs/>
+          <w:sz w:val="24"/>
+          <w:lang w:val="hu-HU"/>
+        </w:rPr>
+        <w:t>Dokumentáció:</w:t>
+      </w:r>
+      <w:r>
+        <w:rPr>
+          <w:sz w:val="24"/>
+          <w:lang w:val="hu-HU"/>
+        </w:rPr>
+        <w:t xml:space="preserve"> A kutatási részeredmények összefoglalása, a szakmai konklúziók levonása és a jövőbeli fejlesztési lehetőségek megfogalmazása, valamint a szakdolgozat végleges formába öntése a Szegedi Tudományegyetem tartalmi és formai követelményeinek megfelelően.</w:t>
+      </w:r>
       <w:r>
         <w:br w:type="page"/>
       </w:r>
     </w:p>
-    <w:p/>
     <w:p>
       <w:pPr>
         <w:pStyle w:val="Heading2"/>
@@ -68,11 +287,12 @@
           <w:lang w:val="hu-HU"/>
         </w:rPr>
       </w:pPr>
-      <w:bookmarkStart w:id="1" w:name="_Toc230145001"/>
-      <w:r>
-        <w:rPr>
-          <w:lang w:val="hu-HU"/>
-        </w:rPr>
+      <w:bookmarkStart w:id="1" w:name="_Toc230163345"/>
+      <w:r>
+        <w:rPr>
+          <w:lang w:val="hu-HU"/>
+        </w:rPr>
+        <w:lastRenderedPageBreak/>
         <w:t>Tartalmi összefoglaló</w:t>
       </w:r>
       <w:bookmarkEnd w:id="1"/>
@@ -399,7 +619,7 @@
         <w:pStyle w:val="Heading2"/>
         <w:jc w:val="center"/>
       </w:pPr>
-      <w:bookmarkStart w:id="2" w:name="_Toc230145002"/>
+      <w:bookmarkStart w:id="2" w:name="_Toc230163346"/>
       <w:r>
         <w:lastRenderedPageBreak/>
         <w:t>Tartalomjegyzék</w:t>
@@ -454,7 +674,7 @@
             </w:rPr>
             <w:fldChar w:fldCharType="separate"/>
           </w:r>
-          <w:hyperlink w:anchor="_Toc230145000" w:history="1">
+          <w:hyperlink w:anchor="_Toc230163344" w:history="1">
             <w:r>
               <w:rPr>
                 <w:rStyle w:val="Hyperlink"/>
@@ -479,7 +699,7 @@
               <w:rPr>
                 <w:noProof/>
               </w:rPr>
-              <w:instrText xml:space="preserve"> PAGEREF _Toc230145000 \h </w:instrText>
+              <w:instrText xml:space="preserve"> PAGEREF _Toc230163344 \h </w:instrText>
             </w:r>
             <w:r>
               <w:rPr>
@@ -524,7 +744,7 @@
               <w14:ligatures w14:val="standardContextual"/>
             </w:rPr>
           </w:pPr>
-          <w:hyperlink w:anchor="_Toc230145001" w:history="1">
+          <w:hyperlink w:anchor="_Toc230163345" w:history="1">
             <w:r>
               <w:rPr>
                 <w:rStyle w:val="Hyperlink"/>
@@ -549,7 +769,7 @@
               <w:rPr>
                 <w:noProof/>
               </w:rPr>
-              <w:instrText xml:space="preserve"> PAGEREF _Toc230145001 \h </w:instrText>
+              <w:instrText xml:space="preserve"> PAGEREF _Toc230163345 \h </w:instrText>
             </w:r>
             <w:r>
               <w:rPr>
@@ -594,7 +814,7 @@
               <w14:ligatures w14:val="standardContextual"/>
             </w:rPr>
           </w:pPr>
-          <w:hyperlink w:anchor="_Toc230145002" w:history="1">
+          <w:hyperlink w:anchor="_Toc230163346" w:history="1">
             <w:r>
               <w:rPr>
                 <w:rStyle w:val="Hyperlink"/>
@@ -618,7 +838,7 @@
               <w:rPr>
                 <w:noProof/>
               </w:rPr>
-              <w:instrText xml:space="preserve"> PAGEREF _Toc230145002 \h </w:instrText>
+              <w:instrText xml:space="preserve"> PAGEREF _Toc230163346 \h </w:instrText>
             </w:r>
             <w:r>
               <w:rPr>
@@ -662,7 +882,7 @@
               <w14:ligatures w14:val="standardContextual"/>
             </w:rPr>
           </w:pPr>
-          <w:hyperlink w:anchor="_Toc230145003" w:history="1">
+          <w:hyperlink w:anchor="_Toc230163347" w:history="1">
             <w:r>
               <w:rPr>
                 <w:rStyle w:val="Hyperlink"/>
@@ -687,7 +907,7 @@
               <w:rPr>
                 <w:noProof/>
               </w:rPr>
-              <w:instrText xml:space="preserve"> PAGEREF _Toc230145003 \h </w:instrText>
+              <w:instrText xml:space="preserve"> PAGEREF _Toc230163347 \h </w:instrText>
             </w:r>
             <w:r>
               <w:rPr>
@@ -731,7 +951,7 @@
               <w14:ligatures w14:val="standardContextual"/>
             </w:rPr>
           </w:pPr>
-          <w:hyperlink w:anchor="_Toc230145004" w:history="1">
+          <w:hyperlink w:anchor="_Toc230163348" w:history="1">
             <w:r>
               <w:rPr>
                 <w:rStyle w:val="Hyperlink"/>
@@ -756,7 +976,7 @@
               <w:rPr>
                 <w:noProof/>
               </w:rPr>
-              <w:instrText xml:space="preserve"> PAGEREF _Toc230145004 \h </w:instrText>
+              <w:instrText xml:space="preserve"> PAGEREF _Toc230163348 \h </w:instrText>
             </w:r>
             <w:r>
               <w:rPr>
@@ -801,7 +1021,7 @@
               <w14:ligatures w14:val="standardContextual"/>
             </w:rPr>
           </w:pPr>
-          <w:hyperlink w:anchor="_Toc230145005" w:history="1">
+          <w:hyperlink w:anchor="_Toc230163349" w:history="1">
             <w:r>
               <w:rPr>
                 <w:rStyle w:val="Hyperlink"/>
@@ -834,7 +1054,7 @@
               <w:rPr>
                 <w:noProof/>
               </w:rPr>
-              <w:instrText xml:space="preserve"> PAGEREF _Toc230145005 \h </w:instrText>
+              <w:instrText xml:space="preserve"> PAGEREF _Toc230163349 \h </w:instrText>
             </w:r>
             <w:r>
               <w:rPr>
@@ -879,14 +1099,14 @@
               <w14:ligatures w14:val="standardContextual"/>
             </w:rPr>
           </w:pPr>
-          <w:hyperlink w:anchor="_Toc230145006" w:history="1">
+          <w:hyperlink w:anchor="_Toc230163350" w:history="1">
             <w:r>
               <w:rPr>
                 <w:rStyle w:val="Hyperlink"/>
                 <w:noProof/>
                 <w:lang w:val="hu-HU"/>
               </w:rPr>
-              <w:t xml:space="preserve">1.2.  </w:t>
+              <w:t xml:space="preserve">1.2. </w:t>
             </w:r>
             <w:r>
               <w:rPr>
@@ -912,7 +1132,7 @@
               <w:rPr>
                 <w:noProof/>
               </w:rPr>
-              <w:instrText xml:space="preserve"> PAGEREF _Toc230145006 \h </w:instrText>
+              <w:instrText xml:space="preserve"> PAGEREF _Toc230163350 \h </w:instrText>
             </w:r>
             <w:r>
               <w:rPr>
@@ -957,14 +1177,14 @@
               <w14:ligatures w14:val="standardContextual"/>
             </w:rPr>
           </w:pPr>
-          <w:hyperlink w:anchor="_Toc230145007" w:history="1">
+          <w:hyperlink w:anchor="_Toc230163351" w:history="1">
             <w:r>
               <w:rPr>
                 <w:rStyle w:val="Hyperlink"/>
                 <w:noProof/>
                 <w:lang w:val="hu-HU"/>
               </w:rPr>
-              <w:t xml:space="preserve">1.3.  </w:t>
+              <w:t xml:space="preserve">1.3. </w:t>
             </w:r>
             <w:r>
               <w:rPr>
@@ -990,7 +1210,7 @@
               <w:rPr>
                 <w:noProof/>
               </w:rPr>
-              <w:instrText xml:space="preserve"> PAGEREF _Toc230145007 \h </w:instrText>
+              <w:instrText xml:space="preserve"> PAGEREF _Toc230163351 \h </w:instrText>
             </w:r>
             <w:r>
               <w:rPr>
@@ -1035,14 +1255,14 @@
               <w14:ligatures w14:val="standardContextual"/>
             </w:rPr>
           </w:pPr>
-          <w:hyperlink w:anchor="_Toc230145008" w:history="1">
+          <w:hyperlink w:anchor="_Toc230163352" w:history="1">
             <w:r>
               <w:rPr>
                 <w:rStyle w:val="Hyperlink"/>
                 <w:noProof/>
                 <w:lang w:val="hu-HU" w:eastAsia="hu-HU"/>
               </w:rPr>
-              <w:t>1.4  Deep Learning alapú klaszterezés: DEC, IDEC bemutatása</w:t>
+              <w:t>1.4 Deep Learning alapú klaszterezés: DEC, IDEC bemutatása</w:t>
             </w:r>
             <w:r>
               <w:rPr>
@@ -1060,7 +1280,7 @@
               <w:rPr>
                 <w:noProof/>
               </w:rPr>
-              <w:instrText xml:space="preserve"> PAGEREF _Toc230145008 \h </w:instrText>
+              <w:instrText xml:space="preserve"> PAGEREF _Toc230163352 \h </w:instrText>
             </w:r>
             <w:r>
               <w:rPr>
@@ -1104,14 +1324,14 @@
               <w14:ligatures w14:val="standardContextual"/>
             </w:rPr>
           </w:pPr>
-          <w:hyperlink w:anchor="_Toc230145009" w:history="1">
+          <w:hyperlink w:anchor="_Toc230163353" w:history="1">
             <w:r>
               <w:rPr>
                 <w:rStyle w:val="Hyperlink"/>
                 <w:noProof/>
                 <w:lang w:val="hu-HU"/>
               </w:rPr>
-              <w:t xml:space="preserve">2.  </w:t>
+              <w:t xml:space="preserve">2. </w:t>
             </w:r>
             <w:r>
               <w:rPr>
@@ -1137,7 +1357,7 @@
               <w:rPr>
                 <w:noProof/>
               </w:rPr>
-              <w:instrText xml:space="preserve"> PAGEREF _Toc230145009 \h </w:instrText>
+              <w:instrText xml:space="preserve"> PAGEREF _Toc230163353 \h </w:instrText>
             </w:r>
             <w:r>
               <w:rPr>
@@ -1182,7 +1402,7 @@
               <w14:ligatures w14:val="standardContextual"/>
             </w:rPr>
           </w:pPr>
-          <w:hyperlink w:anchor="_Toc230145010" w:history="1">
+          <w:hyperlink w:anchor="_Toc230163354" w:history="1">
             <w:r>
               <w:rPr>
                 <w:rStyle w:val="Hyperlink"/>
@@ -1206,7 +1426,7 @@
               <w:rPr>
                 <w:noProof/>
               </w:rPr>
-              <w:instrText xml:space="preserve"> PAGEREF _Toc230145010 \h </w:instrText>
+              <w:instrText xml:space="preserve"> PAGEREF _Toc230163354 \h </w:instrText>
             </w:r>
             <w:r>
               <w:rPr>
@@ -1249,7 +1469,7 @@
               <w14:ligatures w14:val="standardContextual"/>
             </w:rPr>
           </w:pPr>
-          <w:hyperlink w:anchor="_Toc230145011" w:history="1">
+          <w:hyperlink w:anchor="_Toc230163355" w:history="1">
             <w:r>
               <w:rPr>
                 <w:rStyle w:val="Hyperlink"/>
@@ -1273,7 +1493,7 @@
               <w:rPr>
                 <w:noProof/>
               </w:rPr>
-              <w:instrText xml:space="preserve"> PAGEREF _Toc230145011 \h </w:instrText>
+              <w:instrText xml:space="preserve"> PAGEREF _Toc230163355 \h </w:instrText>
             </w:r>
             <w:r>
               <w:rPr>
@@ -1316,7 +1536,7 @@
               <w14:ligatures w14:val="standardContextual"/>
             </w:rPr>
           </w:pPr>
-          <w:hyperlink w:anchor="_Toc230145012" w:history="1">
+          <w:hyperlink w:anchor="_Toc230163356" w:history="1">
             <w:r>
               <w:rPr>
                 <w:rStyle w:val="Hyperlink"/>
@@ -1340,7 +1560,7 @@
               <w:rPr>
                 <w:noProof/>
               </w:rPr>
-              <w:instrText xml:space="preserve"> PAGEREF _Toc230145012 \h </w:instrText>
+              <w:instrText xml:space="preserve"> PAGEREF _Toc230163356 \h </w:instrText>
             </w:r>
             <w:r>
               <w:rPr>
@@ -1383,7 +1603,7 @@
               <w14:ligatures w14:val="standardContextual"/>
             </w:rPr>
           </w:pPr>
-          <w:hyperlink w:anchor="_Toc230145013" w:history="1">
+          <w:hyperlink w:anchor="_Toc230163357" w:history="1">
             <w:r>
               <w:rPr>
                 <w:rStyle w:val="Hyperlink"/>
@@ -1407,7 +1627,7 @@
               <w:rPr>
                 <w:noProof/>
               </w:rPr>
-              <w:instrText xml:space="preserve"> PAGEREF _Toc230145013 \h </w:instrText>
+              <w:instrText xml:space="preserve"> PAGEREF _Toc230163357 \h </w:instrText>
             </w:r>
             <w:r>
               <w:rPr>
@@ -1452,13 +1672,13 @@
               <w14:ligatures w14:val="standardContextual"/>
             </w:rPr>
           </w:pPr>
-          <w:hyperlink w:anchor="_Toc230145014" w:history="1">
+          <w:hyperlink w:anchor="_Toc230163358" w:history="1">
             <w:r>
               <w:rPr>
                 <w:rStyle w:val="Hyperlink"/>
                 <w:noProof/>
               </w:rPr>
-              <w:t xml:space="preserve">2.2.  </w:t>
+              <w:t xml:space="preserve">2.2. </w:t>
             </w:r>
             <w:r>
               <w:rPr>
@@ -1484,7 +1704,7 @@
               <w:rPr>
                 <w:noProof/>
               </w:rPr>
-              <w:instrText xml:space="preserve"> PAGEREF _Toc230145014 \h </w:instrText>
+              <w:instrText xml:space="preserve"> PAGEREF _Toc230163358 \h </w:instrText>
             </w:r>
             <w:r>
               <w:rPr>
@@ -1527,7 +1747,7 @@
               <w14:ligatures w14:val="standardContextual"/>
             </w:rPr>
           </w:pPr>
-          <w:hyperlink w:anchor="_Toc230145015" w:history="1">
+          <w:hyperlink w:anchor="_Toc230163359" w:history="1">
             <w:r>
               <w:rPr>
                 <w:rStyle w:val="Hyperlink"/>
@@ -1551,7 +1771,7 @@
               <w:rPr>
                 <w:noProof/>
               </w:rPr>
-              <w:instrText xml:space="preserve"> PAGEREF _Toc230145015 \h </w:instrText>
+              <w:instrText xml:space="preserve"> PAGEREF _Toc230163359 \h </w:instrText>
             </w:r>
             <w:r>
               <w:rPr>
@@ -1594,7 +1814,7 @@
               <w14:ligatures w14:val="standardContextual"/>
             </w:rPr>
           </w:pPr>
-          <w:hyperlink w:anchor="_Toc230145016" w:history="1">
+          <w:hyperlink w:anchor="_Toc230163360" w:history="1">
             <w:r>
               <w:rPr>
                 <w:rStyle w:val="Hyperlink"/>
@@ -1618,7 +1838,7 @@
               <w:rPr>
                 <w:noProof/>
               </w:rPr>
-              <w:instrText xml:space="preserve"> PAGEREF _Toc230145016 \h </w:instrText>
+              <w:instrText xml:space="preserve"> PAGEREF _Toc230163360 \h </w:instrText>
             </w:r>
             <w:r>
               <w:rPr>
@@ -1661,7 +1881,7 @@
               <w14:ligatures w14:val="standardContextual"/>
             </w:rPr>
           </w:pPr>
-          <w:hyperlink w:anchor="_Toc230145017" w:history="1">
+          <w:hyperlink w:anchor="_Toc230163361" w:history="1">
             <w:r>
               <w:rPr>
                 <w:rStyle w:val="Hyperlink"/>
@@ -1685,7 +1905,7 @@
               <w:rPr>
                 <w:noProof/>
               </w:rPr>
-              <w:instrText xml:space="preserve"> PAGEREF _Toc230145017 \h </w:instrText>
+              <w:instrText xml:space="preserve"> PAGEREF _Toc230163361 \h </w:instrText>
             </w:r>
             <w:r>
               <w:rPr>
@@ -1730,13 +1950,13 @@
               <w14:ligatures w14:val="standardContextual"/>
             </w:rPr>
           </w:pPr>
-          <w:hyperlink w:anchor="_Toc230145018" w:history="1">
+          <w:hyperlink w:anchor="_Toc230163362" w:history="1">
             <w:r>
               <w:rPr>
                 <w:rStyle w:val="Hyperlink"/>
                 <w:noProof/>
               </w:rPr>
-              <w:t xml:space="preserve">2.3.  </w:t>
+              <w:t xml:space="preserve">2.3. </w:t>
             </w:r>
             <w:r>
               <w:rPr>
@@ -1762,7 +1982,7 @@
               <w:rPr>
                 <w:noProof/>
               </w:rPr>
-              <w:instrText xml:space="preserve"> PAGEREF _Toc230145018 \h </w:instrText>
+              <w:instrText xml:space="preserve"> PAGEREF _Toc230163362 \h </w:instrText>
             </w:r>
             <w:r>
               <w:rPr>
@@ -1805,7 +2025,7 @@
               <w14:ligatures w14:val="standardContextual"/>
             </w:rPr>
           </w:pPr>
-          <w:hyperlink w:anchor="_Toc230145019" w:history="1">
+          <w:hyperlink w:anchor="_Toc230163363" w:history="1">
             <w:r>
               <w:rPr>
                 <w:rStyle w:val="Hyperlink"/>
@@ -1829,7 +2049,7 @@
               <w:rPr>
                 <w:noProof/>
               </w:rPr>
-              <w:instrText xml:space="preserve"> PAGEREF _Toc230145019 \h </w:instrText>
+              <w:instrText xml:space="preserve"> PAGEREF _Toc230163363 \h </w:instrText>
             </w:r>
             <w:r>
               <w:rPr>
@@ -1872,7 +2092,7 @@
               <w14:ligatures w14:val="standardContextual"/>
             </w:rPr>
           </w:pPr>
-          <w:hyperlink w:anchor="_Toc230145020" w:history="1">
+          <w:hyperlink w:anchor="_Toc230163364" w:history="1">
             <w:r>
               <w:rPr>
                 <w:rStyle w:val="Hyperlink"/>
@@ -1896,7 +2116,7 @@
               <w:rPr>
                 <w:noProof/>
               </w:rPr>
-              <w:instrText xml:space="preserve"> PAGEREF _Toc230145020 \h </w:instrText>
+              <w:instrText xml:space="preserve"> PAGEREF _Toc230163364 \h </w:instrText>
             </w:r>
             <w:r>
               <w:rPr>
@@ -1939,7 +2159,7 @@
               <w14:ligatures w14:val="standardContextual"/>
             </w:rPr>
           </w:pPr>
-          <w:hyperlink w:anchor="_Toc230145021" w:history="1">
+          <w:hyperlink w:anchor="_Toc230163365" w:history="1">
             <w:r>
               <w:rPr>
                 <w:rStyle w:val="Hyperlink"/>
@@ -1963,7 +2183,7 @@
               <w:rPr>
                 <w:noProof/>
               </w:rPr>
-              <w:instrText xml:space="preserve"> PAGEREF _Toc230145021 \h </w:instrText>
+              <w:instrText xml:space="preserve"> PAGEREF _Toc230163365 \h </w:instrText>
             </w:r>
             <w:r>
               <w:rPr>
@@ -2006,7 +2226,7 @@
               <w14:ligatures w14:val="standardContextual"/>
             </w:rPr>
           </w:pPr>
-          <w:hyperlink w:anchor="_Toc230145022" w:history="1">
+          <w:hyperlink w:anchor="_Toc230163366" w:history="1">
             <w:r>
               <w:rPr>
                 <w:rStyle w:val="Hyperlink"/>
@@ -2030,7 +2250,7 @@
               <w:rPr>
                 <w:noProof/>
               </w:rPr>
-              <w:instrText xml:space="preserve"> PAGEREF _Toc230145022 \h </w:instrText>
+              <w:instrText xml:space="preserve"> PAGEREF _Toc230163366 \h </w:instrText>
             </w:r>
             <w:r>
               <w:rPr>
@@ -2075,7 +2295,7 @@
               <w14:ligatures w14:val="standardContextual"/>
             </w:rPr>
           </w:pPr>
-          <w:hyperlink w:anchor="_Toc230145023" w:history="1">
+          <w:hyperlink w:anchor="_Toc230163367" w:history="1">
             <w:r>
               <w:rPr>
                 <w:rStyle w:val="Hyperlink"/>
@@ -2100,7 +2320,7 @@
               <w:rPr>
                 <w:noProof/>
               </w:rPr>
-              <w:instrText xml:space="preserve"> PAGEREF _Toc230145023 \h </w:instrText>
+              <w:instrText xml:space="preserve"> PAGEREF _Toc230163367 \h </w:instrText>
             </w:r>
             <w:r>
               <w:rPr>
@@ -2143,13 +2363,13 @@
               <w14:ligatures w14:val="standardContextual"/>
             </w:rPr>
           </w:pPr>
-          <w:hyperlink w:anchor="_Toc230145024" w:history="1">
+          <w:hyperlink w:anchor="_Toc230163368" w:history="1">
             <w:r>
               <w:rPr>
                 <w:rStyle w:val="Hyperlink"/>
                 <w:noProof/>
               </w:rPr>
-              <w:t xml:space="preserve">2.3.1. </w:t>
+              <w:t xml:space="preserve">2.4.1. </w:t>
             </w:r>
             <w:r>
               <w:rPr>
@@ -2175,7 +2395,7 @@
               <w:rPr>
                 <w:noProof/>
               </w:rPr>
-              <w:instrText xml:space="preserve"> PAGEREF _Toc230145024 \h </w:instrText>
+              <w:instrText xml:space="preserve"> PAGEREF _Toc230163368 \h </w:instrText>
             </w:r>
             <w:r>
               <w:rPr>
@@ -2218,13 +2438,13 @@
               <w14:ligatures w14:val="standardContextual"/>
             </w:rPr>
           </w:pPr>
-          <w:hyperlink w:anchor="_Toc230145025" w:history="1">
+          <w:hyperlink w:anchor="_Toc230163369" w:history="1">
             <w:r>
               <w:rPr>
                 <w:rStyle w:val="Hyperlink"/>
                 <w:noProof/>
               </w:rPr>
-              <w:t xml:space="preserve">2.3.2. </w:t>
+              <w:t xml:space="preserve">2.4.2. </w:t>
             </w:r>
             <w:r>
               <w:rPr>
@@ -2250,7 +2470,7 @@
               <w:rPr>
                 <w:noProof/>
               </w:rPr>
-              <w:instrText xml:space="preserve"> PAGEREF _Toc230145025 \h </w:instrText>
+              <w:instrText xml:space="preserve"> PAGEREF _Toc230163369 \h </w:instrText>
             </w:r>
             <w:r>
               <w:rPr>
@@ -2293,13 +2513,13 @@
               <w14:ligatures w14:val="standardContextual"/>
             </w:rPr>
           </w:pPr>
-          <w:hyperlink w:anchor="_Toc230145026" w:history="1">
+          <w:hyperlink w:anchor="_Toc230163370" w:history="1">
             <w:r>
               <w:rPr>
                 <w:rStyle w:val="Hyperlink"/>
                 <w:noProof/>
               </w:rPr>
-              <w:t>2.3.3. Sűrűségalapú megközelítés</w:t>
+              <w:t>2.4.3. Sűrűségalapú megközelítés</w:t>
             </w:r>
             <w:r>
               <w:rPr>
@@ -2317,7 +2537,7 @@
               <w:rPr>
                 <w:noProof/>
               </w:rPr>
-              <w:instrText xml:space="preserve"> PAGEREF _Toc230145026 \h </w:instrText>
+              <w:instrText xml:space="preserve"> PAGEREF _Toc230163370 \h </w:instrText>
             </w:r>
             <w:r>
               <w:rPr>
@@ -2360,13 +2580,13 @@
               <w14:ligatures w14:val="standardContextual"/>
             </w:rPr>
           </w:pPr>
-          <w:hyperlink w:anchor="_Toc230145027" w:history="1">
+          <w:hyperlink w:anchor="_Toc230163371" w:history="1">
             <w:r>
               <w:rPr>
                 <w:rStyle w:val="Hyperlink"/>
                 <w:noProof/>
               </w:rPr>
-              <w:t>2.3.4. Kiegyensúlyozott adathalmaz és optimalizálási keretrendszer</w:t>
+              <w:t>2.4.4. Kiegyensúlyozott adathalmaz és optimalizálási keretrendszer</w:t>
             </w:r>
             <w:r>
               <w:rPr>
@@ -2384,7 +2604,7 @@
               <w:rPr>
                 <w:noProof/>
               </w:rPr>
-              <w:instrText xml:space="preserve"> PAGEREF _Toc230145027 \h </w:instrText>
+              <w:instrText xml:space="preserve"> PAGEREF _Toc230163371 \h </w:instrText>
             </w:r>
             <w:r>
               <w:rPr>
@@ -2427,13 +2647,13 @@
               <w14:ligatures w14:val="standardContextual"/>
             </w:rPr>
           </w:pPr>
-          <w:hyperlink w:anchor="_Toc230145028" w:history="1">
+          <w:hyperlink w:anchor="_Toc230163372" w:history="1">
             <w:r>
               <w:rPr>
                 <w:rStyle w:val="Hyperlink"/>
                 <w:noProof/>
               </w:rPr>
-              <w:t>2.x.x. HDBSCAN + UMAP és GMM + PCA implementációja a keretrendszerben</w:t>
+              <w:t>2.4.5. HDBSCAN + UMAP és GMM + PCA implementációja a keretrendszerben</w:t>
             </w:r>
             <w:r>
               <w:rPr>
@@ -2451,7 +2671,7 @@
               <w:rPr>
                 <w:noProof/>
               </w:rPr>
-              <w:instrText xml:space="preserve"> PAGEREF _Toc230145028 \h </w:instrText>
+              <w:instrText xml:space="preserve"> PAGEREF _Toc230163372 \h </w:instrText>
             </w:r>
             <w:r>
               <w:rPr>
@@ -2496,7 +2716,7 @@
               <w14:ligatures w14:val="standardContextual"/>
             </w:rPr>
           </w:pPr>
-          <w:hyperlink w:anchor="_Toc230145029" w:history="1">
+          <w:hyperlink w:anchor="_Toc230163373" w:history="1">
             <w:r>
               <w:rPr>
                 <w:rStyle w:val="Hyperlink"/>
@@ -2520,7 +2740,7 @@
               <w:rPr>
                 <w:noProof/>
               </w:rPr>
-              <w:instrText xml:space="preserve"> PAGEREF _Toc230145029 \h </w:instrText>
+              <w:instrText xml:space="preserve"> PAGEREF _Toc230163373 \h </w:instrText>
             </w:r>
             <w:r>
               <w:rPr>
@@ -2537,7 +2757,7 @@
               <w:rPr>
                 <w:noProof/>
               </w:rPr>
-              <w:t>27</w:t>
+              <w:t>26</w:t>
             </w:r>
             <w:r>
               <w:rPr>
@@ -2563,13 +2783,13 @@
               <w14:ligatures w14:val="standardContextual"/>
             </w:rPr>
           </w:pPr>
-          <w:hyperlink w:anchor="_Toc230145030" w:history="1">
+          <w:hyperlink w:anchor="_Toc230163374" w:history="1">
             <w:r>
               <w:rPr>
                 <w:rStyle w:val="Hyperlink"/>
                 <w:noProof/>
               </w:rPr>
-              <w:t>2.4.1. Adatelőkészítés és az Autoencoder felépítése</w:t>
+              <w:t>2.5.1. Adatelőkészítés és az Autoencoder felépítése</w:t>
             </w:r>
             <w:r>
               <w:rPr>
@@ -2587,7 +2807,7 @@
               <w:rPr>
                 <w:noProof/>
               </w:rPr>
-              <w:instrText xml:space="preserve"> PAGEREF _Toc230145030 \h </w:instrText>
+              <w:instrText xml:space="preserve"> PAGEREF _Toc230163374 \h </w:instrText>
             </w:r>
             <w:r>
               <w:rPr>
@@ -2630,13 +2850,13 @@
               <w14:ligatures w14:val="standardContextual"/>
             </w:rPr>
           </w:pPr>
-          <w:hyperlink w:anchor="_Toc230145031" w:history="1">
+          <w:hyperlink w:anchor="_Toc230163375" w:history="1">
             <w:r>
               <w:rPr>
                 <w:rStyle w:val="Hyperlink"/>
                 <w:noProof/>
               </w:rPr>
-              <w:t>2.4.2. A DEC és IDEC modellek implementációja és architektúrája</w:t>
+              <w:t>2.5.2. A DEC és IDEC modellek implementációja és architektúrája</w:t>
             </w:r>
             <w:r>
               <w:rPr>
@@ -2654,7 +2874,7 @@
               <w:rPr>
                 <w:noProof/>
               </w:rPr>
-              <w:instrText xml:space="preserve"> PAGEREF _Toc230145031 \h </w:instrText>
+              <w:instrText xml:space="preserve"> PAGEREF _Toc230163375 \h </w:instrText>
             </w:r>
             <w:r>
               <w:rPr>
@@ -2697,13 +2917,13 @@
               <w14:ligatures w14:val="standardContextual"/>
             </w:rPr>
           </w:pPr>
-          <w:hyperlink w:anchor="_Toc230145032" w:history="1">
+          <w:hyperlink w:anchor="_Toc230163376" w:history="1">
             <w:r>
               <w:rPr>
                 <w:rStyle w:val="Hyperlink"/>
                 <w:noProof/>
               </w:rPr>
-              <w:t>2.4.3. A hálózatok hiperparaméterei és a tanítási folyamat</w:t>
+              <w:t>2.5.3. A hálózatok hiperparaméterei és a tanítási folyamat</w:t>
             </w:r>
             <w:r>
               <w:rPr>
@@ -2721,7 +2941,7 @@
               <w:rPr>
                 <w:noProof/>
               </w:rPr>
-              <w:instrText xml:space="preserve"> PAGEREF _Toc230145032 \h </w:instrText>
+              <w:instrText xml:space="preserve"> PAGEREF _Toc230163376 \h </w:instrText>
             </w:r>
             <w:r>
               <w:rPr>
@@ -2765,14 +2985,14 @@
               <w14:ligatures w14:val="standardContextual"/>
             </w:rPr>
           </w:pPr>
-          <w:hyperlink w:anchor="_Toc230145033" w:history="1">
+          <w:hyperlink w:anchor="_Toc230163377" w:history="1">
             <w:r>
               <w:rPr>
                 <w:rStyle w:val="Hyperlink"/>
                 <w:noProof/>
                 <w:lang w:val="hu-HU"/>
               </w:rPr>
-              <w:t xml:space="preserve">3.  </w:t>
+              <w:t xml:space="preserve">3. </w:t>
             </w:r>
             <w:r>
               <w:rPr>
@@ -2798,7 +3018,7 @@
               <w:rPr>
                 <w:noProof/>
               </w:rPr>
-              <w:instrText xml:space="preserve"> PAGEREF _Toc230145033 \h </w:instrText>
+              <w:instrText xml:space="preserve"> PAGEREF _Toc230163377 \h </w:instrText>
             </w:r>
             <w:r>
               <w:rPr>
@@ -2843,14 +3063,14 @@
               <w14:ligatures w14:val="standardContextual"/>
             </w:rPr>
           </w:pPr>
-          <w:hyperlink w:anchor="_Toc230145034" w:history="1">
+          <w:hyperlink w:anchor="_Toc230163378" w:history="1">
             <w:r>
               <w:rPr>
                 <w:rStyle w:val="Hyperlink"/>
                 <w:noProof/>
                 <w:lang w:val="hu-HU"/>
               </w:rPr>
-              <w:t xml:space="preserve">3.1.  </w:t>
+              <w:t xml:space="preserve">3.1. </w:t>
             </w:r>
             <w:r>
               <w:rPr>
@@ -2876,7 +3096,7 @@
               <w:rPr>
                 <w:noProof/>
               </w:rPr>
-              <w:instrText xml:space="preserve"> PAGEREF _Toc230145034 \h </w:instrText>
+              <w:instrText xml:space="preserve"> PAGEREF _Toc230163378 \h </w:instrText>
             </w:r>
             <w:r>
               <w:rPr>
@@ -2893,7 +3113,7 @@
               <w:rPr>
                 <w:noProof/>
               </w:rPr>
-              <w:t>30</w:t>
+              <w:t>29</w:t>
             </w:r>
             <w:r>
               <w:rPr>
@@ -2919,7 +3139,7 @@
               <w14:ligatures w14:val="standardContextual"/>
             </w:rPr>
           </w:pPr>
-          <w:hyperlink w:anchor="_Toc230145035" w:history="1">
+          <w:hyperlink w:anchor="_Toc230163379" w:history="1">
             <w:r>
               <w:rPr>
                 <w:rStyle w:val="Hyperlink"/>
@@ -2943,7 +3163,7 @@
               <w:rPr>
                 <w:noProof/>
               </w:rPr>
-              <w:instrText xml:space="preserve"> PAGEREF _Toc230145035 \h </w:instrText>
+              <w:instrText xml:space="preserve"> PAGEREF _Toc230163379 \h </w:instrText>
             </w:r>
             <w:r>
               <w:rPr>
@@ -2986,7 +3206,7 @@
               <w14:ligatures w14:val="standardContextual"/>
             </w:rPr>
           </w:pPr>
-          <w:hyperlink w:anchor="_Toc230145036" w:history="1">
+          <w:hyperlink w:anchor="_Toc230163380" w:history="1">
             <w:r>
               <w:rPr>
                 <w:rStyle w:val="Hyperlink"/>
@@ -3010,7 +3230,7 @@
               <w:rPr>
                 <w:noProof/>
               </w:rPr>
-              <w:instrText xml:space="preserve"> PAGEREF _Toc230145036 \h </w:instrText>
+              <w:instrText xml:space="preserve"> PAGEREF _Toc230163380 \h </w:instrText>
             </w:r>
             <w:r>
               <w:rPr>
@@ -3053,7 +3273,7 @@
               <w14:ligatures w14:val="standardContextual"/>
             </w:rPr>
           </w:pPr>
-          <w:hyperlink w:anchor="_Toc230145037" w:history="1">
+          <w:hyperlink w:anchor="_Toc230163381" w:history="1">
             <w:r>
               <w:rPr>
                 <w:rStyle w:val="Hyperlink"/>
@@ -3077,7 +3297,7 @@
               <w:rPr>
                 <w:noProof/>
               </w:rPr>
-              <w:instrText xml:space="preserve"> PAGEREF _Toc230145037 \h </w:instrText>
+              <w:instrText xml:space="preserve"> PAGEREF _Toc230163381 \h </w:instrText>
             </w:r>
             <w:r>
               <w:rPr>
@@ -3094,7 +3314,7 @@
               <w:rPr>
                 <w:noProof/>
               </w:rPr>
-              <w:t>33</w:t>
+              <w:t>34</w:t>
             </w:r>
             <w:r>
               <w:rPr>
@@ -3122,14 +3342,14 @@
               <w14:ligatures w14:val="standardContextual"/>
             </w:rPr>
           </w:pPr>
-          <w:hyperlink w:anchor="_Toc230145038" w:history="1">
+          <w:hyperlink w:anchor="_Toc230163382" w:history="1">
             <w:r>
               <w:rPr>
                 <w:rStyle w:val="Hyperlink"/>
                 <w:noProof/>
                 <w:lang w:val="hu-HU"/>
               </w:rPr>
-              <w:t xml:space="preserve">3.2.  </w:t>
+              <w:t xml:space="preserve">3.2. </w:t>
             </w:r>
             <w:r>
               <w:rPr>
@@ -3155,7 +3375,7 @@
               <w:rPr>
                 <w:noProof/>
               </w:rPr>
-              <w:instrText xml:space="preserve"> PAGEREF _Toc230145038 \h </w:instrText>
+              <w:instrText xml:space="preserve"> PAGEREF _Toc230163382 \h </w:instrText>
             </w:r>
             <w:r>
               <w:rPr>
@@ -3172,7 +3392,7 @@
               <w:rPr>
                 <w:noProof/>
               </w:rPr>
-              <w:t>35</w:t>
+              <w:t>36</w:t>
             </w:r>
             <w:r>
               <w:rPr>
@@ -3200,14 +3420,14 @@
               <w14:ligatures w14:val="standardContextual"/>
             </w:rPr>
           </w:pPr>
-          <w:hyperlink w:anchor="_Toc230145039" w:history="1">
+          <w:hyperlink w:anchor="_Toc230163383" w:history="1">
             <w:r>
               <w:rPr>
                 <w:rStyle w:val="Hyperlink"/>
                 <w:noProof/>
                 <w:lang w:val="hu-HU"/>
               </w:rPr>
-              <w:t xml:space="preserve">3.3.  </w:t>
+              <w:t xml:space="preserve">3.3. </w:t>
             </w:r>
             <w:r>
               <w:rPr>
@@ -3232,7 +3452,7 @@
               <w:rPr>
                 <w:noProof/>
               </w:rPr>
-              <w:instrText xml:space="preserve"> PAGEREF _Toc230145039 \h </w:instrText>
+              <w:instrText xml:space="preserve"> PAGEREF _Toc230163383 \h </w:instrText>
             </w:r>
             <w:r>
               <w:rPr>
@@ -3249,7 +3469,7 @@
               <w:rPr>
                 <w:noProof/>
               </w:rPr>
-              <w:t>36</w:t>
+              <w:t>38</w:t>
             </w:r>
             <w:r>
               <w:rPr>
@@ -3276,14 +3496,14 @@
               <w14:ligatures w14:val="standardContextual"/>
             </w:rPr>
           </w:pPr>
-          <w:hyperlink w:anchor="_Toc230145040" w:history="1">
+          <w:hyperlink w:anchor="_Toc230163384" w:history="1">
             <w:r>
               <w:rPr>
                 <w:rStyle w:val="Hyperlink"/>
                 <w:noProof/>
                 <w:lang w:val="hu-HU"/>
               </w:rPr>
-              <w:t xml:space="preserve">4.  </w:t>
+              <w:t xml:space="preserve">4. </w:t>
             </w:r>
             <w:r>
               <w:rPr>
@@ -3309,7 +3529,7 @@
               <w:rPr>
                 <w:noProof/>
               </w:rPr>
-              <w:instrText xml:space="preserve"> PAGEREF _Toc230145040 \h </w:instrText>
+              <w:instrText xml:space="preserve"> PAGEREF _Toc230163384 \h </w:instrText>
             </w:r>
             <w:r>
               <w:rPr>
@@ -3326,7 +3546,7 @@
               <w:rPr>
                 <w:noProof/>
               </w:rPr>
-              <w:t>37</w:t>
+              <w:t>39</w:t>
             </w:r>
             <w:r>
               <w:rPr>
@@ -3354,7 +3574,7 @@
               <w14:ligatures w14:val="standardContextual"/>
             </w:rPr>
           </w:pPr>
-          <w:hyperlink w:anchor="_Toc230145041" w:history="1">
+          <w:hyperlink w:anchor="_Toc230163385" w:history="1">
             <w:r>
               <w:rPr>
                 <w:rStyle w:val="Hyperlink"/>
@@ -3386,7 +3606,7 @@
               <w:rPr>
                 <w:noProof/>
               </w:rPr>
-              <w:instrText xml:space="preserve"> PAGEREF _Toc230145041 \h </w:instrText>
+              <w:instrText xml:space="preserve"> PAGEREF _Toc230163385 \h </w:instrText>
             </w:r>
             <w:r>
               <w:rPr>
@@ -3403,7 +3623,7 @@
               <w:rPr>
                 <w:noProof/>
               </w:rPr>
-              <w:t>37</w:t>
+              <w:t>39</w:t>
             </w:r>
             <w:r>
               <w:rPr>
@@ -3431,7 +3651,7 @@
               <w14:ligatures w14:val="standardContextual"/>
             </w:rPr>
           </w:pPr>
-          <w:hyperlink w:anchor="_Toc230145042" w:history="1">
+          <w:hyperlink w:anchor="_Toc230163386" w:history="1">
             <w:r>
               <w:rPr>
                 <w:rStyle w:val="Hyperlink"/>
@@ -3463,7 +3683,7 @@
               <w:rPr>
                 <w:noProof/>
               </w:rPr>
-              <w:instrText xml:space="preserve"> PAGEREF _Toc230145042 \h </w:instrText>
+              <w:instrText xml:space="preserve"> PAGEREF _Toc230163386 \h </w:instrText>
             </w:r>
             <w:r>
               <w:rPr>
@@ -3480,7 +3700,7 @@
               <w:rPr>
                 <w:noProof/>
               </w:rPr>
-              <w:t>37</w:t>
+              <w:t>39</w:t>
             </w:r>
             <w:r>
               <w:rPr>
@@ -3508,7 +3728,7 @@
               <w14:ligatures w14:val="standardContextual"/>
             </w:rPr>
           </w:pPr>
-          <w:hyperlink w:anchor="_Toc230145043" w:history="1">
+          <w:hyperlink w:anchor="_Toc230163387" w:history="1">
             <w:r>
               <w:rPr>
                 <w:rStyle w:val="Hyperlink"/>
@@ -3522,21 +3742,7 @@
                 <w:rStyle w:val="Hyperlink"/>
                 <w:noProof/>
               </w:rPr>
-              <w:t>Jövőbeli kut</w:t>
-            </w:r>
-            <w:r>
-              <w:rPr>
-                <w:rStyle w:val="Hyperlink"/>
-                <w:noProof/>
-              </w:rPr>
-              <w:t>a</w:t>
-            </w:r>
-            <w:r>
-              <w:rPr>
-                <w:rStyle w:val="Hyperlink"/>
-                <w:noProof/>
-              </w:rPr>
-              <w:t>tási irányok és fejlesztési lehetőségek</w:t>
+              <w:t>Jövőbeli kutatási irányok és fejlesztési lehetőségek</w:t>
             </w:r>
             <w:r>
               <w:rPr>
@@ -3554,7 +3760,7 @@
               <w:rPr>
                 <w:noProof/>
               </w:rPr>
-              <w:instrText xml:space="preserve"> PAGEREF _Toc230145043 \h </w:instrText>
+              <w:instrText xml:space="preserve"> PAGEREF _Toc230163387 \h </w:instrText>
             </w:r>
             <w:r>
               <w:rPr>
@@ -3571,7 +3777,7 @@
               <w:rPr>
                 <w:noProof/>
               </w:rPr>
-              <w:t>38</w:t>
+              <w:t>40</w:t>
             </w:r>
             <w:r>
               <w:rPr>
@@ -3599,7 +3805,7 @@
               <w14:ligatures w14:val="standardContextual"/>
             </w:rPr>
           </w:pPr>
-          <w:hyperlink w:anchor="_Toc230145044" w:history="1">
+          <w:hyperlink w:anchor="_Toc230163388" w:history="1">
             <w:r>
               <w:rPr>
                 <w:rStyle w:val="Hyperlink"/>
@@ -3624,7 +3830,7 @@
               <w:rPr>
                 <w:noProof/>
               </w:rPr>
-              <w:instrText xml:space="preserve"> PAGEREF _Toc230145044 \h </w:instrText>
+              <w:instrText xml:space="preserve"> PAGEREF _Toc230163388 \h </w:instrText>
             </w:r>
             <w:r>
               <w:rPr>
@@ -3641,7 +3847,7 @@
               <w:rPr>
                 <w:noProof/>
               </w:rPr>
-              <w:t>40</w:t>
+              <w:t>41</w:t>
             </w:r>
             <w:r>
               <w:rPr>
@@ -3669,14 +3875,14 @@
               <w14:ligatures w14:val="standardContextual"/>
             </w:rPr>
           </w:pPr>
-          <w:hyperlink w:anchor="_Toc230145045" w:history="1">
+          <w:hyperlink w:anchor="_Toc230163389" w:history="1">
             <w:r>
               <w:rPr>
                 <w:rStyle w:val="Hyperlink"/>
                 <w:noProof/>
                 <w:lang w:val="hu-HU"/>
               </w:rPr>
-              <w:t>Nyilatkozat</w:t>
+              <w:t>Köszönetnyilvánítás</w:t>
             </w:r>
             <w:r>
               <w:rPr>
@@ -3694,7 +3900,7 @@
               <w:rPr>
                 <w:noProof/>
               </w:rPr>
-              <w:instrText xml:space="preserve"> PAGEREF _Toc230145045 \h </w:instrText>
+              <w:instrText xml:space="preserve"> PAGEREF _Toc230163389 \h </w:instrText>
             </w:r>
             <w:r>
               <w:rPr>
@@ -3711,77 +3917,7 @@
               <w:rPr>
                 <w:noProof/>
               </w:rPr>
-              <w:t>41</w:t>
-            </w:r>
-            <w:r>
-              <w:rPr>
-                <w:noProof/>
-              </w:rPr>
-              <w:fldChar w:fldCharType="end"/>
-            </w:r>
-          </w:hyperlink>
-        </w:p>
-        <w:p>
-          <w:pPr>
-            <w:pStyle w:val="TOC2"/>
-            <w:tabs>
-              <w:tab w:val="right" w:leader="dot" w:pos="9062"/>
-            </w:tabs>
-            <w:rPr>
-              <w:rFonts w:asciiTheme="minorHAnsi" w:eastAsiaTheme="minorEastAsia" w:hAnsiTheme="minorHAnsi" w:cstheme="minorBidi"/>
-              <w:b w:val="0"/>
-              <w:bCs w:val="0"/>
-              <w:noProof/>
-              <w:kern w:val="2"/>
-              <w:sz w:val="24"/>
-              <w:szCs w:val="24"/>
-              <w:lang w:val="hu-HU" w:eastAsia="hu-HU"/>
-              <w14:ligatures w14:val="standardContextual"/>
-            </w:rPr>
-          </w:pPr>
-          <w:hyperlink w:anchor="_Toc230145046" w:history="1">
-            <w:r>
-              <w:rPr>
-                <w:rStyle w:val="Hyperlink"/>
-                <w:noProof/>
-                <w:lang w:val="hu-HU"/>
-              </w:rPr>
-              <w:t>Köszönetnyilvánítás</w:t>
-            </w:r>
-            <w:r>
-              <w:rPr>
-                <w:noProof/>
-              </w:rPr>
-              <w:tab/>
-            </w:r>
-            <w:r>
-              <w:rPr>
-                <w:noProof/>
-              </w:rPr>
-              <w:fldChar w:fldCharType="begin"/>
-            </w:r>
-            <w:r>
-              <w:rPr>
-                <w:noProof/>
-              </w:rPr>
-              <w:instrText xml:space="preserve"> PAGEREF _Toc230145046 \h </w:instrText>
-            </w:r>
-            <w:r>
-              <w:rPr>
-                <w:noProof/>
-              </w:rPr>
-            </w:r>
-            <w:r>
-              <w:rPr>
-                <w:noProof/>
-              </w:rPr>
-              <w:fldChar w:fldCharType="separate"/>
-            </w:r>
-            <w:r>
-              <w:rPr>
-                <w:noProof/>
-              </w:rPr>
-              <w:t>42</w:t>
+              <w:t>43</w:t>
             </w:r>
             <w:r>
               <w:rPr>
@@ -3852,7 +3988,7 @@
           <w:lang w:val="hu-HU"/>
         </w:rPr>
       </w:pPr>
-      <w:bookmarkStart w:id="3" w:name="_Toc230145003"/>
+      <w:bookmarkStart w:id="3" w:name="_Toc230163347"/>
       <w:r>
         <w:rPr>
           <w:lang w:val="hu-HU"/>
@@ -3999,7 +4135,7 @@
           <w:lang w:val="hu-HU"/>
         </w:rPr>
       </w:pPr>
-      <w:bookmarkStart w:id="4" w:name="_Toc230145004"/>
+      <w:bookmarkStart w:id="4" w:name="_Toc230163348"/>
       <w:r>
         <w:rPr>
           <w:lang w:val="hu-HU"/>
@@ -4057,7 +4193,7 @@
           <w:lang w:val="hu-HU"/>
         </w:rPr>
       </w:pPr>
-      <w:bookmarkStart w:id="5" w:name="_Toc230145005"/>
+      <w:bookmarkStart w:id="5" w:name="_Toc230163349"/>
       <w:r>
         <w:rPr>
           <w:lang w:val="hu-HU"/>
@@ -4230,12 +4366,12 @@
           <w:lang w:val="hu-HU"/>
         </w:rPr>
       </w:pPr>
-      <w:bookmarkStart w:id="6" w:name="_Toc230145006"/>
-      <w:r>
-        <w:rPr>
-          <w:lang w:val="hu-HU"/>
-        </w:rPr>
-        <w:t xml:space="preserve">1.2.  </w:t>
+      <w:bookmarkStart w:id="6" w:name="_Toc230163350"/>
+      <w:r>
+        <w:rPr>
+          <w:lang w:val="hu-HU"/>
+        </w:rPr>
+        <w:t xml:space="preserve">1.2. </w:t>
       </w:r>
       <w:hyperlink w:anchor="__RefHeading___Toc80443493">
         <w:r>
@@ -4408,12 +4544,12 @@
           <w:lang w:val="hu-HU"/>
         </w:rPr>
       </w:pPr>
-      <w:bookmarkStart w:id="7" w:name="_Toc230145007"/>
-      <w:r>
-        <w:rPr>
-          <w:lang w:val="hu-HU"/>
-        </w:rPr>
-        <w:t xml:space="preserve">1.3.  </w:t>
+      <w:bookmarkStart w:id="7" w:name="_Toc230163351"/>
+      <w:r>
+        <w:rPr>
+          <w:lang w:val="hu-HU"/>
+        </w:rPr>
+        <w:t xml:space="preserve">1.3. </w:t>
       </w:r>
       <w:hyperlink w:anchor="__RefHeading___Toc80443494">
         <w:r>
@@ -4659,12 +4795,12 @@
           <w:lang w:val="hu-HU"/>
         </w:rPr>
       </w:pPr>
-      <w:bookmarkStart w:id="8" w:name="_Toc230145008"/>
+      <w:bookmarkStart w:id="8" w:name="_Toc230163352"/>
       <w:r>
         <w:rPr>
           <w:lang w:val="hu-HU" w:eastAsia="hu-HU"/>
         </w:rPr>
-        <w:t>1.4  Deep Learning alapú klaszterezés: DEC, IDEC bemutatása</w:t>
+        <w:t>1.4 Deep Learning alapú klaszterezés: DEC, IDEC bemutatása</w:t>
       </w:r>
       <w:bookmarkEnd w:id="8"/>
     </w:p>
@@ -4943,12 +5079,12 @@
       <w:pPr>
         <w:pStyle w:val="Heading1"/>
       </w:pPr>
-      <w:bookmarkStart w:id="9" w:name="_Toc230145009"/>
-      <w:r>
-        <w:rPr>
-          <w:lang w:val="hu-HU"/>
-        </w:rPr>
-        <w:t xml:space="preserve">2.  </w:t>
+      <w:bookmarkStart w:id="9" w:name="_Toc230163353"/>
+      <w:r>
+        <w:rPr>
+          <w:lang w:val="hu-HU"/>
+        </w:rPr>
+        <w:t xml:space="preserve">2. </w:t>
       </w:r>
       <w:hyperlink w:anchor="__RefHeading___Toc80443501">
         <w:r>
@@ -4965,7 +5101,7 @@
         <w:pStyle w:val="Heading2"/>
       </w:pPr>
       <w:bookmarkStart w:id="10" w:name="__RefHeading___Toc80443499_Copy_1_Copy_1"/>
-      <w:bookmarkStart w:id="11" w:name="_Toc230145010"/>
+      <w:bookmarkStart w:id="11" w:name="_Toc230163354"/>
       <w:bookmarkEnd w:id="10"/>
       <w:r>
         <w:t>2.1. Hardveres és szoftveres környezet</w:t>
@@ -4987,7 +5123,7 @@
       <w:pPr>
         <w:pStyle w:val="Heading3"/>
       </w:pPr>
-      <w:bookmarkStart w:id="12" w:name="_Toc230145011"/>
+      <w:bookmarkStart w:id="12" w:name="_Toc230163355"/>
       <w:r>
         <w:t>2.1.1. Hardveres erőforrás</w:t>
       </w:r>
@@ -5013,7 +5149,7 @@
       <w:pPr>
         <w:pStyle w:val="Heading3"/>
       </w:pPr>
-      <w:bookmarkStart w:id="13" w:name="_Toc230145012"/>
+      <w:bookmarkStart w:id="13" w:name="_Toc230163356"/>
       <w:r>
         <w:t>2.1.2. Szoftveres platform és fejlesztői környezet</w:t>
       </w:r>
@@ -5034,7 +5170,7 @@
       <w:pPr>
         <w:pStyle w:val="Heading3"/>
       </w:pPr>
-      <w:bookmarkStart w:id="14" w:name="_Toc230145013"/>
+      <w:bookmarkStart w:id="14" w:name="_Toc230163357"/>
       <w:r>
         <w:t>2.1.3. Főbb felhasznált python könyvtárak</w:t>
       </w:r>
@@ -5575,9 +5711,9 @@
       <w:pPr>
         <w:pStyle w:val="Heading2"/>
       </w:pPr>
-      <w:bookmarkStart w:id="15" w:name="_Toc230145014"/>
-      <w:r>
-        <w:t xml:space="preserve">2.2.  </w:t>
+      <w:bookmarkStart w:id="15" w:name="_Toc230163358"/>
+      <w:r>
+        <w:t xml:space="preserve">2.2. </w:t>
       </w:r>
       <w:hyperlink w:anchor="__RefHeading___Toc80443496">
         <w:r>
@@ -5610,7 +5746,7 @@
         <w:pStyle w:val="Heading3"/>
       </w:pPr>
       <w:bookmarkStart w:id="16" w:name="__RefHeading___Toc80443499_Copy_1"/>
-      <w:bookmarkStart w:id="17" w:name="_Toc230145015"/>
+      <w:bookmarkStart w:id="17" w:name="_Toc230163359"/>
       <w:bookmarkEnd w:id="16"/>
       <w:r>
         <w:rPr>
@@ -5682,7 +5818,7 @@
       <w:pPr>
         <w:pStyle w:val="Heading3"/>
       </w:pPr>
-      <w:bookmarkStart w:id="18" w:name="_Toc230145016"/>
+      <w:bookmarkStart w:id="18" w:name="_Toc230163360"/>
       <w:r>
         <w:t>2.2.2 Az EKG jelek feldolgozása és dimenziói</w:t>
       </w:r>
@@ -5738,7 +5874,7 @@
       <w:pPr>
         <w:pStyle w:val="Heading3"/>
       </w:pPr>
-      <w:bookmarkStart w:id="19" w:name="_Toc230145017"/>
+      <w:bookmarkStart w:id="19" w:name="_Toc230163361"/>
       <w:r>
         <w:t>2.2.3. Interpoláció és egységesítés</w:t>
       </w:r>
@@ -5816,9 +5952,9 @@
       <w:pPr>
         <w:pStyle w:val="Heading2"/>
       </w:pPr>
-      <w:bookmarkStart w:id="20" w:name="_Toc230145018"/>
-      <w:r>
-        <w:t xml:space="preserve">2.3.  </w:t>
+      <w:bookmarkStart w:id="20" w:name="_Toc230163362"/>
+      <w:r>
+        <w:t xml:space="preserve">2.3. </w:t>
       </w:r>
       <w:hyperlink w:anchor="__RefHeading___Toc80443497">
         <w:r>
@@ -5859,7 +5995,7 @@
       <w:pPr>
         <w:pStyle w:val="Heading3"/>
       </w:pPr>
-      <w:bookmarkStart w:id="21" w:name="_Toc230145019"/>
+      <w:bookmarkStart w:id="21" w:name="_Toc230163363"/>
       <w:r>
         <w:t>2.3.1. A MOMENT alapmodell elméleti háttere és működése</w:t>
       </w:r>
@@ -5968,7 +6104,7 @@
       <w:pPr>
         <w:pStyle w:val="Heading3"/>
       </w:pPr>
-      <w:bookmarkStart w:id="22" w:name="_Toc230145020"/>
+      <w:bookmarkStart w:id="22" w:name="_Toc230163364"/>
       <w:r>
         <w:t>2.3.2. A bemeneti adatok standardizálása és tenzorrá alakítása</w:t>
       </w:r>
@@ -6138,7 +6274,7 @@
           <w:numId w:val="0"/>
         </w:numPr>
       </w:pPr>
-      <w:bookmarkStart w:id="27" w:name="_Toc230145021"/>
+      <w:bookmarkStart w:id="27" w:name="_Toc230163365"/>
       <w:r>
         <w:t>2.3.3. A modell inicializálása és az input maszkolás</w:t>
       </w:r>
@@ -6220,7 +6356,7 @@
       <w:pPr>
         <w:pStyle w:val="Heading3"/>
       </w:pPr>
-      <w:bookmarkStart w:id="28" w:name="_Toc230145022"/>
+      <w:bookmarkStart w:id="28" w:name="_Toc230163366"/>
       <w:r>
         <w:t>2.3.4. Az inferencia folyamata és a memóriakezelés</w:t>
       </w:r>
@@ -6492,7 +6628,7 @@
           <w:lang w:val="hu-HU"/>
         </w:rPr>
       </w:pPr>
-      <w:bookmarkStart w:id="29" w:name="_Toc230145023"/>
+      <w:bookmarkStart w:id="29" w:name="_Toc230163367"/>
       <w:r>
         <w:rPr>
           <w:lang w:val="hu-HU"/>
@@ -6530,13 +6666,27 @@
       <w:pPr>
         <w:pStyle w:val="Heading3"/>
       </w:pPr>
-      <w:bookmarkStart w:id="30" w:name="_Toc230145024"/>
+      <w:bookmarkStart w:id="30" w:name="_Toc230163368"/>
       <w:r>
         <w:rPr>
           <w:sz w:val="24"/>
           <w:szCs w:val="24"/>
         </w:rPr>
-        <w:t xml:space="preserve">2.3.1. </w:t>
+        <w:t>2.</w:t>
+      </w:r>
+      <w:r>
+        <w:rPr>
+          <w:sz w:val="24"/>
+          <w:szCs w:val="24"/>
+        </w:rPr>
+        <w:t>4</w:t>
+      </w:r>
+      <w:r>
+        <w:rPr>
+          <w:sz w:val="24"/>
+          <w:szCs w:val="24"/>
+        </w:rPr>
+        <w:t xml:space="preserve">.1. </w:t>
       </w:r>
       <w:r>
         <w:rPr>
@@ -6718,9 +6868,15 @@
       <w:pPr>
         <w:pStyle w:val="Heading3"/>
       </w:pPr>
-      <w:bookmarkStart w:id="31" w:name="_Toc230145025"/>
-      <w:r>
-        <w:t xml:space="preserve">2.3.2. </w:t>
+      <w:bookmarkStart w:id="31" w:name="_Toc230163369"/>
+      <w:r>
+        <w:t>2.</w:t>
+      </w:r>
+      <w:r>
+        <w:t>4</w:t>
+      </w:r>
+      <w:r>
+        <w:t xml:space="preserve">.2. </w:t>
       </w:r>
       <w:r>
         <w:rPr>
@@ -6876,9 +7032,15 @@
       <w:pPr>
         <w:pStyle w:val="Heading3"/>
       </w:pPr>
-      <w:bookmarkStart w:id="32" w:name="_Toc230145026"/>
-      <w:r>
-        <w:t>2.3.3. Sűrűségalapú megközelítés</w:t>
+      <w:bookmarkStart w:id="32" w:name="_Toc230163370"/>
+      <w:r>
+        <w:t>2.</w:t>
+      </w:r>
+      <w:r>
+        <w:t>4</w:t>
+      </w:r>
+      <w:r>
+        <w:t>.3. Sűrűségalapú megközelítés</w:t>
       </w:r>
       <w:bookmarkEnd w:id="32"/>
     </w:p>
@@ -7072,9 +7234,15 @@
       <w:pPr>
         <w:pStyle w:val="Heading3"/>
       </w:pPr>
-      <w:bookmarkStart w:id="33" w:name="_Toc230145027"/>
-      <w:r>
-        <w:t>2.3.4. Kiegyensúlyozott adathalmaz és optimalizálási keretrendszer</w:t>
+      <w:bookmarkStart w:id="33" w:name="_Toc230163371"/>
+      <w:r>
+        <w:t>2.</w:t>
+      </w:r>
+      <w:r>
+        <w:t>4</w:t>
+      </w:r>
+      <w:r>
+        <w:t>.4. Kiegyensúlyozott adathalmaz és optimalizálási keretrendszer</w:t>
       </w:r>
       <w:bookmarkEnd w:id="33"/>
       <w:r>
@@ -7383,10 +7551,22 @@
       <w:pPr>
         <w:pStyle w:val="Heading3"/>
       </w:pPr>
-      <w:bookmarkStart w:id="34" w:name="_Toc230145028"/>
+      <w:bookmarkStart w:id="34" w:name="_Toc230163372"/>
       <w:r>
         <w:lastRenderedPageBreak/>
-        <w:t>2.x.x. HDBSCAN + UMAP és GMM + PCA implementációja a keretrendszerben</w:t>
+        <w:t>2.</w:t>
+      </w:r>
+      <w:r>
+        <w:t>4</w:t>
+      </w:r>
+      <w:r>
+        <w:t>.</w:t>
+      </w:r>
+      <w:r>
+        <w:t>5</w:t>
+      </w:r>
+      <w:r>
+        <w:t>. HDBSCAN + UMAP és GMM + PCA implementációja a keretrendszerben</w:t>
       </w:r>
       <w:bookmarkEnd w:id="34"/>
     </w:p>
@@ -7825,11 +8005,17 @@
       </w:pPr>
       <w:bookmarkStart w:id="35" w:name="p-rc_ca93f47d715ca1a0-227_Copy_1"/>
       <w:bookmarkStart w:id="36" w:name="__RefHeading___Toc80443498_Copy_1"/>
-      <w:bookmarkStart w:id="37" w:name="_Toc230145029"/>
+      <w:bookmarkStart w:id="37" w:name="_Toc230163373"/>
       <w:bookmarkEnd w:id="35"/>
       <w:bookmarkEnd w:id="36"/>
       <w:r>
-        <w:t>2.5. Mélytanulás alapú klaszterezés (Deep Clustering)</w:t>
+        <w:t>2.</w:t>
+      </w:r>
+      <w:r>
+        <w:t>5</w:t>
+      </w:r>
+      <w:r>
+        <w:t>. Mélytanulás alapú klaszterezés (Deep Clustering)</w:t>
       </w:r>
       <w:bookmarkEnd w:id="37"/>
     </w:p>
@@ -7845,10 +8031,16 @@
       <w:pPr>
         <w:pStyle w:val="Heading3"/>
       </w:pPr>
-      <w:bookmarkStart w:id="38" w:name="_Toc230145030"/>
+      <w:bookmarkStart w:id="38" w:name="_Toc230163374"/>
       <w:r>
         <w:lastRenderedPageBreak/>
-        <w:t>2.4.1. Adatelőkészítés és az Autoencoder felépítése</w:t>
+        <w:t>2.</w:t>
+      </w:r>
+      <w:r>
+        <w:t>5</w:t>
+      </w:r>
+      <w:r>
+        <w:t>.1. Adatelőkészítés és az Autoencoder felépítése</w:t>
       </w:r>
       <w:bookmarkEnd w:id="38"/>
     </w:p>
@@ -7908,9 +8100,15 @@
       <w:pPr>
         <w:pStyle w:val="Heading3"/>
       </w:pPr>
-      <w:bookmarkStart w:id="39" w:name="_Toc230145031"/>
-      <w:r>
-        <w:t>2.4.2. A DEC és IDEC modellek implementációja és architektúrája</w:t>
+      <w:bookmarkStart w:id="39" w:name="_Toc230163375"/>
+      <w:r>
+        <w:t>2.</w:t>
+      </w:r>
+      <w:r>
+        <w:t>5</w:t>
+      </w:r>
+      <w:r>
+        <w:t>.2. A DEC és IDEC modellek implementációja és architektúrája</w:t>
       </w:r>
       <w:bookmarkEnd w:id="39"/>
       <w:r>
@@ -8002,9 +8200,15 @@
       <w:pPr>
         <w:pStyle w:val="Heading3"/>
       </w:pPr>
-      <w:bookmarkStart w:id="40" w:name="_Toc230145032"/>
-      <w:r>
-        <w:t>2.4.3. A hálózatok hiperparaméterei és a tanítási folyamat</w:t>
+      <w:bookmarkStart w:id="40" w:name="_Toc230163376"/>
+      <w:r>
+        <w:t>2.</w:t>
+      </w:r>
+      <w:r>
+        <w:t>5</w:t>
+      </w:r>
+      <w:r>
+        <w:t>.3. A hálózatok hiperparaméterei és a tanítási folyamat</w:t>
       </w:r>
       <w:bookmarkEnd w:id="40"/>
     </w:p>
@@ -8197,12 +8401,12 @@
       <w:pPr>
         <w:pStyle w:val="Heading1"/>
       </w:pPr>
-      <w:bookmarkStart w:id="45" w:name="_Toc230145033"/>
-      <w:r>
-        <w:rPr>
-          <w:lang w:val="hu-HU"/>
-        </w:rPr>
-        <w:t xml:space="preserve">3.  </w:t>
+      <w:bookmarkStart w:id="45" w:name="_Toc230163377"/>
+      <w:r>
+        <w:rPr>
+          <w:lang w:val="hu-HU"/>
+        </w:rPr>
+        <w:t xml:space="preserve">3. </w:t>
       </w:r>
       <w:hyperlink w:anchor="__RefHeading___Toc80443505">
         <w:r>
@@ -8398,12 +8602,12 @@
           <w:lang w:val="hu-HU"/>
         </w:rPr>
       </w:pPr>
-      <w:bookmarkStart w:id="46" w:name="_Toc230145034"/>
-      <w:r>
-        <w:rPr>
-          <w:lang w:val="hu-HU"/>
-        </w:rPr>
-        <w:t xml:space="preserve">3.1.  </w:t>
+      <w:bookmarkStart w:id="46" w:name="_Toc230163378"/>
+      <w:r>
+        <w:rPr>
+          <w:lang w:val="hu-HU"/>
+        </w:rPr>
+        <w:t xml:space="preserve">3.1. </w:t>
       </w:r>
       <w:hyperlink w:anchor="__RefHeading___Toc80443502">
         <w:r>
@@ -8434,7 +8638,7 @@
           <w:szCs w:val="24"/>
         </w:rPr>
       </w:pPr>
-      <w:bookmarkStart w:id="47" w:name="_Toc230145035"/>
+      <w:bookmarkStart w:id="47" w:name="_Toc230163379"/>
       <w:r>
         <w:rPr>
           <w:sz w:val="24"/>
@@ -10839,7 +11043,7 @@
       <w:pPr>
         <w:pStyle w:val="Heading3"/>
       </w:pPr>
-      <w:bookmarkStart w:id="48" w:name="_Toc230145036"/>
+      <w:bookmarkStart w:id="48" w:name="_Toc230163380"/>
       <w:r>
         <w:lastRenderedPageBreak/>
         <w:t>3.1.2. A távolságalapú klaszterezés korlátai (K-Means alapvonal)</w:t>
@@ -12230,13 +12434,13 @@
           <w:noProof/>
         </w:rPr>
         <w:drawing>
-          <wp:anchor distT="0" distB="0" distL="114300" distR="114300" simplePos="0" relativeHeight="251659264" behindDoc="0" locked="0" layoutInCell="1" allowOverlap="1" wp14:anchorId="5C73DB09" wp14:editId="33188DEC">
+          <wp:anchor distT="0" distB="0" distL="114300" distR="114300" simplePos="0" relativeHeight="251659264" behindDoc="0" locked="0" layoutInCell="1" allowOverlap="1" wp14:anchorId="5C73DB09" wp14:editId="429A8D50">
             <wp:simplePos x="0" y="0"/>
-            <wp:positionH relativeFrom="column">
+            <wp:positionH relativeFrom="margin">
               <wp:align>center</wp:align>
             </wp:positionH>
             <wp:positionV relativeFrom="page">
-              <wp:posOffset>5022850</wp:posOffset>
+              <wp:posOffset>4763770</wp:posOffset>
             </wp:positionV>
             <wp:extent cx="3153600" cy="2520000"/>
             <wp:effectExtent l="0" t="0" r="8890" b="0"/>
@@ -12316,7 +12520,7 @@
       <w:pPr>
         <w:pStyle w:val="Heading3"/>
       </w:pPr>
-      <w:bookmarkStart w:id="49" w:name="_Toc230145037"/>
+      <w:bookmarkStart w:id="49" w:name="_Toc230163381"/>
       <w:r>
         <w:lastRenderedPageBreak/>
         <w:t>3.1.3. Fejlett klaszterezési eljárások optimalizálása</w:t>
@@ -13968,12 +14172,12 @@
           <w:lang w:val="hu-HU"/>
         </w:rPr>
       </w:pPr>
-      <w:bookmarkStart w:id="50" w:name="_Toc230145038"/>
-      <w:r>
-        <w:rPr>
-          <w:lang w:val="hu-HU"/>
-        </w:rPr>
-        <w:t xml:space="preserve">3.2.  </w:t>
+      <w:bookmarkStart w:id="50" w:name="_Toc230163382"/>
+      <w:r>
+        <w:rPr>
+          <w:lang w:val="hu-HU"/>
+        </w:rPr>
+        <w:t xml:space="preserve">3.2. </w:t>
       </w:r>
       <w:hyperlink w:anchor="__RefHeading___Toc80443503">
         <w:r>
@@ -14028,7 +14232,6 @@
     <w:p>
       <w:pPr>
         <w:pStyle w:val="BodyText"/>
-        <w:jc w:val="left"/>
         <w:rPr>
           <w:lang w:val="hu-HU"/>
         </w:rPr>
@@ -14043,7 +14246,6 @@
     <w:p>
       <w:pPr>
         <w:pStyle w:val="BodyText"/>
-        <w:jc w:val="left"/>
         <w:rPr>
           <w:b/>
           <w:lang w:val="hu-HU"/>
@@ -14060,7 +14262,6 @@
     <w:p>
       <w:pPr>
         <w:pStyle w:val="BodyText"/>
-        <w:jc w:val="left"/>
         <w:rPr>
           <w:lang w:val="hu-HU"/>
         </w:rPr>
@@ -14109,6 +14310,7 @@
               <w:pStyle w:val="TableHeading"/>
               <w:keepNext/>
               <w:spacing w:line="276" w:lineRule="auto"/>
+              <w:jc w:val="both"/>
               <w:rPr>
                 <w:b w:val="0"/>
                 <w:bCs w:val="0"/>
@@ -14144,7 +14346,7 @@
               <w:pStyle w:val="TableHeading"/>
               <w:keepNext/>
               <w:spacing w:line="276" w:lineRule="auto"/>
-              <w:jc w:val="left"/>
+              <w:jc w:val="both"/>
               <w:rPr>
                 <w:b w:val="0"/>
                 <w:bCs w:val="0"/>
@@ -14174,7 +14376,7 @@
               <w:pStyle w:val="TableHeading"/>
               <w:keepNext/>
               <w:spacing w:line="276" w:lineRule="auto"/>
-              <w:jc w:val="left"/>
+              <w:jc w:val="both"/>
               <w:rPr>
                 <w:b w:val="0"/>
                 <w:bCs w:val="0"/>
@@ -14204,7 +14406,7 @@
               <w:pStyle w:val="TableHeading"/>
               <w:keepNext/>
               <w:spacing w:line="276" w:lineRule="auto"/>
-              <w:jc w:val="left"/>
+              <w:jc w:val="both"/>
               <w:rPr>
                 <w:b w:val="0"/>
                 <w:bCs w:val="0"/>
@@ -14234,7 +14436,7 @@
               <w:pStyle w:val="TableHeading"/>
               <w:keepNext/>
               <w:spacing w:line="276" w:lineRule="auto"/>
-              <w:jc w:val="left"/>
+              <w:jc w:val="both"/>
               <w:rPr>
                 <w:b w:val="0"/>
                 <w:bCs w:val="0"/>
@@ -14269,7 +14471,7 @@
               <w:pStyle w:val="TableHeading"/>
               <w:keepNext/>
               <w:spacing w:line="276" w:lineRule="auto"/>
-              <w:jc w:val="left"/>
+              <w:jc w:val="both"/>
               <w:rPr>
                 <w:b w:val="0"/>
                 <w:bCs w:val="0"/>
@@ -14298,7 +14500,7 @@
               <w:pStyle w:val="TableHeading"/>
               <w:keepNext/>
               <w:spacing w:line="276" w:lineRule="auto"/>
-              <w:jc w:val="left"/>
+              <w:jc w:val="both"/>
               <w:rPr>
                 <w:b w:val="0"/>
                 <w:bCs w:val="0"/>
@@ -14327,7 +14529,7 @@
               <w:pStyle w:val="TableHeading"/>
               <w:keepNext/>
               <w:spacing w:line="276" w:lineRule="auto"/>
-              <w:jc w:val="left"/>
+              <w:jc w:val="both"/>
               <w:rPr>
                 <w:b w:val="0"/>
                 <w:bCs w:val="0"/>
@@ -14356,7 +14558,7 @@
               <w:pStyle w:val="TableHeading"/>
               <w:keepNext/>
               <w:spacing w:line="276" w:lineRule="auto"/>
-              <w:jc w:val="left"/>
+              <w:jc w:val="both"/>
               <w:rPr>
                 <w:b w:val="0"/>
                 <w:bCs w:val="0"/>
@@ -14388,7 +14590,7 @@
               <w:pStyle w:val="TableHeading"/>
               <w:keepNext/>
               <w:spacing w:line="276" w:lineRule="auto"/>
-              <w:jc w:val="left"/>
+              <w:jc w:val="both"/>
               <w:rPr>
                 <w:b w:val="0"/>
                 <w:bCs w:val="0"/>
@@ -14414,7 +14616,7 @@
               <w:pStyle w:val="TableHeading"/>
               <w:keepNext/>
               <w:spacing w:line="276" w:lineRule="auto"/>
-              <w:jc w:val="left"/>
+              <w:jc w:val="both"/>
               <w:rPr>
                 <w:b w:val="0"/>
                 <w:bCs w:val="0"/>
@@ -14440,7 +14642,7 @@
               <w:pStyle w:val="TableHeading"/>
               <w:keepNext/>
               <w:spacing w:line="276" w:lineRule="auto"/>
-              <w:jc w:val="left"/>
+              <w:jc w:val="both"/>
               <w:rPr>
                 <w:b w:val="0"/>
                 <w:bCs w:val="0"/>
@@ -14466,7 +14668,7 @@
               <w:pStyle w:val="TableHeading"/>
               <w:keepNext/>
               <w:spacing w:line="276" w:lineRule="auto"/>
-              <w:jc w:val="left"/>
+              <w:jc w:val="both"/>
               <w:rPr>
                 <w:b w:val="0"/>
                 <w:bCs w:val="0"/>
@@ -14501,7 +14703,7 @@
               <w:pStyle w:val="TableHeading"/>
               <w:keepNext/>
               <w:spacing w:line="276" w:lineRule="auto"/>
-              <w:jc w:val="left"/>
+              <w:jc w:val="both"/>
               <w:rPr>
                 <w:b w:val="0"/>
                 <w:bCs w:val="0"/>
@@ -14530,7 +14732,7 @@
               <w:pStyle w:val="TableHeading"/>
               <w:keepNext/>
               <w:spacing w:line="276" w:lineRule="auto"/>
-              <w:jc w:val="left"/>
+              <w:jc w:val="both"/>
               <w:rPr>
                 <w:b w:val="0"/>
                 <w:bCs w:val="0"/>
@@ -14559,7 +14761,7 @@
               <w:pStyle w:val="TableHeading"/>
               <w:keepNext/>
               <w:spacing w:line="276" w:lineRule="auto"/>
-              <w:jc w:val="left"/>
+              <w:jc w:val="both"/>
               <w:rPr>
                 <w:b w:val="0"/>
                 <w:bCs w:val="0"/>
@@ -14588,7 +14790,7 @@
               <w:pStyle w:val="TableHeading"/>
               <w:keepNext/>
               <w:spacing w:line="276" w:lineRule="auto"/>
-              <w:jc w:val="left"/>
+              <w:jc w:val="both"/>
               <w:rPr>
                 <w:b w:val="0"/>
                 <w:bCs w:val="0"/>
@@ -14610,7 +14812,6 @@
     <w:p>
       <w:pPr>
         <w:pStyle w:val="BodyText"/>
-        <w:jc w:val="left"/>
         <w:rPr>
           <w:lang w:val="hu-HU"/>
         </w:rPr>
@@ -14633,7 +14834,6 @@
           <w:tab w:val="clear" w:pos="709"/>
           <w:tab w:val="left" w:pos="0"/>
         </w:tabs>
-        <w:jc w:val="left"/>
         <w:rPr>
           <w:lang w:val="hu-HU"/>
         </w:rPr>
@@ -14663,7 +14863,6 @@
           <w:tab w:val="clear" w:pos="709"/>
           <w:tab w:val="left" w:pos="0"/>
         </w:tabs>
-        <w:jc w:val="left"/>
         <w:rPr>
           <w:lang w:val="hu-HU"/>
         </w:rPr>
@@ -14685,7 +14884,6 @@
     <w:p>
       <w:pPr>
         <w:pStyle w:val="BodyText"/>
-        <w:jc w:val="left"/>
         <w:rPr>
           <w:b/>
           <w:lang w:val="hu-HU"/>
@@ -14702,7 +14900,6 @@
     <w:p>
       <w:pPr>
         <w:pStyle w:val="BodyText"/>
-        <w:jc w:val="left"/>
         <w:rPr>
           <w:lang w:val="hu-HU"/>
         </w:rPr>
@@ -14730,30 +14927,35 @@
     <w:p>
       <w:pPr>
         <w:pStyle w:val="BodyText"/>
-        <w:jc w:val="left"/>
-        <w:rPr>
-          <w:lang w:val="hu-HU"/>
-        </w:rPr>
-      </w:pPr>
-      <w:r>
-        <w:rPr>
-          <w:lang w:val="hu-HU"/>
-        </w:rPr>
-        <w:t xml:space="preserve">Bár az ARI és a tisztasági mutatók növekedése a mélytanulásos modellek esetén is visszafogott maradt (maximum 38,1%), a kísérlet rávilágított arra a tényre, hogy a MOMENT beágyazások eleve egy olyan nagy pontosságú, sűrített reprezentációt adnak, amelyen a klaszterezési hibák további csökkentése már csak minimális mértékben lehetséges. A mélytanulásos architektúra alkalmazása tehát igazolta, hogy az orvosi adatokban lévő </w:t>
+        <w:rPr>
+          <w:lang w:val="hu-HU"/>
+        </w:rPr>
+      </w:pPr>
+      <w:r>
+        <w:rPr>
+          <w:lang w:val="hu-HU"/>
+        </w:rPr>
+        <w:t xml:space="preserve">Bár az ARI és a tisztasági mutatók növekedése a mélytanulásos modellek esetén is visszafogott maradt (maximum 38,1%), a kísérlet rávilágított arra a tényre, hogy a MOMENT beágyazások eleve egy olyan nagy pontosságú, sűrített reprezentációt adnak, amelyen a klaszterezési hibák további csökkentése már csak minimális mértékben lehetséges. A mélytanulásos architektúra alkalmazása tehát igazolta, hogy az orvosi adatokban lévő összefonódott mintázatok nem egy </w:t>
+      </w:r>
+      <w:r>
+        <w:rPr>
+          <w:lang w:val="hu-HU"/>
+        </w:rPr>
+        <w:lastRenderedPageBreak/>
+        <w:t xml:space="preserve">technikai hiba, hanem a klinikai valóság része: a betegségek közötti határvonalak a fiziológiai </w:t>
       </w:r>
       <w:r>
         <w:rPr>
           <w:noProof/>
         </w:rPr>
-        <w:lastRenderedPageBreak/>
         <w:drawing>
-          <wp:anchor distT="0" distB="0" distL="114300" distR="114300" simplePos="0" relativeHeight="251662336" behindDoc="0" locked="0" layoutInCell="1" allowOverlap="1" wp14:anchorId="38E6CAE7" wp14:editId="23160987">
+          <wp:anchor distT="0" distB="0" distL="114300" distR="114300" simplePos="0" relativeHeight="251662336" behindDoc="0" locked="0" layoutInCell="1" allowOverlap="1" wp14:anchorId="38E6CAE7" wp14:editId="5B358F19">
             <wp:simplePos x="0" y="0"/>
             <wp:positionH relativeFrom="margin">
               <wp:align>center</wp:align>
             </wp:positionH>
             <wp:positionV relativeFrom="paragraph">
-              <wp:posOffset>0</wp:posOffset>
+              <wp:posOffset>449580</wp:posOffset>
             </wp:positionV>
             <wp:extent cx="3253371" cy="2520000"/>
             <wp:effectExtent l="0" t="0" r="4445" b="0"/>
@@ -14813,7 +15015,7 @@
         <w:rPr>
           <w:lang w:val="hu-HU"/>
         </w:rPr>
-        <w:t>összefonódott mintázatok nem egy technikai hiba, hanem a klinikai valóság része: a betegségek közötti határvonalak a fiziológiai jelekben sem húzhatóak meg élesen, hanem folytonos átmenetet képeznek.</w:t>
+        <w:t>jelekben sem húzhatóak meg élesen, hanem folytonos átmenetet képeznek.</w:t>
       </w:r>
     </w:p>
     <w:p>
@@ -14827,12 +15029,12 @@
       <w:pPr>
         <w:pStyle w:val="Heading2"/>
       </w:pPr>
-      <w:bookmarkStart w:id="51" w:name="_Toc230145039"/>
-      <w:r>
-        <w:rPr>
-          <w:lang w:val="hu-HU"/>
-        </w:rPr>
-        <w:t xml:space="preserve">3.3.  </w:t>
+      <w:bookmarkStart w:id="51" w:name="_Toc230163383"/>
+      <w:r>
+        <w:rPr>
+          <w:lang w:val="hu-HU"/>
+        </w:rPr>
+        <w:t xml:space="preserve">3.3. </w:t>
       </w:r>
       <w:r>
         <w:t>A legeredményesebb modellek összehasonlítása</w:t>
@@ -14895,7 +15097,6 @@
     <w:p>
       <w:pPr>
         <w:pStyle w:val="BodyText"/>
-        <w:jc w:val="left"/>
         <w:rPr>
           <w:b/>
           <w:lang w:val="hu-HU"/>
@@ -14912,7 +15113,6 @@
     <w:p>
       <w:pPr>
         <w:pStyle w:val="BodyText"/>
-        <w:jc w:val="left"/>
         <w:rPr>
           <w:lang w:val="hu-HU"/>
         </w:rPr>
@@ -14935,7 +15135,6 @@
           <w:tab w:val="clear" w:pos="709"/>
           <w:tab w:val="left" w:pos="0"/>
         </w:tabs>
-        <w:jc w:val="left"/>
         <w:rPr>
           <w:lang w:val="hu-HU"/>
         </w:rPr>
@@ -14978,7 +15177,6 @@
           <w:tab w:val="clear" w:pos="709"/>
           <w:tab w:val="left" w:pos="0"/>
         </w:tabs>
-        <w:jc w:val="left"/>
         <w:rPr>
           <w:lang w:val="hu-HU"/>
         </w:rPr>
@@ -15026,35 +15224,28 @@
     <w:p>
       <w:pPr>
         <w:pStyle w:val="BodyText"/>
-        <w:jc w:val="left"/>
-        <w:rPr>
-          <w:lang w:val="hu-HU"/>
-        </w:rPr>
-      </w:pPr>
-      <w:r>
-        <w:rPr>
-          <w:lang w:val="hu-HU"/>
-        </w:rPr>
-        <w:t xml:space="preserve">Az a tény, hogy ez a két, egymástól gyökeresen eltérő optimalizálási stratégia pontosan ugyanabba a 38%-os teljesítménybeli üvegplafonba ütközött, a szakdolgozatom egyik legfontosabb felismerése. Ez empirikus bizonyítékot szolgáltat arra, hogy a klaszterezés további javításának gátja már nem az alkalmazott gépi tanulási vagy mélytanulási algoritmusok képességeiben található. A korlátot maguk a biológiai adatok jelentik: az EKG felvételeken alapuló orvosi diagnózisok a valóságban sem képeznek diszkrét, élesen elhatárolható halmazokat. A MOMENT beágyazások hűen tükrözik ezt a klinikai </w:t>
-      </w:r>
+        <w:rPr>
+          <w:lang w:val="hu-HU"/>
+        </w:rPr>
+      </w:pPr>
+      <w:r>
+        <w:rPr>
+          <w:lang w:val="hu-HU"/>
+        </w:rPr>
+        <w:t>Az a tény, hogy ez a két, egymástól gyökeresen eltérő optimalizálási stratégia pontosan ugyanabba a 38%-os teljesítménybeli üvegplafonba ütközött, a szakdolgozatom egyik legfontosabb felismerése. Ez empirikus bizonyítékot szolgáltat arra, hogy a klaszterezés további javításának gátja már nem az alkalmazott gépi tanulási vagy mélytanulási algoritmusok képességeiben található. A korlátot maguk a biológiai adatok jelentik: az EKG felvételeken alapuló orvosi diagnózisok a valóságban sem képeznek diszkrét, élesen elhatárolható halmazokat. A MOMENT beágyazások hűen tükrözik ezt a klinikai folytonosságot, amelyet a modellek – bármilyen fejlett matematikát is alkalmazzanak – nem tudnak szétszakítani.</w:t>
+      </w:r>
+    </w:p>
+    <w:p>
+      <w:pPr>
+        <w:pStyle w:val="Heading1"/>
+      </w:pPr>
+      <w:bookmarkStart w:id="52" w:name="_Toc230163384"/>
       <w:r>
         <w:rPr>
           <w:lang w:val="hu-HU"/>
         </w:rPr>
         <w:lastRenderedPageBreak/>
-        <w:t>folytonosságot, amelyet a modellek – bármilyen fejlett matematikát is alkalmazzanak – nem tudnak szétszakítani.</w:t>
-      </w:r>
-    </w:p>
-    <w:p>
-      <w:pPr>
-        <w:pStyle w:val="Heading1"/>
-      </w:pPr>
-      <w:bookmarkStart w:id="52" w:name="_Toc230145040"/>
-      <w:r>
-        <w:rPr>
-          <w:lang w:val="hu-HU"/>
-        </w:rPr>
-        <w:t xml:space="preserve">4.  </w:t>
+        <w:t xml:space="preserve">4. </w:t>
       </w:r>
       <w:hyperlink w:anchor="__RefHeading___Toc80443505">
         <w:r>
@@ -15081,7 +15272,7 @@
           <w:lang w:val="hu-HU"/>
         </w:rPr>
       </w:pPr>
-      <w:bookmarkStart w:id="53" w:name="_Toc230145041"/>
+      <w:bookmarkStart w:id="53" w:name="_Toc230163385"/>
       <w:r>
         <w:rPr>
           <w:lang w:val="hu-HU"/>
@@ -15110,7 +15301,6 @@
     <w:p>
       <w:pPr>
         <w:pStyle w:val="BodyText"/>
-        <w:jc w:val="left"/>
         <w:rPr>
           <w:lang w:val="hu-HU"/>
         </w:rPr>
@@ -15129,7 +15319,7 @@
           <w:lang w:val="hu-HU"/>
         </w:rPr>
       </w:pPr>
-      <w:bookmarkStart w:id="54" w:name="_Toc230145042"/>
+      <w:bookmarkStart w:id="54" w:name="_Toc230163386"/>
       <w:r>
         <w:rPr>
           <w:lang w:val="hu-HU"/>
@@ -15161,7 +15351,6 @@
     <w:p>
       <w:pPr>
         <w:pStyle w:val="BodyText"/>
-        <w:jc w:val="left"/>
         <w:rPr>
           <w:lang w:val="hu-HU"/>
         </w:rPr>
@@ -15176,23 +15365,22 @@
     <w:p>
       <w:pPr>
         <w:pStyle w:val="BodyText"/>
-        <w:jc w:val="left"/>
-        <w:rPr>
-          <w:lang w:val="hu-HU"/>
-        </w:rPr>
-      </w:pPr>
-      <w:r>
-        <w:rPr>
-          <w:lang w:val="hu-HU"/>
-        </w:rPr>
-        <w:t xml:space="preserve">Ez az eredmény vezetetett a dolgozatom legfontosabb következtetéséhez. Ez a korlát nem az általam használt algoritmusok hiányosságaiból fakad, hanem magából a klinikai valóságból és a biológiai adatok természetéből. Az emberi szív elektromos működése és a különböző szívbetegségek nem diszkrét, éles határokkal elválasztható dobozokként léteznek. A normál EKG-k, a különböző vezetési zavarok és a strukturális elváltozások között folyamatosak az </w:t>
+        <w:rPr>
+          <w:lang w:val="hu-HU"/>
+        </w:rPr>
+      </w:pPr>
+      <w:r>
+        <w:rPr>
+          <w:lang w:val="hu-HU"/>
+        </w:rPr>
+        <w:t xml:space="preserve">Ez az eredmény vezetetett a dolgozatom legfontosabb következtetéséhez. Ez a korlát nem az általam használt algoritmusok hiányosságaiból fakad, hanem magából a klinikai valóságból és a biológiai adatok természetéből. Az emberi szív elektromos működése és a különböző szívbetegségek nem diszkrét, éles határokkal elválasztható dobozokként léteznek. A normál EKG-k, a különböző vezetési zavarok és a strukturális elváltozások között folyamatosak az átmenetek, hatalmasak az átfedési zónák. Az alapmodell beágyazási tere hűen tükrözi ezt a biológiai folytonosságot, a felügyelet nélküli modellek pedig matematikailag igazolták, hogy </w:t>
       </w:r>
       <w:r>
         <w:rPr>
           <w:lang w:val="hu-HU"/>
         </w:rPr>
         <w:lastRenderedPageBreak/>
-        <w:t>átmenetek, hatalmasak az átfedési zónák. Az alapmodell beágyazási tere hűen tükrözi ezt a biológiai folytonosságot, a felügyelet nélküli modellek pedig matematikailag igazolták, hogy ezeket az összefonódott mintázatokat nem lehet és nem is szabad merev, mesterséges határokkal szétszakítani.</w:t>
+        <w:t>ezeket az összefonódott mintázatokat nem lehet és nem is szabad merev, mesterséges határokkal szétszakítani.</w:t>
       </w:r>
     </w:p>
     <w:p>
@@ -15202,7 +15390,7 @@
           <w:lang w:val="hu-HU"/>
         </w:rPr>
       </w:pPr>
-      <w:bookmarkStart w:id="55" w:name="_Toc230145043"/>
+      <w:bookmarkStart w:id="55" w:name="_Toc230163387"/>
       <w:r>
         <w:rPr>
           <w:lang w:val="hu-HU"/>
@@ -15239,7 +15427,6 @@
           <w:tab w:val="clear" w:pos="709"/>
           <w:tab w:val="left" w:pos="0"/>
         </w:tabs>
-        <w:jc w:val="left"/>
       </w:pPr>
       <w:r>
         <w:rPr>
@@ -15262,7 +15449,6 @@
           <w:tab w:val="clear" w:pos="709"/>
           <w:tab w:val="left" w:pos="0"/>
         </w:tabs>
-        <w:jc w:val="left"/>
       </w:pPr>
       <w:r>
         <w:rPr>
@@ -15285,7 +15471,6 @@
           <w:tab w:val="clear" w:pos="709"/>
           <w:tab w:val="left" w:pos="0"/>
         </w:tabs>
-        <w:jc w:val="left"/>
       </w:pPr>
       <w:r>
         <w:rPr>
@@ -15308,7 +15493,6 @@
           <w:tab w:val="clear" w:pos="709"/>
           <w:tab w:val="left" w:pos="0"/>
         </w:tabs>
-        <w:jc w:val="left"/>
       </w:pPr>
       <w:r>
         <w:rPr>
@@ -15323,7 +15507,6 @@
     <w:p>
       <w:pPr>
         <w:pStyle w:val="BodyText"/>
-        <w:jc w:val="left"/>
       </w:pPr>
       <w:r>
         <w:t>Összességében a szakdolgozatommal sikerült bizonyítanom, hogy az idősoros alapmodellek és a mélytanulásos klaszterezés kombinációja egy rendkívül erős eszköz a modern orvosi informatikában, amely képes feltárni és számszerűsíteni a klinikai diagnózisok mögött meghúzódó komplex, folytonos fiziológiai valóságot.</w:t>
@@ -15347,7 +15530,7 @@
           <w:lang w:val="hu-HU"/>
         </w:rPr>
       </w:pPr>
-      <w:bookmarkStart w:id="56" w:name="_Toc230145044"/>
+      <w:bookmarkStart w:id="56" w:name="_Toc230163388"/>
       <w:r>
         <w:rPr>
           <w:lang w:val="hu-HU"/>
@@ -15359,84 +15542,335 @@
     </w:p>
     <w:p>
       <w:r>
-        <w:t>[1] P. Wagner, N. Strodthoff, R.-D. Bousseljot, D. Kreiseler, F. I. Lunze, W. Samek, és T. Schaeffter, "PTB-XL, a large publicly available electrocardiography dataset," Scientific Data, vol. 7, no. 1, p. 154, May 2020.</w:t>
-      </w:r>
-    </w:p>
-    <w:p/>
-    <w:p>
-      <w:r>
-        <w:t>[2] M. Goswami, K. Szafer, A. Choudhry, Y. Cai, S. Li, és A. Dubrawski, "MOMENT: A Family of Open Time-series Foundation Models," in Proceedings of the 41st International Conference on Machine Learning (ICML), pp. 16115–16152, 2024.</w:t>
-      </w:r>
-    </w:p>
-    <w:p/>
-    <w:p>
-      <w:r>
-        <w:t>[3] A. Vaswani, N. Shazeer, N. Parmar, J. Uszkoreit, L. Jones, A. N. Gomez, Ł. Kaiser, és I. Polosukhin, "Attention is all you need," in Advances in Neural Information Processing Systems, vol. 30, pp. 5998–6008, 2017.</w:t>
-      </w:r>
-    </w:p>
-    <w:p/>
-    <w:p>
-      <w:r>
-        <w:t>[4] McInnes, L., Healy, J., &amp; Melville, J. (2018). UMAP: Uniform Manifold Approximation and Projection for Dimension Reduction. arXiv preprint arXiv:1802.03426.</w:t>
-      </w:r>
-    </w:p>
-    <w:p/>
-    <w:p>
-      <w:r>
-        <w:t>[5] MacQueen, J. (1967). Some methods for classification and analysis of multivariate observations. Proceedings of the fifth Berkeley symposium on mathematical statistics and probability (Vol. 1, No. 14, pp. 281-297).</w:t>
-      </w:r>
-    </w:p>
-    <w:p/>
-    <w:p>
-      <w:r>
-        <w:t>[6] Ester, M., Kriegel, H. P., Sander, J., &amp; Xu, X. (1996). A density-based algorithm for discovering clusters in large spatial databases with noise. KDD (Vol. 96, No. 34, pp. 226-231).</w:t>
-      </w:r>
-    </w:p>
-    <w:p/>
-    <w:p>
-      <w:r>
-        <w:t>[7] Campello, R. J., Moulavi, D., &amp; Sander, J. (2013). Density-based clustering based on hierarchical density estimates. Pacific-Asia conference on knowledge discovery and data mining (pp. 160-172).</w:t>
-      </w:r>
-    </w:p>
-    <w:p/>
-    <w:p>
-      <w:r>
-        <w:t>[8] Akiba, T., Sano, S., Yanase, T., Ohta, T., &amp; Koyama, M. (2019). Optuna: A next-generation hyperparameter optimization framework. Proceedings of the 25th ACM SIGKDD international conference on knowledge discovery &amp; data mining.</w:t>
-      </w:r>
-    </w:p>
-    <w:p/>
-    <w:p>
-      <w:r>
-        <w:t>[9] Xie, J., Girshick, R., &amp; Farhadi, A. (2016). Unsupervised deep embedding for clustering analysis. In International conference on machine learning (pp. 478-487). PMLR.</w:t>
-      </w:r>
-    </w:p>
-    <w:p/>
-    <w:p>
-      <w:r>
-        <w:t>[10] Guo, X., Gao, L., Liu, X., &amp; Yin, J. (2017). Improved deep embedded clustering with local structure preservation. In IJCAI: proceedings of the conference (Vol. 2017, p. 1753).</w:t>
-      </w:r>
-    </w:p>
-    <w:p/>
-    <w:p>
-      <w:pPr>
-        <w:rPr>
-          <w:lang w:val="hu-HU"/>
-        </w:rPr>
-      </w:pPr>
+        <w:t xml:space="preserve">[1] </w:t>
+      </w:r>
+      <w:r>
+        <w:t>P. Wagner</w:t>
+      </w:r>
+      <w:r>
+        <w:t xml:space="preserve"> és mtsai</w:t>
+      </w:r>
+      <w:r>
+        <w:t xml:space="preserve">., "PTB-XL, a large publicly available electrocardiography dataset," </w:t>
+      </w:r>
+      <w:r>
+        <w:rPr>
+          <w:i/>
+          <w:iCs/>
+        </w:rPr>
+        <w:t>Scientific Data</w:t>
+      </w:r>
+      <w:r>
+        <w:t>, 2020. Elérhető:</w:t>
+      </w:r>
+      <w:r>
+        <w:t xml:space="preserve"> </w:t>
+      </w:r>
+      <w:hyperlink r:id="rId12" w:history="1">
+        <w:r>
+          <w:rPr>
+            <w:rStyle w:val="Hyperlink"/>
+          </w:rPr>
+          <w:t>https://www.nature.com/articles/s41597-020-0495-6</w:t>
+        </w:r>
+      </w:hyperlink>
+      <w:r>
+        <w:t xml:space="preserve"> </w:t>
+      </w:r>
+    </w:p>
+    <w:p>
+      <w:r>
+        <w:t>[2]</w:t>
+      </w:r>
+      <w:r>
+        <w:t xml:space="preserve"> M. Goswami és mtsai., "MOMENT: A Family of Open Time-series Foundation Models," </w:t>
+      </w:r>
+      <w:r>
+        <w:rPr>
+          <w:i/>
+          <w:iCs/>
+        </w:rPr>
+        <w:t>Proceedings of the 41st International Conference on Machine Learning</w:t>
+      </w:r>
+      <w:r>
+        <w:t>, 2024. Elérhető:</w:t>
+      </w:r>
+      <w:r>
+        <w:t xml:space="preserve"> </w:t>
+      </w:r>
+      <w:hyperlink r:id="rId13" w:history="1">
+        <w:r>
+          <w:rPr>
+            <w:rStyle w:val="Hyperlink"/>
+          </w:rPr>
+          <w:t>https://proceedings.mlr.press/v235/goswami24a.html</w:t>
+        </w:r>
+      </w:hyperlink>
+      <w:r>
+        <w:t xml:space="preserve"> </w:t>
+      </w:r>
+    </w:p>
+    <w:p>
+      <w:r>
+        <w:t xml:space="preserve">[3] </w:t>
+      </w:r>
+      <w:r>
+        <w:t xml:space="preserve">A. Vaswani és mtsai., "Attention is all you need," </w:t>
+      </w:r>
+      <w:r>
+        <w:rPr>
+          <w:i/>
+          <w:iCs/>
+        </w:rPr>
+        <w:t>Advances in Neural Information Processing Systems</w:t>
+      </w:r>
+      <w:r>
+        <w:t>, 2017. Elérhető:</w:t>
+      </w:r>
+      <w:r>
+        <w:t xml:space="preserve"> </w:t>
+      </w:r>
+      <w:hyperlink r:id="rId14" w:history="1">
+        <w:r>
+          <w:rPr>
+            <w:rStyle w:val="Hyperlink"/>
+          </w:rPr>
+          <w:t>https://arxiv.org/abs/1706.03762</w:t>
+        </w:r>
+      </w:hyperlink>
+      <w:r>
+        <w:t xml:space="preserve"> </w:t>
+      </w:r>
+    </w:p>
+    <w:p>
+      <w:r>
+        <w:t xml:space="preserve">[4] </w:t>
+      </w:r>
+      <w:r>
+        <w:t xml:space="preserve">L. McInnes és mtsai., "UMAP: Uniform Manifold Approximation and Projection for Dimension Reduction," </w:t>
+      </w:r>
+      <w:r>
+        <w:rPr>
+          <w:i/>
+          <w:iCs/>
+        </w:rPr>
+        <w:t>arXiv preprint arXiv:1802.03426</w:t>
+      </w:r>
+      <w:r>
+        <w:t xml:space="preserve">, 2018. Elérhető: </w:t>
+      </w:r>
+      <w:hyperlink r:id="rId15" w:history="1">
+        <w:r>
+          <w:rPr>
+            <w:rStyle w:val="Hyperlink"/>
+          </w:rPr>
+          <w:t>https://arxiv.org/abs/1802.03426</w:t>
+        </w:r>
+      </w:hyperlink>
+      <w:r>
+        <w:t xml:space="preserve"> </w:t>
+      </w:r>
+    </w:p>
+    <w:p>
+      <w:r>
+        <w:t xml:space="preserve">[5] </w:t>
+      </w:r>
+      <w:r>
+        <w:t xml:space="preserve">J. MacQueen, "Some methods for classification and analysis of multivariate observations," </w:t>
+      </w:r>
+      <w:r>
+        <w:rPr>
+          <w:i/>
+          <w:iCs/>
+        </w:rPr>
+        <w:t>Proceedings of the fifth Berkeley symposium on mathematical statistics and probability</w:t>
+      </w:r>
+      <w:r>
+        <w:t>, 1967. Elérhető:</w:t>
+      </w:r>
+      <w:r>
+        <w:t xml:space="preserve"> </w:t>
+      </w:r>
+      <w:hyperlink r:id="rId16" w:history="1">
+        <w:r>
+          <w:rPr>
+            <w:rStyle w:val="Hyperlink"/>
+          </w:rPr>
+          <w:t>https://projecteuclid.org/ebooks/berkeley-symposium-on-mathematical-statistics-and-probability/Proceedings-of-the-Fifth-Berkeley-Symposium-on-Mathematical-Statistics-and/chapter/Some-methods-for-classification-and-analysis-of-multivariate-observations/bsmsp/1200512992</w:t>
+        </w:r>
+      </w:hyperlink>
+      <w:r>
+        <w:t xml:space="preserve"> </w:t>
+      </w:r>
+    </w:p>
+    <w:p>
+      <w:r>
+        <w:t xml:space="preserve">[6] </w:t>
+      </w:r>
+      <w:r>
+        <w:t xml:space="preserve">M. Ester és mtsai., "A density-based algorithm for discovering clusters in large spatial databases with noise," </w:t>
+      </w:r>
+      <w:r>
+        <w:rPr>
+          <w:i/>
+          <w:iCs/>
+        </w:rPr>
+        <w:t>KDD</w:t>
+      </w:r>
+      <w:r>
+        <w:t>, 1996. Elérhető:</w:t>
+      </w:r>
+      <w:r>
+        <w:t xml:space="preserve"> </w:t>
+      </w:r>
+      <w:hyperlink r:id="rId17" w:history="1">
+        <w:r>
+          <w:rPr>
+            <w:rStyle w:val="Hyperlink"/>
+          </w:rPr>
+          <w:t>https://dl.acm.org/doi/10.5555/3001460.3001507</w:t>
+        </w:r>
+      </w:hyperlink>
+      <w:r>
+        <w:t xml:space="preserve"> </w:t>
+      </w:r>
+    </w:p>
+    <w:p>
+      <w:r>
+        <w:t xml:space="preserve">[7] </w:t>
+      </w:r>
+      <w:r>
+        <w:t xml:space="preserve">R. J. Campello és mtsai., "Density-based clustering based on hierarchical density estimates," </w:t>
+      </w:r>
+      <w:r>
+        <w:rPr>
+          <w:i/>
+          <w:iCs/>
+        </w:rPr>
+        <w:t>Pacific-Asia conference on knowledge discovery and data mining</w:t>
+      </w:r>
+      <w:r>
+        <w:t>, 2013. Elérhető:</w:t>
+      </w:r>
+      <w:r>
+        <w:t xml:space="preserve"> </w:t>
+      </w:r>
+      <w:hyperlink r:id="rId18" w:history="1">
+        <w:r>
+          <w:rPr>
+            <w:rStyle w:val="Hyperlink"/>
+          </w:rPr>
+          <w:t>https://link.springer.com/chapter/10.1007/978-3-642-37456-2_14</w:t>
+        </w:r>
+      </w:hyperlink>
+      <w:r>
+        <w:t xml:space="preserve"> </w:t>
+      </w:r>
+    </w:p>
+    <w:p>
+      <w:r>
+        <w:t xml:space="preserve">[8] </w:t>
+      </w:r>
+      <w:r>
+        <w:t xml:space="preserve">T. Akiba és mtsai., "Optuna: A next-generation hyperparameter optimization framework," </w:t>
+      </w:r>
+      <w:r>
+        <w:rPr>
+          <w:i/>
+          <w:iCs/>
+        </w:rPr>
+        <w:t>Proceedings of the 25th ACM SIGKDD international conference on knowledge discovery &amp; data mining</w:t>
+      </w:r>
+      <w:r>
+        <w:t xml:space="preserve">, 2019. Elérhető: </w:t>
+      </w:r>
+      <w:hyperlink r:id="rId19" w:history="1">
+        <w:r>
+          <w:rPr>
+            <w:rStyle w:val="Hyperlink"/>
+          </w:rPr>
+          <w:t>https://dl.acm.org/doi/10.1145/3292500.3330701</w:t>
+        </w:r>
+      </w:hyperlink>
+      <w:r>
+        <w:t xml:space="preserve"> </w:t>
+      </w:r>
+    </w:p>
+    <w:p>
+      <w:r>
+        <w:t xml:space="preserve">[9] </w:t>
+      </w:r>
+      <w:r>
+        <w:t xml:space="preserve">J. Xie és mtsai., "Unsupervised deep embedding for clustering analysis," </w:t>
+      </w:r>
+      <w:r>
+        <w:rPr>
+          <w:i/>
+          <w:iCs/>
+        </w:rPr>
+        <w:t>International conference on machine learning</w:t>
+      </w:r>
+      <w:r>
+        <w:t>, 2016. Elérhető:</w:t>
+      </w:r>
+      <w:r>
+        <w:t xml:space="preserve"> </w:t>
+      </w:r>
+      <w:hyperlink r:id="rId20" w:history="1">
+        <w:r>
+          <w:rPr>
+            <w:rStyle w:val="Hyperlink"/>
+          </w:rPr>
+          <w:t>https://proceedings.mlr.press/v48/xieb16.html</w:t>
+        </w:r>
+      </w:hyperlink>
+      <w:r>
+        <w:t xml:space="preserve"> </w:t>
+      </w:r>
+    </w:p>
+    <w:p>
+      <w:r>
+        <w:t xml:space="preserve">[10] </w:t>
+      </w:r>
+      <w:r>
+        <w:t xml:space="preserve">X. Guo és mtsai., "Improved deep embedded clustering with local structure preservation," </w:t>
+      </w:r>
+      <w:r>
+        <w:rPr>
+          <w:i/>
+          <w:iCs/>
+        </w:rPr>
+        <w:t>IJCAI: proceedings of the conference</w:t>
+      </w:r>
+      <w:r>
+        <w:t>, 2017. Elérhető:</w:t>
+      </w:r>
+      <w:r>
+        <w:t xml:space="preserve"> </w:t>
+      </w:r>
+      <w:hyperlink r:id="rId21" w:history="1">
+        <w:r>
+          <w:rPr>
+            <w:rStyle w:val="Hyperlink"/>
+          </w:rPr>
+          <w:t>https://www.ijcai.org/Proceedings/2017/243</w:t>
+        </w:r>
+      </w:hyperlink>
+      <w:r>
+        <w:t xml:space="preserve"> </w:t>
+      </w:r>
+    </w:p>
+    <w:p>
       <w:r>
         <w:br w:type="page"/>
       </w:r>
     </w:p>
     <w:p>
       <w:pPr>
-        <w:pStyle w:val="Heading2"/>
-        <w:spacing w:before="0"/>
-        <w:jc w:val="center"/>
-        <w:rPr>
-          <w:lang w:val="hu-HU"/>
-        </w:rPr>
-      </w:pPr>
-      <w:bookmarkStart w:id="57" w:name="_Toc230145045"/>
+        <w:rPr>
+          <w:lang w:val="hu-HU"/>
+        </w:rPr>
+      </w:pPr>
       <w:r>
         <w:rPr>
           <w:lang w:val="hu-HU"/>
@@ -15444,7 +15878,6 @@
         <w:lastRenderedPageBreak/>
         <w:t>Nyilatkozat</w:t>
       </w:r>
-      <w:bookmarkEnd w:id="57"/>
     </w:p>
     <w:p>
       <w:pPr>
@@ -15670,7 +16103,7 @@
           <w:lang w:val="hu-HU"/>
         </w:rPr>
       </w:pPr>
-      <w:bookmarkStart w:id="58" w:name="_Toc230145046"/>
+      <w:bookmarkStart w:id="57" w:name="_Toc230163389"/>
       <w:r>
         <w:rPr>
           <w:lang w:val="hu-HU"/>
@@ -15678,7 +16111,7 @@
         <w:lastRenderedPageBreak/>
         <w:t>Köszönetnyilvánítás</w:t>
       </w:r>
-      <w:bookmarkEnd w:id="58"/>
+      <w:bookmarkEnd w:id="57"/>
     </w:p>
     <w:p>
       <w:pPr>
@@ -15771,7 +16204,7 @@
       </w:pPr>
     </w:p>
     <w:sectPr>
-      <w:footerReference w:type="default" r:id="rId12"/>
+      <w:footerReference w:type="default" r:id="rId22"/>
       <w:pgSz w:w="11906" w:h="16838"/>
       <w:pgMar w:top="1417" w:right="1417" w:bottom="1417" w:left="1417" w:header="0" w:footer="708" w:gutter="0"/>
       <w:pgNumType w:start="2"/>
@@ -19111,6 +19544,30 @@
       </w:tcPr>
     </w:tblStylePr>
   </w:style>
+  <w:style w:type="character" w:styleId="UnresolvedMention">
+    <w:name w:val="Unresolved Mention"/>
+    <w:basedOn w:val="DefaultParagraphFont"/>
+    <w:uiPriority w:val="99"/>
+    <w:semiHidden/>
+    <w:unhideWhenUsed/>
+    <w:rsid w:val="00440505"/>
+    <w:rPr>
+      <w:color w:val="605E5C"/>
+      <w:shd w:val="clear" w:color="auto" w:fill="E1DFDD"/>
+    </w:rPr>
+  </w:style>
+  <w:style w:type="character" w:styleId="FollowedHyperlink">
+    <w:name w:val="FollowedHyperlink"/>
+    <w:basedOn w:val="DefaultParagraphFont"/>
+    <w:uiPriority w:val="99"/>
+    <w:semiHidden/>
+    <w:unhideWhenUsed/>
+    <w:rsid w:val="00630462"/>
+    <w:rPr>
+      <w:color w:val="551A8B" w:themeColor="followedHyperlink"/>
+      <w:u w:val="single"/>
+    </w:rPr>
+  </w:style>
 </w:styles>
 </file>
 

</xml_diff>

<commit_message>
Fájlok feltisztítása, és szakdolgozat javítása (még nem teljes)
</commit_message>
<xml_diff>
--- a/Szakdolgozat/szakdolgozat.docx
+++ b/Szakdolgozat/szakdolgozat.docx
@@ -2,7 +2,6 @@
 <file path=word/document.xml><?xml version="1.0" encoding="utf-8"?>
 <w:document xmlns:wpc="http://schemas.microsoft.com/office/word/2010/wordprocessingCanvas" xmlns:cx="http://schemas.microsoft.com/office/drawing/2014/chartex" xmlns:cx1="http://schemas.microsoft.com/office/drawing/2015/9/8/chartex" xmlns:cx2="http://schemas.microsoft.com/office/drawing/2015/10/21/chartex" xmlns:cx3="http://schemas.microsoft.com/office/drawing/2016/5/9/chartex" xmlns:cx4="http://schemas.microsoft.com/office/drawing/2016/5/10/chartex" xmlns:cx5="http://schemas.microsoft.com/office/drawing/2016/5/11/chartex" xmlns:cx6="http://schemas.microsoft.com/office/drawing/2016/5/12/chartex" xmlns:cx7="http://schemas.microsoft.com/office/drawing/2016/5/13/chartex" xmlns:cx8="http://schemas.microsoft.com/office/drawing/2016/5/14/chartex" xmlns:mc="http://schemas.openxmlformats.org/markup-compatibility/2006" xmlns:aink="http://schemas.microsoft.com/office/drawing/2016/ink" xmlns:am3d="http://schemas.microsoft.com/office/drawing/2017/model3d" xmlns:o="urn:schemas-microsoft-com:office:office" xmlns:oel="http://schemas.microsoft.com/office/2019/extlst" xmlns:r="http://schemas.openxmlformats.org/officeDocument/2006/relationships" xmlns:m="http://schemas.openxmlformats.org/officeDocument/2006/math" xmlns:v="urn:schemas-microsoft-com:vml" xmlns:wp14="http://schemas.microsoft.com/office/word/2010/wordprocessingDrawing" xmlns:wp="http://schemas.openxmlformats.org/drawingml/2006/wordprocessingDrawing" xmlns:w10="urn:schemas-microsoft-com:office:word" xmlns:w="http://schemas.openxmlformats.org/wordprocessingml/2006/main" xmlns:w14="http://schemas.microsoft.com/office/word/2010/wordml" xmlns:w15="http://schemas.microsoft.com/office/word/2012/wordml" xmlns:w16cex="http://schemas.microsoft.com/office/word/2018/wordml/cex" xmlns:w16cid="http://schemas.microsoft.com/office/word/2016/wordml/cid" xmlns:w16="http://schemas.microsoft.com/office/word/2018/wordml" xmlns:w16sdtdh="http://schemas.microsoft.com/office/word/2020/wordml/sdtdatahash" xmlns:w16se="http://schemas.microsoft.com/office/word/2015/wordml/symex" xmlns:wpg="http://schemas.microsoft.com/office/word/2010/wordprocessingGroup" xmlns:wpi="http://schemas.microsoft.com/office/word/2010/wordprocessingInk" xmlns:wne="http://schemas.microsoft.com/office/word/2006/wordml" xmlns:wps="http://schemas.microsoft.com/office/word/2010/wordprocessingShape" mc:Ignorable="w14 w15 w16se w16cid w16 w16cex w16sdtdh wp14">
   <w:body>
-    <w:p/>
     <w:p>
       <w:pPr>
         <w:pStyle w:val="Heading2"/>
@@ -22,258 +21,88 @@
     </w:p>
     <w:p>
       <w:pPr>
+        <w:pStyle w:val="pf0"/>
+        <w:jc w:val="both"/>
+      </w:pPr>
+      <w:r>
+        <w:rPr>
+          <w:rStyle w:val="cf01"/>
+          <w:rFonts w:ascii="Times New Roman" w:hAnsi="Times New Roman" w:cs="Times New Roman"/>
+          <w:sz w:val="24"/>
+          <w:szCs w:val="24"/>
+        </w:rPr>
+        <w:t>Az idősor adatok feldolgozása és elemzése egyre nagyobb jelentőséggel bír a modern informatika számos területén, mint például az egészségügyi adatok - például EKG, GSR, pulzus - pénzügyi idősorok, vagy IoT eszközök által rögzített adatok elemzésében. Az idősorok osztályozása különösen nagy kihívást jelent, mivel az adatok jellemzői időben változnak, gyakran párhuzamosan több forrásból származnak, multidimenzionális szerkezetűek, ezek miatt hagyományos módszerekkel gyakran nehezen elemezhetőek. </w:t>
+      </w:r>
+    </w:p>
+    <w:p>
+      <w:pPr>
+        <w:pStyle w:val="pf0"/>
+        <w:jc w:val="both"/>
+        <w:rPr>
+          <w:rStyle w:val="cf01"/>
+          <w:rFonts w:ascii="Times New Roman" w:hAnsi="Times New Roman" w:cs="Times New Roman"/>
+          <w:sz w:val="24"/>
+          <w:szCs w:val="24"/>
+        </w:rPr>
+      </w:pPr>
+      <w:r>
+        <w:rPr>
+          <w:rStyle w:val="cf01"/>
+          <w:rFonts w:ascii="Times New Roman" w:hAnsi="Times New Roman" w:cs="Times New Roman"/>
+          <w:sz w:val="24"/>
+          <w:szCs w:val="24"/>
+        </w:rPr>
+        <w:t xml:space="preserve">A deep learning technológiák, különösen az embedding alapú reprezentációk lehetőséget adnak arra, hogy az idősorokból automatikusan kinyerhető jellemzők segítségével pontosabb osztályozás valósuljon meg. </w:t>
+      </w:r>
+    </w:p>
+    <w:p>
+      <w:pPr>
+        <w:pStyle w:val="pf0"/>
+        <w:jc w:val="both"/>
+      </w:pPr>
+      <w:r>
+        <w:rPr>
+          <w:rStyle w:val="cf11"/>
+          <w:rFonts w:ascii="Times New Roman" w:hAnsi="Times New Roman" w:cs="Times New Roman"/>
+          <w:sz w:val="24"/>
+          <w:szCs w:val="24"/>
+        </w:rPr>
+        <w:t xml:space="preserve">A vázolt kutatási feladat egy tetszőlegesen választott, szakirodalomban elérhető multidimenzionális idősor vizsgálatának megvalósítása, amelyben a hallgató megvizsgálja, hogy az adathalmaz embedding technikákkal (pl. MOMENT eszköz által) történő konvertálása milyen gyakorlati problémálat vet fel, ezeket hogyan lehet kezelni, illetve végső soron milyen klaszterezési eredmény várható el az így megadott adatok feldolgozása által különböző gépi tanulási modellek segítségével. </w:t>
+      </w:r>
+    </w:p>
+    <w:p>
+      <w:pPr>
+        <w:pStyle w:val="pf0"/>
+        <w:jc w:val="both"/>
+      </w:pPr>
+      <w:r>
+        <w:rPr>
+          <w:rStyle w:val="cf11"/>
+          <w:rFonts w:ascii="Times New Roman" w:hAnsi="Times New Roman" w:cs="Times New Roman"/>
+          <w:sz w:val="24"/>
+          <w:szCs w:val="24"/>
+        </w:rPr>
+        <w:t xml:space="preserve">Fontos, hogy a hallgató a tapasztalatait a dolgozatban úgy rögzítse, hogy azok tanulsága, illetve maga a folyamat könnyen adaptálható legyen tetszőleges multisoros adathalmazok klaszterezésére is. </w:t>
+      </w:r>
+    </w:p>
+    <w:p>
+      <w:pPr>
+        <w:rPr>
+          <w:lang w:val="hu-HU"/>
+        </w:rPr>
+      </w:pPr>
+    </w:p>
+    <w:p>
+      <w:pPr>
         <w:pStyle w:val="dfk2"/>
-        <w:spacing w:line="240" w:lineRule="auto"/>
-        <w:rPr>
-          <w:lang w:val="hu-HU"/>
-        </w:rPr>
-      </w:pPr>
-    </w:p>
-    <w:p>
-      <w:pPr>
-        <w:pStyle w:val="dfk2"/>
+        <w:ind w:firstLine="0"/>
+      </w:pPr>
+      <w:r>
         <w:rPr>
           <w:sz w:val="24"/>
           <w:lang w:val="hu-HU"/>
         </w:rPr>
-      </w:pPr>
-      <w:r>
-        <w:rPr>
-          <w:lang w:val="hu-HU"/>
-        </w:rPr>
-        <w:t></w:t>
-      </w:r>
-      <w:r>
-        <w:rPr>
-          <w:b/>
-          <w:bCs/>
-          <w:sz w:val="24"/>
-          <w:lang w:val="hu-HU"/>
-        </w:rPr>
-        <w:t>Szakirodalmi kutatás és az elméleti háttér feltárása:</w:t>
-      </w:r>
-      <w:r>
-        <w:rPr>
-          <w:sz w:val="24"/>
-          <w:lang w:val="hu-HU"/>
-        </w:rPr>
-        <w:t xml:space="preserve"> A multidimenzionális idősorok reprezentációtanulásával kapcsolatos nemzetközi szakirodalom kritikus áttekintése. Kiemelt figyelem fordítása a modern idősoros alapmodellekre (különösen a Transformer-alapú MOMENT modellre), valamint a hagyományos és mélytanulás-alapú felügyelet nélküli klaszterezési eljárások elméleti hátterére.</w:t>
-      </w:r>
-    </w:p>
-    <w:p>
-      <w:pPr>
-        <w:pStyle w:val="dfk2"/>
-        <w:rPr>
-          <w:sz w:val="24"/>
-          <w:lang w:val="hu-HU"/>
-        </w:rPr>
-      </w:pPr>
-      <w:r>
-        <w:rPr>
-          <w:sz w:val="24"/>
-          <w:lang w:val="hu-HU"/>
-        </w:rPr>
-        <w:t></w:t>
-      </w:r>
-      <w:r>
-        <w:rPr>
-          <w:b/>
-          <w:bCs/>
-          <w:sz w:val="24"/>
-          <w:lang w:val="hu-HU"/>
-        </w:rPr>
-        <w:t>Az adathalmaz előkészítése és kezelése:</w:t>
-      </w:r>
-      <w:r>
-        <w:rPr>
-          <w:sz w:val="24"/>
-          <w:lang w:val="hu-HU"/>
-        </w:rPr>
-        <w:t xml:space="preserve"> A PTB-XL klinikai EKG adathalmaz strukturális elemzése, tisztítása és standardizálása. Az orvosi adatokra jellemző súlyos osztály-kiegyensúlyozatlanság elméleti és gyakorlati problémáinak kezelése célzott mintavételezési stratégiák kidolgozásával.</w:t>
-      </w:r>
-    </w:p>
-    <w:p>
-      <w:pPr>
-        <w:pStyle w:val="dfk2"/>
-        <w:rPr>
-          <w:sz w:val="24"/>
-          <w:lang w:val="hu-HU"/>
-        </w:rPr>
-      </w:pPr>
-      <w:r>
-        <w:rPr>
-          <w:sz w:val="24"/>
-          <w:lang w:val="hu-HU"/>
-        </w:rPr>
-        <w:t></w:t>
-      </w:r>
-      <w:r>
-        <w:rPr>
-          <w:b/>
-          <w:bCs/>
-          <w:sz w:val="24"/>
-          <w:lang w:val="hu-HU"/>
-        </w:rPr>
-        <w:t>Jellemzőkinyerés alapmodellel:</w:t>
-      </w:r>
-      <w:r>
-        <w:rPr>
-          <w:sz w:val="24"/>
-          <w:lang w:val="hu-HU"/>
-        </w:rPr>
-        <w:t xml:space="preserve"> A nyers, 12 elvezetéses EKG-idősorok leképezése sűrű, magas dimenziós (1024 dimenziós) jellemzővektorokká a pre-trained MOMENT alapmodell segítségével.</w:t>
-      </w:r>
-    </w:p>
-    <w:p>
-      <w:pPr>
-        <w:pStyle w:val="dfk2"/>
-        <w:rPr>
-          <w:sz w:val="24"/>
-          <w:lang w:val="hu-HU"/>
-        </w:rPr>
-      </w:pPr>
-      <w:r>
-        <w:rPr>
-          <w:sz w:val="24"/>
-          <w:lang w:val="hu-HU"/>
-        </w:rPr>
-        <w:t></w:t>
-      </w:r>
-      <w:r>
-        <w:rPr>
-          <w:b/>
-          <w:bCs/>
-          <w:sz w:val="24"/>
-          <w:lang w:val="hu-HU"/>
-        </w:rPr>
-        <w:t>Dimenziócsökkentés és hagyományos klaszterezés:</w:t>
-      </w:r>
-      <w:r>
-        <w:rPr>
-          <w:sz w:val="24"/>
-          <w:lang w:val="hu-HU"/>
-        </w:rPr>
-        <w:t xml:space="preserve"> A „dimenziók átkának” kezelésére lineáris (PCA) és, nemlineáris (UMAP) dimenziócsökkentési eljárások alkalmazása. Alapvonal</w:t>
-      </w:r>
-      <w:r>
-        <w:rPr>
-          <w:sz w:val="24"/>
-          <w:lang w:val="hu-HU"/>
-        </w:rPr>
-        <w:t xml:space="preserve"> </w:t>
-      </w:r>
-      <w:r>
-        <w:rPr>
-          <w:sz w:val="24"/>
-          <w:lang w:val="hu-HU"/>
-        </w:rPr>
-        <w:t>és fejlett felügyelet nélküli algoritmusok (K-Means, DBSCAN, HDBSCAN, GMM) implementálása, valamint hiperparamétereik automatizált optimalizálása (Optuna keretrendszerrel) a teljes és a kiegyensúlyozott adattereken.</w:t>
-      </w:r>
-    </w:p>
-    <w:p>
-      <w:pPr>
-        <w:pStyle w:val="dfk2"/>
-        <w:rPr>
-          <w:sz w:val="24"/>
-          <w:lang w:val="hu-HU"/>
-        </w:rPr>
-      </w:pPr>
-      <w:r>
-        <w:rPr>
-          <w:sz w:val="24"/>
-          <w:lang w:val="hu-HU"/>
-        </w:rPr>
-        <w:t></w:t>
-      </w:r>
-      <w:r>
-        <w:rPr>
-          <w:b/>
-          <w:bCs/>
-          <w:sz w:val="24"/>
-          <w:lang w:val="hu-HU"/>
-        </w:rPr>
-        <w:t>Mély beágyazott klaszterezés megvalósítása:</w:t>
-      </w:r>
-      <w:r>
-        <w:rPr>
-          <w:sz w:val="24"/>
-          <w:lang w:val="hu-HU"/>
-        </w:rPr>
-        <w:t xml:space="preserve"> Deep Embedded Clustering (DEC) és Improved Deep Embedded Clustering (IDEC) architektúrák tervezése és szoftveres implementációja PyTorch környezetben. Az autoenkóderes előtanítás és a KL-divergencia alapú klaszterezési finomhangolás kétlépcsős folyamatának kidolgozása a látens tér dinamikus átrendezése érdekében.</w:t>
-      </w:r>
-    </w:p>
-    <w:p>
-      <w:pPr>
-        <w:pStyle w:val="dfk2"/>
-        <w:rPr>
-          <w:sz w:val="24"/>
-          <w:lang w:val="hu-HU"/>
-        </w:rPr>
-      </w:pPr>
-      <w:r>
-        <w:rPr>
-          <w:sz w:val="24"/>
-          <w:lang w:val="hu-HU"/>
-        </w:rPr>
-        <w:t></w:t>
-      </w:r>
-      <w:r>
-        <w:rPr>
-          <w:b/>
-          <w:bCs/>
-          <w:sz w:val="24"/>
-          <w:lang w:val="hu-HU"/>
-        </w:rPr>
-        <w:t>Kiértékelés és összehasonlító elemzés:</w:t>
-      </w:r>
-      <w:r>
-        <w:rPr>
-          <w:sz w:val="24"/>
-          <w:lang w:val="hu-HU"/>
-        </w:rPr>
-        <w:t xml:space="preserve"> A vizsgált modellek teljesítményének kvantitatív (ARI, NMI, Purity, Classification Report) és kvalitatív (tévesztési mátrixok, eloszlásábrák) kiértékelése. A statisztikai/valószínűségi megközelítések és a mélytanulásos tér-átrendezés eredményeinek kritikai </w:t>
-      </w:r>
-      <w:r>
-        <w:rPr>
-          <w:sz w:val="24"/>
-          <w:lang w:val="hu-HU"/>
-        </w:rPr>
-        <w:t>elemzése</w:t>
-      </w:r>
-      <w:r>
-        <w:rPr>
-          <w:sz w:val="24"/>
-          <w:lang w:val="hu-HU"/>
-        </w:rPr>
-        <w:t>, különös tekintettel a klinikai kategóriák közötti természetes átfedésekre.</w:t>
-      </w:r>
-    </w:p>
-    <w:p>
-      <w:pPr>
-        <w:pStyle w:val="dfk2"/>
-      </w:pPr>
-      <w:r>
-        <w:rPr>
-          <w:sz w:val="24"/>
-          <w:lang w:val="hu-HU"/>
-        </w:rPr>
-        <w:t></w:t>
-      </w:r>
-      <w:r>
-        <w:rPr>
-          <w:b/>
-          <w:bCs/>
-          <w:sz w:val="24"/>
-          <w:lang w:val="hu-HU"/>
-        </w:rPr>
-        <w:t>Dokumentáció:</w:t>
-      </w:r>
-      <w:r>
-        <w:rPr>
-          <w:sz w:val="24"/>
-          <w:lang w:val="hu-HU"/>
-        </w:rPr>
-        <w:t xml:space="preserve"> A kutatási részeredmények összefoglalása, a szakmai konklúziók levonása és a jövőbeli fejlesztési lehetőségek megfogalmazása, valamint a szakdolgozat végleges formába öntése a Szegedi Tudományegyetem tartalmi és formai követelményeinek megfelelően.</w:t>
+        <w:t>.</w:t>
       </w:r>
       <w:r>
         <w:br w:type="page"/>
@@ -1475,7 +1304,21 @@
                 <w:rStyle w:val="Hyperlink"/>
                 <w:noProof/>
               </w:rPr>
-              <w:t>2.1.1. Hardveres erőforrás</w:t>
+              <w:t>2.1.1. Hardv</w:t>
+            </w:r>
+            <w:r>
+              <w:rPr>
+                <w:rStyle w:val="Hyperlink"/>
+                <w:noProof/>
+              </w:rPr>
+              <w:t>e</w:t>
+            </w:r>
+            <w:r>
+              <w:rPr>
+                <w:rStyle w:val="Hyperlink"/>
+                <w:noProof/>
+              </w:rPr>
+              <w:t>res erőforrás</w:t>
             </w:r>
             <w:r>
               <w:rPr>
@@ -4015,7 +3858,7 @@
         <w:rPr>
           <w:lang w:val="hu-HU"/>
         </w:rPr>
-        <w:t xml:space="preserve">Az orvosi idősorok automatikus osztályozása napjainkban kiemelt kutatási terület, hiszen a különféle betegségek gépi úton történő azonosítása lehetővé tenné a diagnózis automatikus detektálását kizárólag a rögzített adatok alapján. Szakdolgozatomban a PTB-XL adathalmazt használom fel az előfeldolgozási lépések, a beágyazások legenerálása, valamint a különböző osztályozó algoritmusok kiértékelése során. Ez a multidimenzionális adathalmaz 12 élvezetéssel rögzített elektrokardiogram (EKG) jeleket tartalmaz, amelyek kétféle mintavételezési gyakorisággal (100hz és 500hz) érhetők el, egységesen 10 másodpercnyi rögzítési hosszal, amelyből én a sűrűbben mintavételezett változatot használtam fel. </w:t>
+        <w:t xml:space="preserve">Az orvosi idősorok automatikus osztályozása napjainkban kiemelt kutatási terület, hiszen a különféle betegségek gépi úton történő azonosítása lehetővé tenné a diagnózis automatikus detektálását kizárólag a rögzített adatok alapján. Szakdolgozatomban a PTB-XL adathalmazt használom fel az előfeldolgozási lépések, a beágyazások legenerálása, valamint a különböző osztályozó algoritmusok kiértékelése során. Ez a multidimenzionális adathalmaz 12 élvezetéssel rögzített elektrokardiogram (EKG) jelet tartalmaz, amelyek kétféle mintavételezési gyakorisággal (100hz és 500hz) érhetők el, egységesen 10 másodpercnyi rögzítési hosszal, amelyből én a sűrűbben mintavételezett változatot használtam fel. </w:t>
       </w:r>
     </w:p>
     <w:p>
@@ -4054,7 +3897,7 @@
         <w:rPr>
           <w:lang w:val="hu-HU"/>
         </w:rPr>
-        <w:t>A felügyelet nélküli eljárások alkalmazása során, visszatérő probléma az adatok közötti jelentős átfedés és tiszta, jól elkülöníthető klaszterek hiánya. A felügyelt (suprevised) tanulási módszerek azonban igazolták, hogy az adathalmaz elméletben jól szerparálható az öt főosztályba, és a MOMENT alapmodell beágyazásai is megőrizték a rögzítések fontos információit, ám a felügyelet nélküli modelleknál rendszeresen tapasztalható, hogy az adatok a beágyazási térben nem különülnek el megfelelően. Emiatt a tisztán geometriai alapokon működő klaszterező eljárások gyakran nem képesek kielégítő pontossággal megtalálni a keresett osztályokat.</w:t>
+        <w:t>A felügyelet nélküli eljárások alkalmazása során visszatérő probléma az adatok közötti jelentős átfedés és tiszta, jól elkülöníthető klaszterek hiánya. A felügyelt (suprevised) tanulási módszerek azonban igazolták, hogy az adathalmaz elméletben jól szerparálható az öt főosztályba, és a MOMENT alapmodell beágyazásai is megőrizték a rögzítések fontos információit, ám a felügyelet nélküli modelleknál rendszeresen tapasztalható, hogy az adatok a beágyazási térben nem különülnek el megfelelően. Emiatt a tisztán geometriai alapokon működő klaszterező eljárások gyakran nem képesek kielégítő pontossággal megtalálni a keresett osztályokat.</w:t>
       </w:r>
     </w:p>
     <w:p>
@@ -4121,7 +3964,19 @@
         <w:rPr>
           <w:lang w:val="hu-HU"/>
         </w:rPr>
-        <w:t>A munka további részében - az első fejezetben - az elméleti hátteret, és a PTB-XL adathalmaz mutatom be. A második fejezetben részletezem a saját munkámat, beleértve az adatok előfeldolgozását, a MOMENT modellel való jellemzőkinyerést és a kísérleti beállításokat. A harmadik fejezetben ismertetem a hagyományos, és mélytanulás alapú mpdellekkel elért eredményeket, végül az összefoglalásban kitérek a modellek alkalmazhatóságára és a levont következtetésekre.</w:t>
+        <w:t>A munka további részében - az első fejezetben - az elméleti hátteret, és a PTB-XL adathalmaz mutatom be. A második fejezetben részletezem a saját munkámat, beleértve az adatok előfeldolgozását, a MOMENT modellel való jellemzőkinyerést és a kísérleti beállításokat. A harmadik fejezetben ismertetem a hagyományos, és mélytanulás alapú m</w:t>
+      </w:r>
+      <w:r>
+        <w:rPr>
+          <w:lang w:val="hu-HU"/>
+        </w:rPr>
+        <w:t>o</w:t>
+      </w:r>
+      <w:r>
+        <w:rPr>
+          <w:lang w:val="hu-HU"/>
+        </w:rPr>
+        <w:t>dellekkel elért eredményeket, végül az összefoglalásban kitérek a modellek alkalmazhatóságára és a levont következtetésekre.</w:t>
       </w:r>
       <w:r>
         <w:br w:type="page"/>
@@ -4356,7 +4211,7 @@
         <w:pStyle w:val="BodyText"/>
       </w:pPr>
       <w:r>
-        <w:t>Az adathalmaz elméleti sajátossága, és egyben a gépi tanulási modellek szempontjából kritikus tényező a jelentős osztály-kiegyensúlyozatlanság4. Míg a normál esetek (NORM) statisztikailag dominálják az állományt, addig az olyan specifikus patológiák, mint a hipertrófia (HYP), csak lényegesen kisebb esetszámban fordulnak elő. A vonatkozó szakirodalom rámutat arra, hogy ez a strukturális egyenetlenség komoly torzító tényezőt jelent a hagyományos felügyelet nélküli algoritmusok számára. Ennek oka, hogy az adatalapú modellek hajlamosak a statisztikai dominanciára építve a kisebbségi osztályokat pusztán zajként elvetni vagy egybemosni a többségi osztállyal. Ez a sajátosság teszi elméletileg is indokolttá a modellépítést megelőző célzott adat-előkészítési és mintavételezési stratégiák alkalmazását.</w:t>
+        <w:t>Az adathalmaz elméleti sajátossága, és egyben a gépi tanulási modellek szempontjából kritikus tényező a jelentős osztály-kiegyensúlyozatlanság. Míg a normál esetek (NORM) statisztikailag dominálják az állományt, addig az olyan specifikus patológiák, mint a hipertrófia (HYP), csak lényegesen kisebb esetszámban fordulnak elő. A vonatkozó szakirodalom rámutat arra, hogy ez a strukturális egyenetlenség komoly torzító tényezőt jelent a hagyományos felügyelet nélküli algoritmusok számára. Ennek oka, hogy az adatalapú modellek hajlamosak a statisztikai dominanciára építve a kisebbségi osztályokat pusztán zajként elvetni vagy egybemosni a többségi osztállyal. Ez a sajátosság teszi elméletileg is indokolttá a modellépítést megelőző célzott adat-előkészítési és mintavételezési stratégiák alkalmazását.</w:t>
       </w:r>
     </w:p>
     <w:p>
@@ -4526,7 +4381,7 @@
         <w:t>masked time-series modeling</w:t>
       </w:r>
       <w:r>
-        <w:t>) segítségével történik. Ennek során a bemeneti foltok egy részét véletlenszerűen elfedik (maszkolják), és a hálózatnak a megmaradt kontextus alapján rekonstruálnia kell a hiányzó részeket. Ez a arra készteti a modellt, hogy mély megértést fejlesszen ki az idősorok belső dinamikájáról, trendjeiről és periodikus jellemzőiről.</w:t>
+        <w:t>) segítségével történik. Ennek során a bemeneti foltok egy részét véletlenszerűen elfedik (maszkolják), és a hálózatnak a megmaradt kontextus alapján rekonstruálnia kell a hiányzó részeket. Ez arra készteti a modellt, hogy mély megértést fejlesszen ki az idősorok belső dinamikájáról, trendjeiről és periodikus jellemzőiről.</w:t>
       </w:r>
     </w:p>
     <w:p>
@@ -5078,6 +4933,9 @@
     <w:p>
       <w:pPr>
         <w:pStyle w:val="Heading1"/>
+        <w:rPr>
+          <w:lang w:val="hu-HU" w:eastAsia="hu-HU"/>
+        </w:rPr>
       </w:pPr>
       <w:bookmarkStart w:id="9" w:name="_Toc230163353"/>
       <w:r>
@@ -5095,19 +4953,65 @@
         </w:r>
         <w:bookmarkEnd w:id="9"/>
       </w:hyperlink>
+      <w:bookmarkStart w:id="10" w:name="_Toc230163354"/>
+    </w:p>
+    <w:p>
+      <w:pPr>
+        <w:pStyle w:val="BodyText"/>
+        <w:rPr>
+          <w:rStyle w:val="Bekezdsalapbettpusa"/>
+        </w:rPr>
+      </w:pPr>
+      <w:bookmarkStart w:id="11" w:name="__RefHeading___Toc80443499_Copy_1_Copy_1"/>
+      <w:bookmarkEnd w:id="11"/>
+      <w:r>
+        <w:rPr>
+          <w:rStyle w:val="Bekezdsalapbettpusa"/>
+        </w:rPr>
+        <w:t>Ebben a fejezetben részletesen bemutatom a kísérleteim során alkalmazott módszereket, az adatok előkészítésétől kezdve egészen a különböző gépi tanulási modellek betanításáig és kiértékeléséig. A fejezet célja, hogy átláthatóan és lépésről lépésre dokumentálja az elvégzett gyakorlati munkát és a szoftveres megvalósítást.</w:t>
+      </w:r>
+      <w:r>
+        <w:rPr>
+          <w:rStyle w:val="Bekezdsalapbettpusa"/>
+        </w:rPr>
+        <w:t xml:space="preserve"> </w:t>
+      </w:r>
+    </w:p>
+    <w:p>
+      <w:pPr>
+        <w:pStyle w:val="BodyText"/>
+        <w:rPr>
+          <w:rStyle w:val="Bekezdsalapbettpusa"/>
+        </w:rPr>
+      </w:pPr>
+      <w:r>
+        <w:rPr>
+          <w:rStyle w:val="Bekezdsalapbettpusa"/>
+        </w:rPr>
+        <w:t>A dolgozathoz elkészített teljes forráskód – az adatfeldolgozó szkriptekkel és a neurális hálózatok implementációjával együtt – elérhető egy nyilvános GitHub repozitóriumban [</w:t>
+      </w:r>
+      <w:r>
+        <w:rPr>
+          <w:rStyle w:val="Bekezdsalapbettpusa"/>
+        </w:rPr>
+        <w:t>11</w:t>
+      </w:r>
+      <w:r>
+        <w:rPr>
+          <w:rStyle w:val="Bekezdsalapbettpusa"/>
+        </w:rPr>
+        <w:t>]. Annak érdekében, hogy a leírt folyamatok könnyen visszakereshetők legyenek, az egyes alfejezetekben külön is utalok rá, hogy az ott bemutatott kód vagy Jupyter notebook pontosan melyik fájlban található meg a repozitóriumon belül.</w:t>
+      </w:r>
     </w:p>
     <w:p>
       <w:pPr>
         <w:pStyle w:val="Heading2"/>
       </w:pPr>
-      <w:bookmarkStart w:id="10" w:name="__RefHeading___Toc80443499_Copy_1_Copy_1"/>
-      <w:bookmarkStart w:id="11" w:name="_Toc230163354"/>
+      <w:r>
+        <w:t>2.1. Hardveres és szoftveres környezet</w:t>
+      </w:r>
       <w:bookmarkEnd w:id="10"/>
       <w:r>
-        <w:t>2.1. Hardveres és szoftveres környezet</w:t>
-      </w:r>
-      <w:bookmarkEnd w:id="11"/>
-      <w:r>
         <w:t xml:space="preserve"> </w:t>
       </w:r>
     </w:p>
@@ -5142,7 +5046,13 @@
         <w:pStyle w:val="BodyText"/>
       </w:pPr>
       <w:r>
-        <w:t>A kutatás legfontosabb részét képző mélytanulási alapmodellek (MOMENT) memóriába töltése, valamint a neurális hálózatok (DEC, IDEC) tanítása rendkívül számításigényes feladat (leginkább az embedder modell futtatása). Ennek hardveres gyorsítását egy dedikált NVIDIA GeForce RTX 3050 Laptop GPU végezte, amely viszont elég szűköd 2 GB videómemóriával (VRAM) rendelkezet, de elegendőnek bizonyúlt, és ezzel lehetővé tette a CUDA-alapú, lokális modellfuttatást.</w:t>
+        <w:t>A kutatás legfontosabb részét képző mélytanulási alapmodellek (MOMENT) memóriába töltése, valamint a neurális hálózatok (DEC, IDEC) tanítása rendkívül számításigényes feladat (leginkább az embedder modell futtatása). Ennek hardveres gyorsítását egy dedikált NVIDIA GeForce RTX 3050 Laptop GPU végezte, amely viszont elég szűköd 2 GB videómemóriával (VRAM) rendelkezet, de elegendőnek bizony</w:t>
+      </w:r>
+      <w:r>
+        <w:t>u</w:t>
+      </w:r>
+      <w:r>
+        <w:t>lt, és ezzel lehetővé tette a CUDA-alapú, lokális modellfuttatást.</w:t>
       </w:r>
     </w:p>
     <w:p>
@@ -5163,7 +5073,11 @@
         <w:pStyle w:val="BodyText"/>
       </w:pPr>
       <w:r>
-        <w:t>A fejlesztési környezet alapját Windows 11 operációs rendszer képezte. A projekt során felhasznált számos speciális programkönyvtár, szoftveres függőség (dependency) és azok verzióinak elkülönítése, valamint a lehetséges inkompatibilitási problémák elkerülése érdekében Conda virtuális környezetet alkalmaztam. A szkriptek írása, a kísérletek iteratív tesztelése és a kiértékelés interaktív módon, Jupyter Lab környezetben történt, Python 3.11.14-es programozási nyelvet használva.</w:t>
+        <w:t xml:space="preserve">A fejlesztési környezet alapját Windows 11 operációs rendszer képezte. A projekt során felhasznált számos speciális programkönyvtár, szoftveres függőség (dependency) és azok verzióinak elkülönítése, valamint a lehetséges inkompatibilitási problémák elkerülése érdekében Conda virtuális környezetet alkalmaztam. A szkriptek írása, a kísérletek iteratív </w:t>
+      </w:r>
+      <w:r>
+        <w:lastRenderedPageBreak/>
+        <w:t>tesztelése és a kiértékelés interaktív módon, Jupyter Lab környezetben történt, Python 3.11.14-es programozási nyelvet használva.</w:t>
       </w:r>
     </w:p>
     <w:p>
@@ -5230,7 +5144,6 @@
         <w:pStyle w:val="BodyText"/>
       </w:pPr>
       <w:r>
-        <w:lastRenderedPageBreak/>
         <w:t>Az orvosi EKG-felvételek nyers, bináris formátumú (</w:t>
       </w:r>
       <w:r>
@@ -5281,7 +5194,7 @@
           <w:rFonts w:ascii="Times New Roman" w:hAnsi="Times New Roman"/>
           <w:b/>
         </w:rPr>
-        <w:t>ast</w:t>
+        <w:t>AST</w:t>
       </w:r>
       <w:r>
         <w:t xml:space="preserve"> (Abstract Syntax Tree - Absztrakt Szintaxisfa) modul </w:t>
@@ -5302,7 +5215,13 @@
         <w:pStyle w:val="BodyText"/>
       </w:pPr>
       <w:r>
-        <w:t xml:space="preserve">A beolvasott többdimenziós idősoros adatok (5000 adatpont, 12 elvezetés) matematikai reprezentációjáért és az esetleges hiányzó értékek imputálásáért a </w:t>
+        <w:t xml:space="preserve">A beolvasott többdimenziós idősoros adatok (5000 adatpont, 12 elvezetés) matematikai reprezentációjáért és az esetleges hiányzó értékek </w:t>
+      </w:r>
+      <w:r>
+        <w:t>kiegészítéséért</w:t>
+      </w:r>
+      <w:r>
+        <w:t xml:space="preserve"> a </w:t>
       </w:r>
       <w:r>
         <w:rPr>
@@ -5524,6 +5443,7 @@
         <w:rPr>
           <w:b/>
         </w:rPr>
+        <w:lastRenderedPageBreak/>
         <w:t>Klaszterezés, modelloptimalizálás és vizualizáció</w:t>
       </w:r>
     </w:p>
@@ -5543,7 +5463,13 @@
         <w:t>scikit-learn</w:t>
       </w:r>
       <w:r>
-        <w:t xml:space="preserve"> csomagot használtam legfőkkép. Ebből a keretrendszerből importáltam a hagyományos modelleket (például </w:t>
+        <w:t xml:space="preserve"> csomagot használtam legfőkép</w:t>
+      </w:r>
+      <w:r>
+        <w:t>p</w:t>
+      </w:r>
+      <w:r>
+        <w:t xml:space="preserve">. Ebből a keretrendszerből importáltam a hagyományos modelleket (például </w:t>
       </w:r>
       <w:r>
         <w:rPr>
@@ -5651,7 +5577,6 @@
         <w:pStyle w:val="BodyText"/>
       </w:pPr>
       <w:r>
-        <w:lastRenderedPageBreak/>
         <w:t xml:space="preserve">A sűrűségalapú kísérletekhez a nemlineáris dimenziócsökkentést végző </w:t>
       </w:r>
       <w:r>
@@ -5740,6 +5665,22 @@
       <w:r>
         <w:t>Ebben a fejezetben részletesen bemutatom a megvalósított adatfeldolgozási folyamatot. Elsőként ismertetem a nyers, orvosi metaadatok szűrését és az osztálycímkék tisztítását, majd bemutatom a többdimenziós idősoros EKG-jelek dimenzióinak egységesítésére alkalmazott interpolációs módszert, amelyet felhasználtam a későbbi jellemzőkinyerési (embedding) folyamatok sikeres végrehajtásához.</w:t>
       </w:r>
+      <w:r>
+        <w:t xml:space="preserve"> Az ebben a fejezetben bemutatott</w:t>
+      </w:r>
+      <w:r>
+        <w:t xml:space="preserve"> adatelőkészítési folyamat teljes kódja a repozitórium </w:t>
+      </w:r>
+      <w:r>
+        <w:rPr>
+          <w:i/>
+          <w:iCs/>
+        </w:rPr>
+        <w:t>/pipeline_scripts/data_concat/data_concat_with_interpolation.ipynb</w:t>
+      </w:r>
+      <w:r>
+        <w:t xml:space="preserve"> fájljában található.</w:t>
+      </w:r>
     </w:p>
     <w:p>
       <w:pPr>
@@ -5771,7 +5712,11 @@
         <w:t xml:space="preserve">A PTB-XL adathalmazban a diagnózisok úgynevezett SCP-ECG </w:t>
       </w:r>
       <w:r>
-        <w:t>(Standard Communications Protocol for Computer Assisted Electrocardiography) kódok formájában vannak rögzítve, amely egy hivatalos nemzetközi szabvány. Ez azt jelenti, hogy ha egy orvos leírja azt, hogy valakinek szívinfarktusa van, azt megfogalmazhatja szabad szöveggel rengeteg féle képpen ("infarktus", "AMI", "szívroham", "myocardiális infarktus", stb.), ami egy gépi tanulási modell  feladatát jelentősen megnehezítené, vagy lehetetlenné tenné. Ezért minden féle képpen egy közös elnevezésre kellet volna hozni az azonos osztályba tartozó adatok címkéjét, viszont a szabvány alapú rögzítés ezt megoldotta helyettem. Ezen kívül, mivel a kardiológiában ritkán van 100%-os bizonyossággal megállapított betegség, így a formátum az adott betegségekhez egy valószínűségi értéket is rendelt. Például ebben a példában: {'NORM': 90.0, 'LHV': 15.0}, a kardiológus 90%-ig biztos, hogy ez egy normál EKG érték, de 15%-os esélyt talált valamilyen bal kamrai hipertrófiára (LHV). Mint ahogy a példában is látszik a formátum nem követeli meg, hogy a valószínűségi értékek összege 100% legyen, már csak azért is, mert több betegség is fennállhat egyszerre.</w:t>
+        <w:t xml:space="preserve">(Standard Communications Protocol for Computer Assisted Electrocardiography) kódok formájában vannak rögzítve, amely egy hivatalos nemzetközi szabvány. Ez azt jelenti, hogy ha egy orvos leírja azt, hogy valakinek szívinfarktusa van, azt megfogalmazhatja szabad szöveggel rengeteg féle képpen ("infarktus", "AMI", "szívroham", "myocardiális infarktus", stb.), ami egy gépi tanulási modell  feladatát jelentősen megnehezítené, vagy lehetetlenné tenné. Ezért minden féle képpen egy közös elnevezésre kellet volna hozni az azonos osztályba tartozó adatok címkéjét, viszont a szabvány alapú rögzítés ezt megoldotta helyettem. Ezen kívül, mivel a kardiológiában ritkán van 100%-os bizonyossággal megállapított betegség, így a formátum az adott betegségekhez egy valószínűségi értéket is rendelt. Például ebben a példában: {'NORM': 90.0, 'LHV': 15.0}, a </w:t>
+      </w:r>
+      <w:r>
+        <w:lastRenderedPageBreak/>
+        <w:t>kardiológus 90%-ig biztos, hogy ez egy normál EKG érték, de 15%-os esélyt talált valamilyen bal kamrai hipertrófiára (LHV). Mint ahogy a példában is látszik a formátum nem követeli meg, hogy a valószínűségi értékek összege 100% legyen, már csak azért is, mert több betegség is fennállhat egyszerre.</w:t>
       </w:r>
     </w:p>
     <w:p>
@@ -5799,19 +5744,60 @@
         <w:t>scp_statements.csv</w:t>
       </w:r>
       <w:r>
-        <w:t xml:space="preserve"> fájlok felhasználásával a nyers adatokat magasabb szintű, átfogó diagnosztikai főosztályokba (diagnostic superclass) egyesítettem. Ezt úgy tettem meg, hogy első lépésben a még kisosztály címkékből álló adatoból eldobtam mindet, amely formai eltérésre, vagy ritmuszavarra utalt, azaz nem volt diagnózis kódjuk. Majd meghatároztam, hogy az adat melyik fő osztályba tartozik. Például ha volt olyan, amelynek az SCP kódja ‘AMI’ (Akut Myocardiális Infarktus) és ‘IMI’ (Alsófali infarktus) </w:t>
-      </w:r>
-      <w:r>
-        <w:lastRenderedPageBreak/>
-        <w:t>értékeket tartalmazott, akkor azt az ‘MI’ (Myocardiális Infarktus) főosztályba soroltam. Ha ebben ütközés volt, és a diagnózisok szerint két főosztályba is tartoztak, akkor azokat eldobtam.</w:t>
-      </w:r>
-    </w:p>
-    <w:p>
-      <w:pPr>
-        <w:pStyle w:val="BodyText"/>
-      </w:pPr>
-      <w:r>
-        <w:t>Mivel a dolgozat fő célja a felügyelet nélküli eljárások használata és a klaszterezés minőségének vizsgálata, a többértelműség elkerülése érdekében szigorú szűrést alkalmaztam. A felügyelet nélküli klaszterező algoritmusok (mint például a K-Means) hard-clustering módszert alkalmaznak, azaz egy adatpontot egyértelműen egyetlen klaszterbe sorolnak be, vagy zajként jelölnek meg (mint például a DBSCAN, vagy HDBSCAN). Ezért a több egymást átfedő betegséggel rendelkező páciensek rekordjait eltávolítottam az adathalmazből, és kizárólag azokat a méréseket tartottam meg, amelyek pontosan egy darab diagnosztikai főosztályhoz tartoznak. Ezzel a szűréssel az eredeti 21 837 rekordból álló halmazt 16 272 egycímkés (single-label) rekordra csökkentettem, ami egy sokkal tisztább adathalmazt biztosított a későbbi algoritmusok kiértékeléséhez, és ezzel biztosítottam, hogy a klaszterek jóságát mérő mutatókat – mint például a Korrigált Rand-index (ARI) vagy a Normalizált kölcsönös információ (NMI) – használni lehessen.</w:t>
+        <w:t xml:space="preserve"> fájlok felhasználásával a nyers adatokat magasabb szintű, átfogó diagnosztikai főosztályokba (diagnostic superclass) egyesítettem. Ezt úgy tettem meg, hogy első lépésben a még kisosztály címkékből álló adatoból eldobtam mindet, amely formai eltérésre, vagy ritmuszavarra utalt, azaz nem volt diagnózis kódjuk. Majd meghatároztam, hogy az adat melyik fő osztályba tartozik. Például ha volt olyan, amelynek az SCP kódja ‘AMI’ (Akut Myocardiális Infarktus) és ‘IMI’ (Alsófali infarktus) értékeket tartalmazott, akkor azt az ‘MI’ (Myocardiális Infarktus) főosztályba soroltam. Ha ebben ütközés volt, és a diagnózisok szerint két főosztályba is tartoztak, akkor </w:t>
+      </w:r>
+      <w:r>
+        <w:t>kizártam a vizsgálatból</w:t>
+      </w:r>
+      <w:r>
+        <w:t>.</w:t>
+      </w:r>
+    </w:p>
+    <w:p>
+      <w:pPr>
+        <w:pStyle w:val="BodyText"/>
+      </w:pPr>
+      <w:r>
+        <w:rPr>
+          <w:b/>
+          <w:bCs/>
+        </w:rPr>
+        <w:t>A címkék szerepe a felügyelet nélküli tanulásban</w:t>
+      </w:r>
+    </w:p>
+    <w:p>
+      <w:pPr>
+        <w:pStyle w:val="BodyText"/>
+      </w:pPr>
+      <w:r>
+        <w:t xml:space="preserve">Ezen a ponton fontos tisztázni az adathalmaz címkézettségének kérdését. Bár a PTB-XL eredetileg egy felügyelt (címkézett) adathalmaz, a jelen dolgozat fókuszában felügyelet nélküli (unsupervised) algoritmusok állnak. Ez a gyakorlatban azt jelenti, hogy a klaszterező modellek (pl. K-Means, HDBSCAN) futtatása során ezeket a diagnosztikai címkéket </w:t>
+      </w:r>
+      <w:r>
+        <w:rPr>
+          <w:i/>
+          <w:iCs/>
+        </w:rPr>
+        <w:t>teljesen elrejtettem</w:t>
+      </w:r>
+      <w:r>
+        <w:t xml:space="preserve"> az algoritmusok elől; a csoportosítás kizárólag az EKG jelekből kinyert matematikai jellemzők (embeddingek) alapján történt.</w:t>
+      </w:r>
+      <w:r>
+        <w:t xml:space="preserve"> A kiértékeléshez viszont muszáj felhasználnom a címkéket, amit többségi szavazás (majority voting) technikával rendelek az adatokhoz.</w:t>
+      </w:r>
+    </w:p>
+    <w:p>
+      <w:pPr>
+        <w:pStyle w:val="BodyText"/>
+      </w:pPr>
+      <w:r>
+        <w:t>Mivel a dolgozat fő célja a felügyelet nélküli eljárások használata és a klaszterezés minőségének vizsgálata, a többértelműség elkerülése érdekében szigorú szűrést alkalmaztam. A felügyelet nélküli klaszterező algoritmusok (mint például a K-Means) hard-clustering módszert alkalmaznak, azaz egy adatpontot egyértelműen egyetlen klaszterbe sorolnak be, vagy zajként jelölnek meg (mint például a DBSCAN, vagy HDBSCAN). Ezért a több egymást átfedő betegséggel rendelkező páciensek rekordjait eltávolítottam az adathalmazb</w:t>
+      </w:r>
+      <w:r>
+        <w:t>ó</w:t>
+      </w:r>
+      <w:r>
+        <w:t>l, és kizárólag azokat a méréseket tartottam meg, amelyek pontosan egy darab diagnosztikai főosztályhoz tartoznak. Ezzel a szűréssel az eredeti 21 837 rekordból álló halmazt 16 272 egycímkés (single-label) rekordra csökkentettem, ami egy sokkal tisztább adathalmazt biztosított a későbbi algoritmusok kiértékeléséhez, és ezzel biztosítottam, hogy a klaszterek jóságát mérő mutatókat – mint például a Korrigált Rand-index (ARI) vagy a Normalizált kölcsönös információ (NMI) – használni lehessen.</w:t>
       </w:r>
     </w:p>
     <w:p>
@@ -5835,6 +5821,8 @@
         <w:rPr>
           <w:rStyle w:val="SourceText"/>
           <w:rFonts w:ascii="Times New Roman" w:hAnsi="Times New Roman"/>
+          <w:b/>
+          <w:bCs/>
         </w:rPr>
         <w:t>wfdb</w:t>
       </w:r>
@@ -5845,6 +5833,8 @@
         <w:rPr>
           <w:rStyle w:val="SourceText"/>
           <w:rFonts w:ascii="Times New Roman" w:hAnsi="Times New Roman"/>
+          <w:i/>
+          <w:iCs/>
         </w:rPr>
         <w:t>numpy.ndarray</w:t>
       </w:r>
@@ -5867,6 +5857,7 @@
         <w:pStyle w:val="BodyText"/>
       </w:pPr>
       <w:r>
+        <w:lastRenderedPageBreak/>
         <w:t xml:space="preserve">A valós klinikai mérések sajátosságából adódóan a jelek elvétve tartalmazhattak hiányzó vagy mérési hibából fakadó értékeket (NaN – Not a Number). Ezek kezelésére a hiányzó adatpontokat nullára (0.0) cseréltem. Ennek az egyszerű cserének az indoka az volt, hogy mivel az előfeldolgozott EKG jelek esetében a nulla érték jellemzően az izoelektromos vonalnak (alapvonalnak) felel meg, ez a kitöltés nem hoz létre mesterséges, nagyfrekvenciás ugrásokat vagy zajokat a jelben. Ezzel a módszerrel biztosítottam a többdimenziós idősor folytonosságát, amely elengedhetetlen a mélytanulási modellek stabil bemenetéhez.  </w:t>
       </w:r>
     </w:p>
@@ -5885,12 +5876,20 @@
         <w:pStyle w:val="BodyText"/>
       </w:pPr>
       <w:r>
-        <w:t>A MOMENT-hez hasonló foundation modellek bemeneti tenzorai nem feltétlenül várnak fix dimenziót, de a beágyazások (embeddingek) összehasonlíthatóságának, valamint a batch feldolgozásnak az érdekében az idősorokat egységes méretűre kellett hozni. Bár a PTB-XL adathalmaz tartalmazott 100 Hz-es mintavételezésű (így alapból 1000 adatpont hosszúságú) változatot is, a dolgozatban az eredeti, 500 Hz-es adatokon végzett egydimenziós lineáris interpolációt (</w:t>
+        <w:t>A MOMENT-hez hasonló foundation modellek bemeneti tenzorai nem feltétlenül várnak fix dimenziót, de a beágyazások (embeddingek) összehasonlíthatóságának, valamint a batch feldolgozásnak az érdekében az idősorokat egységes méretűre kellett hozni. Bár a PTB-XL adathalmaz tartalmazott 100 Hz-es minta</w:t>
+      </w:r>
+      <w:r>
+        <w:t>-</w:t>
+      </w:r>
+      <w:r>
+        <w:t>vételezésű (így alapból 1000 adatpont hosszúságú) változatot is, a dolgozatban az eredeti, 500 Hz-es adatokon végzett egydimenziós lineáris interpolációt (</w:t>
       </w:r>
       <w:r>
         <w:rPr>
           <w:rStyle w:val="SourceText"/>
           <w:rFonts w:ascii="Times New Roman" w:hAnsi="Times New Roman"/>
+          <w:i/>
+          <w:iCs/>
         </w:rPr>
         <w:t>scipy.interpolate.interp1d</w:t>
       </w:r>
@@ -5903,11 +5902,7 @@
         <w:pStyle w:val="BodyText"/>
       </w:pPr>
       <w:r>
-        <w:t xml:space="preserve">A lineáris interpoláció választását az indokolta, hogy a magasabb fokú (például spline) interpolációs algoritmusok hajlamosak mesterséges túllengéseket (Runge-jelenség) generálni a </w:t>
-      </w:r>
-      <w:r>
-        <w:lastRenderedPageBreak/>
-        <w:t>hirtelen frekvenciaváltozásoknál. Egy EKG-görbe esetében ez az anomália a diagnosztikai szempontból legfontosabb szakaszok, például a QRS-komplexusok torzulásához vezethetne. Az interpolációval elért egységes 1000-es célhosszúság (target length) garantálja, hogy a MOMENT modell attention-mechanizmusa minden esetben konzisztensen tudja értelmezni a bemenetet, függetlenül a felvétel eredeti paramétereitől.</w:t>
+        <w:t>A lineáris interpoláció választását az indokolta, hogy a magasabb fokú (például spline) interpolációs algoritmusok hajlamosak mesterséges túllengéseket (Runge-jelenség) generálni a hirtelen frekvenciaváltozásoknál. Egy EKG-görbe esetében ez az anomália a diagnosztikai szempontból legfontosabb szakaszok, például a QRS-komplexusok torzulásához vezethetne. Az interpolációval elért egységes 1000-es célhosszúság (target length) garantálja, hogy a MOMENT modell attention-mechanizmusa minden esetben konzisztensen tudja értelmezni a bemenetet, függetlenül a felvétel eredeti paramétereitől.</w:t>
       </w:r>
     </w:p>
     <w:p>
@@ -5921,16 +5916,30 @@
         <w:rPr>
           <w:rStyle w:val="SourceText"/>
           <w:rFonts w:ascii="Times New Roman" w:hAnsi="Times New Roman"/>
+          <w:i/>
+          <w:iCs/>
         </w:rPr>
         <w:t>np.float32</w:t>
       </w:r>
       <w:r>
-        <w:t>) formátumra konvertáltam, és bináris numpy (</w:t>
+        <w:t xml:space="preserve">) formátumra konvertáltam, és bináris </w:t>
+      </w:r>
+      <w:r>
+        <w:rPr>
+          <w:b/>
+          <w:bCs/>
+        </w:rPr>
+        <w:t>numpy</w:t>
+      </w:r>
+      <w:r>
+        <w:t xml:space="preserve"> (</w:t>
       </w:r>
       <w:r>
         <w:rPr>
           <w:rStyle w:val="SourceText"/>
           <w:rFonts w:ascii="Times New Roman" w:hAnsi="Times New Roman"/>
+          <w:i/>
+          <w:iCs/>
         </w:rPr>
         <w:t>.npy</w:t>
       </w:r>
@@ -5941,6 +5950,8 @@
         <w:rPr>
           <w:rStyle w:val="SourceText"/>
           <w:rFonts w:ascii="Times New Roman" w:hAnsi="Times New Roman"/>
+          <w:i/>
+          <w:iCs/>
         </w:rPr>
         <w:t>.npy</w:t>
       </w:r>
@@ -5976,6 +5987,7 @@
       <w:r>
         <w:rPr>
           <w:rStyle w:val="SourceText"/>
+          <w:rFonts w:ascii="Times New Roman" w:hAnsi="Times New Roman" w:cs="Times New Roman"/>
         </w:rPr>
         <w:t>momentfm</w:t>
       </w:r>
@@ -5988,166 +6000,340 @@
         <w:pStyle w:val="BodyText"/>
       </w:pPr>
       <w:r>
-        <w:t>Ebben a fejezetben részletesen bemutatom a foundation modell inicializálásának mérnöki lépéseit, beleértve a feladatspecifikus beállításokat is. Ezt követően kitérek a figyelem-mechanizmushoz (attention) szorosan kapcsolódó bemeneti maszkolás (input mask) logikájára, végezetül pedig ismertetem azokat a szigorú memóriakezelési stratégiákat, amelyek elengedhetetlenek voltak a nagyméretű (large) architektúra szűkös memóriakapacitású lokális hardveren történő stabil futtatásához.</w:t>
-      </w:r>
-    </w:p>
-    <w:p>
-      <w:pPr>
-        <w:pStyle w:val="Heading3"/>
-      </w:pPr>
-      <w:bookmarkStart w:id="21" w:name="_Toc230163363"/>
-      <w:r>
-        <w:t>2.3.1. A MOMENT alapmodell elméleti háttere és működése</w:t>
-      </w:r>
-      <w:bookmarkEnd w:id="21"/>
-      <w:r>
-        <w:t xml:space="preserve"> </w:t>
-      </w:r>
-    </w:p>
-    <w:p>
-      <w:pPr>
-        <w:pStyle w:val="BodyText"/>
-      </w:pPr>
-      <w:r>
-        <w:t xml:space="preserve">A kutatás során alkalmazott </w:t>
+        <w:t xml:space="preserve">Ebben a fejezetben részletesen bemutatom a foundation modell inicializálásának mérnöki lépéseit, beleértve a feladatspecifikus beállításokat is. Ezt követően kitérek a figyelem-mechanizmushoz (attention) szorosan kapcsolódó bemeneti maszkolás (input mask) logikájára, </w:t>
+      </w:r>
+      <w:r>
+        <w:lastRenderedPageBreak/>
+        <w:t>végezetül pedig ismertetem azokat a szigorú memóriakezelési stratégiákat, amelyek elengedhetetlenek voltak a nagyméretű (large) architektúra szűkös memóriakapacitású lokális hardveren történő stabil futtatásához.</w:t>
+      </w:r>
+      <w:r>
+        <w:t xml:space="preserve"> Ezen fejezetben bemutatott jellemzőkinyerés</w:t>
+      </w:r>
+      <w:r>
+        <w:t xml:space="preserve"> teljes kódja a repozitórium </w:t>
       </w:r>
       <w:r>
         <w:rPr>
           <w:i/>
           <w:iCs/>
         </w:rPr>
+        <w:t>/pipeline_scripts/data_embedding/data_embedding_new.ipynb</w:t>
+      </w:r>
+      <w:r>
+        <w:t xml:space="preserve"> fájljában található.</w:t>
+      </w:r>
+    </w:p>
+    <w:p>
+      <w:pPr>
+        <w:pStyle w:val="Heading3"/>
+      </w:pPr>
+      <w:bookmarkStart w:id="21" w:name="_Toc230163363"/>
+      <w:r>
+        <w:t>2.3.1. A MOMENT alapmodell elméleti háttere és működése</w:t>
+      </w:r>
+      <w:bookmarkEnd w:id="21"/>
+      <w:r>
+        <w:t xml:space="preserve"> </w:t>
+      </w:r>
+    </w:p>
+    <w:p>
+      <w:pPr>
+        <w:pStyle w:val="BodyText"/>
+      </w:pPr>
+      <w:r>
+        <w:t xml:space="preserve">A kutatás során alkalmazott </w:t>
+      </w:r>
+      <w:r>
+        <w:rPr>
+          <w:i/>
+          <w:iCs/>
+        </w:rPr>
         <w:t>MOMENT: A Family of Open Time-series Foundation Models</w:t>
       </w:r>
       <w:r>
         <w:t xml:space="preserve"> egy kifejezetten idősoros adatok elemzésére kifejlesztett nyílt forráskódú alapmodell (foundation model), amelyet a Carnegie Mellon Egyetem AutonLab kutatócsoportja publikált </w:t>
+      </w:r>
+      <w:r>
+        <w:rPr>
+          <w:rStyle w:val="SourceText"/>
+          <w:rFonts w:ascii="Times New Roman" w:hAnsi="Times New Roman" w:cs="Times New Roman"/>
+        </w:rPr>
+        <w:t>[2]</w:t>
+      </w:r>
+      <w:r>
+        <w:t>. A gépi tanulás területén az alapmodellek olyan robusztus, nagyméretű architektúrákat jelentenek, amelyek hatalmas mennyiségű, diverz adaton történő általános előtanítást követően finomhangolás nélkül is képesek specifikus feladatok (például anomália detektálás, osztályozás vagy jellemző kinyerés) elvégzésére.</w:t>
+      </w:r>
+    </w:p>
+    <w:p>
+      <w:pPr>
+        <w:pStyle w:val="BodyText"/>
+      </w:pPr>
+      <w:r>
+        <w:t>A MOMENT architektúrájának magját a modern mesterséges intelligencia kutatásban, különösen a nagy nyelvi modelleknél (LLM) áttörést hozó Transformer hálózat adja. A Transformer architektúra önfigyelmi mechanizmusának (self-attention) köszönhetően a modell kiválóan alkalmas az idősoros adatokon – mint amilyenek a jelen dolgozatban vizsgált sokdimenziós EKG-jelek is – belüli komplex, lokális és hosszú távú összefüggések egyidejű megragadására. A kísérletekhez az architektúra „large”, azaz nagyméretű változatát (</w:t>
+      </w:r>
+      <w:r>
+        <w:rPr>
+          <w:rStyle w:val="SourceText"/>
+          <w:rFonts w:ascii="Times New Roman" w:hAnsi="Times New Roman" w:cs="Times New Roman"/>
+        </w:rPr>
+        <w:t>MOMENT-1-large</w:t>
+      </w:r>
+      <w:r>
+        <w:t xml:space="preserve">) használtam. Ez a változat több százmillió optimalizálható paraméterének (pontosabban 314 millió) köszönhetően kiemelkedő reprezentációs képességgel rendelkezik, így hatékonyan képes kinyerni a rejtett mintázatokat a nagyfelbontású fiziológiai jelekből </w:t>
+      </w:r>
+      <w:r>
+        <w:rPr>
+          <w:rStyle w:val="SourceText"/>
+          <w:rFonts w:ascii="Times New Roman" w:hAnsi="Times New Roman" w:cs="Times New Roman"/>
+        </w:rPr>
+        <w:t>[</w:t>
+      </w:r>
+      <w:r>
+        <w:rPr>
+          <w:rStyle w:val="SourceText"/>
+          <w:rFonts w:ascii="Times New Roman" w:hAnsi="Times New Roman" w:cs="Times New Roman"/>
+        </w:rPr>
+        <w:t>2</w:t>
+      </w:r>
+      <w:r>
+        <w:rPr>
+          <w:rStyle w:val="SourceText"/>
+          <w:rFonts w:ascii="Times New Roman" w:hAnsi="Times New Roman" w:cs="Times New Roman"/>
+        </w:rPr>
+        <w:t>]</w:t>
+      </w:r>
+      <w:r>
+        <w:t>. A most bemutatott felhasználáson kívül a MOMENT modell képes még előrejelzés (forecast), osztályozás (classification), anomália észlelés (anomaly detection), és adatpótlás (imputation) feladatok megoldására.</w:t>
+      </w:r>
+    </w:p>
+    <w:p>
+      <w:pPr>
+        <w:pStyle w:val="BodyText"/>
+      </w:pPr>
+      <w:r>
+        <w:t>A MOMENT modell rendkívüli generalizációs képessége az úgynevezett „Time-series Pile” nevű, hatalmas és rendkívül változatos idősoros adathalmazon történő előtanításnak (pre-training) köszönhető</w:t>
+      </w:r>
+      <w:r>
+        <w:t xml:space="preserve"> [2</w:t>
+      </w:r>
+      <w:r>
+        <w:rPr>
+          <w:rStyle w:val="SourceText"/>
+          <w:rFonts w:ascii="Times New Roman" w:hAnsi="Times New Roman" w:cs="Times New Roman"/>
+        </w:rPr>
+        <w:t>]</w:t>
+      </w:r>
+      <w:r>
+        <w:t>. Ennek a kiterjedt és erőforrásigényes előtanításnak az a legfőbb előnye, hogy a hálózat súlyai már optimalizáltak az idősorok dinamikájának, frekvenciaváltozásainak és alapvető topológiai mintázatainak felismerésére. Jelen kutatás szempontjából kiemelten fontos döntés volt, hogy a feldolgozás során a modellt nem tanítottam tovább (nem végeztem rajta finomhangolást vagy domain-specifikus súlyfrissítést). Ehelyett tudatosan a gyári állapotú alapmodell robusztus, általánosított jellemzőkinyerési (feature extraction) képességeire támaszkodtam a komplex EKG-jelek feldolgozásakor.</w:t>
+      </w:r>
+    </w:p>
+    <w:p>
+      <w:pPr>
+        <w:pStyle w:val="BodyText"/>
+      </w:pPr>
+      <w:r>
+        <w:t>Bár a MOMENT architektúrája több különböző idősoros feladatra (például előrejelzésre, anomália detektálásra vagy hiányzó adatok imputációjára</w:t>
+      </w:r>
+      <w:r>
+        <w:t xml:space="preserve"> [1</w:t>
+      </w:r>
+      <w:r>
+        <w:t>2</w:t>
+      </w:r>
+      <w:r>
+        <w:t>]</w:t>
+      </w:r>
+      <w:r>
+        <w:t>) is képes, a kísérletek során feladatspecifikusan kizárólag a beágyazási (embedding) funkcióját hívtam meg. Ebben az operációs módban a modell a korábban előkészített és interpolált, 1000 adatpont hosszúságú EKG-jeleket egy sűrített, 1024 dimenziós folytonos matematikai vektorrá – más néven rejtett állapottá (hidden state) – alakítja át</w:t>
+      </w:r>
+      <w:r>
+        <w:t xml:space="preserve">. </w:t>
+      </w:r>
+      <w:r>
+        <w:t xml:space="preserve">Ez a nemlineáris transzformáció elengedhetetlenül fontos a pipeline-ban: a nyers, zajos és nehezen interpretálható fiziológiai jeleket egy olyan tömör </w:t>
+      </w:r>
+      <w:r>
+        <w:lastRenderedPageBreak/>
+        <w:t>beágyazási térbe (embedding space) vetíti, amelyen a későbbi felügyelet nélküli klaszterező algoritmusok az euklideszi vagy koszinusz-távolságok alapján képesek operálni.</w:t>
+      </w:r>
+    </w:p>
+    <w:p>
+      <w:pPr>
+        <w:pStyle w:val="Heading3"/>
+      </w:pPr>
+      <w:bookmarkStart w:id="22" w:name="_Toc230163364"/>
+      <w:r>
+        <w:t>2.3.2. A bemeneti adatok standardizálása és tenzorrá alakítása</w:t>
+      </w:r>
+      <w:bookmarkEnd w:id="22"/>
+    </w:p>
+    <w:p>
+      <w:pPr>
+        <w:pStyle w:val="BodyText"/>
+        <w:spacing w:line="274" w:lineRule="auto"/>
+      </w:pPr>
+      <w:bookmarkStart w:id="23" w:name="p-rc_99882a4b9c732835-67"/>
+      <w:bookmarkEnd w:id="23"/>
+      <w:r>
+        <w:t xml:space="preserve">A feldolgozási folyamat (pipeline) első lépéseként a nyers, </w:t>
       </w:r>
       <w:r>
         <w:rPr>
           <w:rStyle w:val="SourceText"/>
           <w:rFonts w:ascii="Times New Roman" w:hAnsi="Times New Roman"/>
         </w:rPr>
-        <w:t>[2]</w:t>
-      </w:r>
-      <w:r>
-        <w:t>. A gépi tanulás területén az alapmodellek olyan robusztus, nagyméretű architektúrákat jelentenek, amelyek hatalmas mennyiségű, diverz adaton történő általános előtanítást követően finomhangolás nélkül is képesek specifikus feladatok (például anomália detektálás, osztályozás vagy jellemző kinyerés) elvégzésére.</w:t>
-      </w:r>
-    </w:p>
-    <w:p>
-      <w:pPr>
-        <w:pStyle w:val="BodyText"/>
-      </w:pPr>
-      <w:r>
-        <w:t>A MOMENT architektúrájának magját a modern mesterséges intelligencia kutatásban, különösen a nagy nyelvi modelleknél (LLM) áttörést hozó Transformer hálózat adja. A Transformer architektúra önfigyelmi mechanizmusának (self-attention) köszönhetően a modell kiválóan alkalmas az idősoros adatokon – mint amilyenek a jelen dolgozatban vizsgált sokdimenziós EKG-jelek is – belüli komplex, lokális és hosszú távú összefüggések egyidejű megragadására. A kísérletekhez az architektúra „large”, azaz nagyméretű változatát (</w:t>
+        <w:t>.npy</w:t>
+      </w:r>
+      <w:r>
+        <w:t xml:space="preserve"> formátumú EKG adatokat töltöttem be. Mivel a valós orvosi adatok (különösen a szenzoros mérések) esetenként hiányosak vagy hibásak lehetnek, a betöltést követően egy adatminőség-ellenőrzési lépést hajtottam végre: az esetlegesen előforduló hiányzó értékeket (NaN - </w:t>
+      </w:r>
+      <w:r>
+        <w:rPr>
+          <w:iCs/>
+        </w:rPr>
+        <w:t>Not a Number</w:t>
+      </w:r>
+      <w:r>
+        <w:t>) numerikus nullával helyettesítettem (</w:t>
       </w:r>
       <w:r>
         <w:rPr>
           <w:rStyle w:val="SourceText"/>
           <w:rFonts w:ascii="Times New Roman" w:hAnsi="Times New Roman"/>
-        </w:rPr>
-        <w:t>MOMENT-1-large</w:t>
-      </w:r>
-      <w:r>
-        <w:t xml:space="preserve">) használtam. Ez a változat több százmillió optimalizálható paraméterének (pontosabban 314 millió) köszönhetően kiemelkedő reprezentációs képességgel rendelkezik, </w:t>
-      </w:r>
-      <w:r>
-        <w:lastRenderedPageBreak/>
-        <w:t xml:space="preserve">így hatékonyan képes kinyerni a rejtett mintázatokat a nagyfelbontású fiziológiai jelekből </w:t>
+          <w:i/>
+          <w:iCs/>
+        </w:rPr>
+        <w:t>np.nan_to_num</w:t>
+      </w:r>
+      <w:r>
+        <w:t xml:space="preserve">) a számítási hibák elkerülése miatt. </w:t>
+      </w:r>
+    </w:p>
+    <w:p>
+      <w:pPr>
+        <w:pStyle w:val="BodyText"/>
+        <w:spacing w:line="274" w:lineRule="auto"/>
+      </w:pPr>
+      <w:bookmarkStart w:id="24" w:name="p-rc_99882a4b9c732835-68"/>
+      <w:bookmarkEnd w:id="24"/>
+      <w:r>
+        <w:t xml:space="preserve">Az adattisztítást a jellemzők skálázása követi. Ehhez a </w:t>
       </w:r>
       <w:r>
         <w:rPr>
           <w:rStyle w:val="SourceText"/>
           <w:rFonts w:ascii="Times New Roman" w:hAnsi="Times New Roman"/>
         </w:rPr>
-        <w:t>[Hivatkozás helye]</w:t>
-      </w:r>
-      <w:r>
-        <w:t>. A most bemutatott felhasználáson kívül a MOMENT modell képes még előrejelzés (forecast), osztályozás (classification), anomália észlelés (anomaly detection), és adatpótlás (imputation) feladatok megoldására.</w:t>
-      </w:r>
-    </w:p>
-    <w:p>
-      <w:pPr>
-        <w:pStyle w:val="BodyText"/>
-      </w:pPr>
-      <w:r>
-        <w:t xml:space="preserve">A MOMENT modell rendkívüli generalizációs képessége az úgynevezett „Time-series Pile” nevű, hatalmas és rendkívül változatos idősoros adathalmazon történő előtanításnak (pre-training) köszönhető </w:t>
+        <w:t>scikit-learn</w:t>
+      </w:r>
+      <w:r>
+        <w:t xml:space="preserve"> könyvtár </w:t>
       </w:r>
       <w:r>
         <w:rPr>
           <w:rStyle w:val="SourceText"/>
           <w:rFonts w:ascii="Times New Roman" w:hAnsi="Times New Roman"/>
         </w:rPr>
-        <w:t>[Hivatkozás helye]</w:t>
-      </w:r>
-      <w:r>
-        <w:t>. Ennek a kiterjedt és erőforrásigényes előtanításnak az a legfőbb előnye, hogy a hálózat súlyai már optimalizáltak az idősorok dinamikájának, frekvenciaváltozásainak és alapvető topológiai mintázatainak felismerésére. Jelen kutatás szempontjából kiemelten fontos döntés volt, hogy a feldolgozás során a modellt nem tanítottam tovább (nem végeztem rajta finomhangolást vagy domain-specifikus súlyfrissítést). Ehelyett tudatosan a gyári állapotú alapmodell robusztus, általánosított jellemzőkinyerési (feature extraction) képességeire támaszkodtam a komplex EKG-jelek feldolgozásakor.</w:t>
-      </w:r>
-    </w:p>
-    <w:p>
-      <w:pPr>
-        <w:pStyle w:val="BodyText"/>
-      </w:pPr>
-      <w:r>
-        <w:t xml:space="preserve">Bár a MOMENT architektúrája több különböző idősoros feladatra (például előrejelzésre, anomália detektálásra vagy hiányzó adatok imputációjára) is képes, a kísérletek során feladatspecifikusan kizárólag a beágyazási (embedding) funkcióját hívtam meg. Ebben az operációs módban a modell a korábban előkészített és interpolált, 1000 adatpont hosszúságú EKG-jeleket egy sűrített, 1024 dimenziós folytonos matematikai vektorrá – más néven rejtett állapottá (hidden state) – alakítja át </w:t>
+        <w:t>StandardScaler</w:t>
+      </w:r>
+      <w:r>
+        <w:t xml:space="preserve"> algoritmusát alkalmaztam. A standardizálás elengedhetetlen lépés a mélytanulási modellek stabilitása és megfelelő konvergenciája érdekében, mivel az egyes EKG csatornák (elvezetések) eltérő amplitúdókkal és statisztikai jellemzőkkel rendelkezhetnek. Az eljárás minden egyes jellemzőt nulla várható értékűre és egységnyi szórásúra, azaz normális eloszlásúra transzformál. </w:t>
+      </w:r>
+    </w:p>
+    <w:p>
+      <w:pPr>
+        <w:pStyle w:val="BodyText"/>
+        <w:spacing w:line="274" w:lineRule="auto"/>
+      </w:pPr>
+      <w:bookmarkStart w:id="25" w:name="p-rc_99882a4b9c732835-69"/>
+      <w:bookmarkEnd w:id="25"/>
+      <w:r>
+        <w:t xml:space="preserve">Mivel a MOMENT modell </w:t>
+      </w:r>
+      <w:r>
+        <w:rPr>
+          <w:b/>
+          <w:bCs/>
+        </w:rPr>
+        <w:t>PyTorch</w:t>
+      </w:r>
+      <w:r>
+        <w:t xml:space="preserve"> keretrendszerre épül, a standardizált </w:t>
+      </w:r>
+      <w:r>
+        <w:rPr>
+          <w:b/>
+          <w:bCs/>
+        </w:rPr>
+        <w:t>NumPy</w:t>
+      </w:r>
+      <w:r>
+        <w:t xml:space="preserve"> tömböket </w:t>
+      </w:r>
+      <w:r>
+        <w:rPr>
+          <w:b/>
+          <w:bCs/>
+        </w:rPr>
+        <w:t>PyTorch</w:t>
+      </w:r>
+      <w:r>
+        <w:t xml:space="preserve"> tenzorokká (</w:t>
       </w:r>
       <w:r>
         <w:rPr>
           <w:rStyle w:val="SourceText"/>
           <w:rFonts w:ascii="Times New Roman" w:hAnsi="Times New Roman"/>
-        </w:rPr>
-        <w:t>[Hivatkozás helye]</w:t>
-      </w:r>
-      <w:r>
-        <w:t>. Ez a nemlineáris transzformáció elengedhetetlenül fontos a pipeline-ban: a nyers, zajos és nehezen interpretálható fiziológiai jeleket egy olyan tömör beágyazási térbe (embedding space) vetíti, amelyen a későbbi felügyelet nélküli klaszterező algoritmusok az euklideszi vagy koszinusz-távolságok alapján képesek operálni.</w:t>
-      </w:r>
-    </w:p>
-    <w:p>
-      <w:pPr>
-        <w:pStyle w:val="Heading3"/>
-      </w:pPr>
-      <w:bookmarkStart w:id="22" w:name="_Toc230163364"/>
-      <w:r>
-        <w:t>2.3.2. A bemeneti adatok standardizálása és tenzorrá alakítása</w:t>
-      </w:r>
-      <w:bookmarkEnd w:id="22"/>
-    </w:p>
-    <w:p>
-      <w:pPr>
-        <w:pStyle w:val="BodyText"/>
-        <w:spacing w:line="274" w:lineRule="auto"/>
-      </w:pPr>
-      <w:bookmarkStart w:id="23" w:name="p-rc_99882a4b9c732835-67"/>
-      <w:bookmarkEnd w:id="23"/>
-      <w:r>
-        <w:t xml:space="preserve">A feldolgozási folyamat (pipeline) első lépéseként a nyers, </w:t>
+          <w:i/>
+          <w:iCs/>
+        </w:rPr>
+        <w:t>torch.tensor</w:t>
+      </w:r>
+      <w:r>
+        <w:t>) konvertáltam, méghozzá 32 bites lebegőpontos pontossággal (</w:t>
       </w:r>
       <w:r>
         <w:rPr>
           <w:rStyle w:val="SourceText"/>
           <w:rFonts w:ascii="Times New Roman" w:hAnsi="Times New Roman"/>
-        </w:rPr>
-        <w:t>.npy</w:t>
-      </w:r>
-      <w:r>
-        <w:t xml:space="preserve"> formátumú EKG adatokat töltöttem be. Mivel a valós orvosi adatok (különösen a szenzoros mérések) esetenként hiányosak vagy hibásak lehetnek, a betöltést követően egy adatminőség-ellenőrzési lépést hajtottam végre: az esetlegesen előforduló hiányzó értékeket (NaN - </w:t>
-      </w:r>
-      <w:r>
-        <w:rPr>
           <w:i/>
-        </w:rPr>
-        <w:t>Not a Number</w:t>
-      </w:r>
-      <w:r>
-        <w:t>) numerikus nullával helyettesítettem (</w:t>
+          <w:iCs/>
+        </w:rPr>
+        <w:t>torch.float32</w:t>
+      </w:r>
+      <w:r>
+        <w:t xml:space="preserve">). A nyers adatok eredetileg kétdimenziós mátrixként, (Idő, Csatornák) felbontásban érkeztek – például a PTB-XL adatbázis esetén jellemzően 1000 időpillanattal és 12 csatornával (1000, 12). A MOMENT modell bemeneti rétege azonban egy háromdimenziós, (Batch, Csatornák, Idő) formátumú tenzort vár el. Ennek a szigorú bemeneti követelménynek a teljesítéséhez az adatmátrixot először transzponáltam majd egy új kiterjedést, egy úgynevezett </w:t>
+      </w:r>
+      <w:r>
+        <w:rPr>
+          <w:i/>
+        </w:rPr>
+        <w:t>batch</w:t>
+      </w:r>
+      <w:r>
+        <w:t xml:space="preserve"> dimenziót adtam hozzá a </w:t>
+      </w:r>
+      <w:r>
+        <w:rPr>
+          <w:b/>
+          <w:bCs/>
+        </w:rPr>
+        <w:t>PyTorch</w:t>
+      </w:r>
+      <w:r>
+        <w:t xml:space="preserve"> </w:t>
       </w:r>
       <w:r>
         <w:rPr>
           <w:rStyle w:val="SourceText"/>
           <w:rFonts w:ascii="Times New Roman" w:hAnsi="Times New Roman"/>
-        </w:rPr>
-        <w:t>np.nan_to_num</w:t>
-      </w:r>
-      <w:r>
-        <w:t xml:space="preserve">) a számítási hibák elkerülése miatt. </w:t>
+          <w:i/>
+          <w:iCs/>
+        </w:rPr>
+        <w:t>unsqueeze(0)</w:t>
+      </w:r>
+      <w:r>
+        <w:t xml:space="preserve"> függvényével. Ennek eredményeként az adatok felveszik a szükséges (1, 12, 1000) alakzatot. </w:t>
       </w:r>
     </w:p>
     <w:p>
@@ -6155,115 +6341,43 @@
         <w:pStyle w:val="BodyText"/>
         <w:spacing w:line="274" w:lineRule="auto"/>
       </w:pPr>
-      <w:bookmarkStart w:id="24" w:name="p-rc_99882a4b9c732835-68"/>
-      <w:bookmarkEnd w:id="24"/>
-      <w:r>
-        <w:t xml:space="preserve">Az adattisztítást a jellemzők skálázása követi. Ehhez a </w:t>
+      <w:bookmarkStart w:id="26" w:name="p-rc_99882a4b9c732835-70"/>
+      <w:bookmarkEnd w:id="26"/>
+      <w:r>
+        <w:t>A feldolgozás utolsó előkészítő lépéseként egy bemeneti maszkot (</w:t>
       </w:r>
       <w:r>
         <w:rPr>
           <w:rStyle w:val="SourceText"/>
           <w:rFonts w:ascii="Times New Roman" w:hAnsi="Times New Roman"/>
-        </w:rPr>
-        <w:t>scikit-learn</w:t>
-      </w:r>
-      <w:r>
-        <w:t xml:space="preserve"> könyvtár </w:t>
+          <w:i/>
+          <w:iCs/>
+        </w:rPr>
+        <w:t>input_mask</w:t>
+      </w:r>
+      <w:r>
+        <w:t>) generáltam a memóriában csupa egyes értékekből (</w:t>
       </w:r>
       <w:r>
         <w:rPr>
           <w:rStyle w:val="SourceText"/>
           <w:rFonts w:ascii="Times New Roman" w:hAnsi="Times New Roman"/>
-        </w:rPr>
-        <w:t>StandardScaler</w:t>
-      </w:r>
-      <w:r>
-        <w:t xml:space="preserve"> algoritmusát alkalmaztam. A standardizálás elengedhetetlen lépés a mélytanulási modellek stabilitása és megfelelő konvergenciája érdekében, mivel az egyes EKG csatornák (elvezetések) eltérő amplitúdókkal és statisztikai jellemzőkkel rendelkezhetnek. Az eljárás minden egyes jellemzőt nulla várható értékűre és egységnyi szórásúra, azaz normális eloszlásúra transzformál. </w:t>
-      </w:r>
-    </w:p>
-    <w:p>
-      <w:pPr>
-        <w:pStyle w:val="BodyText"/>
-        <w:spacing w:line="274" w:lineRule="auto"/>
-      </w:pPr>
-      <w:bookmarkStart w:id="25" w:name="p-rc_99882a4b9c732835-69"/>
-      <w:bookmarkEnd w:id="25"/>
-      <w:r>
-        <w:t>Mivel a MOMENT modell PyTorch keretrendszerre épül, a standardizált NumPy tömböket PyTorch tenzorokká (</w:t>
-      </w:r>
-      <w:r>
-        <w:rPr>
-          <w:rStyle w:val="SourceText"/>
-          <w:rFonts w:ascii="Times New Roman" w:hAnsi="Times New Roman"/>
-        </w:rPr>
-        <w:t>torch.tensor</w:t>
-      </w:r>
-      <w:r>
-        <w:t>) konvertáltam, méghozzá 32 bites lebegőpontos pontossággal (</w:t>
-      </w:r>
-      <w:r>
-        <w:rPr>
-          <w:rStyle w:val="SourceText"/>
-          <w:rFonts w:ascii="Times New Roman" w:hAnsi="Times New Roman"/>
-        </w:rPr>
-        <w:t>torch.float32</w:t>
-      </w:r>
-      <w:r>
-        <w:t xml:space="preserve">). A nyers adatok eredetileg kétdimenziós mátrixként, (Idő, Csatornák) felbontásban érkeztek – például a PTB-XL adatbázis esetén jellemzően 1000 időpillanattal és 12 csatornával (1000, 12). A MOMENT modell bemeneti rétege azonban egy háromdimenziós, (Batch, Csatornák, Idő) formátumú tenzort vár el. Ennek a szigorú bemeneti követelménynek a teljesítéséhez az adatmátrixot először transzponáltam majd egy új kiterjedést, </w:t>
-      </w:r>
-      <w:r>
-        <w:lastRenderedPageBreak/>
-        <w:t xml:space="preserve">egy úgynevezett </w:t>
-      </w:r>
-      <w:r>
-        <w:rPr>
           <w:i/>
-        </w:rPr>
-        <w:t>batch</w:t>
-      </w:r>
-      <w:r>
-        <w:t xml:space="preserve"> dimenziót adtam hozzá a PyTorch </w:t>
-      </w:r>
-      <w:r>
-        <w:rPr>
-          <w:rStyle w:val="SourceText"/>
-          <w:rFonts w:ascii="Times New Roman" w:hAnsi="Times New Roman"/>
-        </w:rPr>
-        <w:t>unsqueeze(0)</w:t>
-      </w:r>
-      <w:r>
-        <w:t xml:space="preserve"> függvényével. Ennek eredményeként az adatok felveszik a szükséges (1, 12, 1000) alakzatot. </w:t>
-      </w:r>
-    </w:p>
-    <w:p>
-      <w:pPr>
-        <w:pStyle w:val="BodyText"/>
-        <w:spacing w:line="274" w:lineRule="auto"/>
-      </w:pPr>
-      <w:bookmarkStart w:id="26" w:name="p-rc_99882a4b9c732835-70"/>
-      <w:bookmarkEnd w:id="26"/>
-      <w:r>
-        <w:t>A feldolgozás utolsó előkészítő lépéseként egy bemeneti maszkot (</w:t>
-      </w:r>
-      <w:r>
-        <w:rPr>
-          <w:rStyle w:val="SourceText"/>
-          <w:rFonts w:ascii="Times New Roman" w:hAnsi="Times New Roman"/>
-        </w:rPr>
-        <w:t>input_mask</w:t>
-      </w:r>
-      <w:r>
-        <w:t>) generáltam a memóriában csupa egyes értékekből (</w:t>
-      </w:r>
-      <w:r>
-        <w:rPr>
-          <w:rStyle w:val="SourceText"/>
-          <w:rFonts w:ascii="Times New Roman" w:hAnsi="Times New Roman"/>
+          <w:iCs/>
         </w:rPr>
         <w:t>torch.ones</w:t>
       </w:r>
       <w:r>
-        <w:t>), amely pontosan illeszkedik az adattenzor dimenzióihoz. Ez a maszk jelzi a Transformer architektúra önfigyelmi mechanizmusa (self-attention) számára, hogy a tenzor minden eleme valós és releváns adat, amelyet figyelembe kell venni a beágyazások (embeddingek) kiszámítása során. Abban az esetben ha valahol nulla értéket adtam volna meg, az azt jelentette volna a modellnek, hogy az az érték nem releváns, és nem kell figyelembe venni a jellemzőkinyerés folyamatban.</w:t>
+        <w:t xml:space="preserve">), amely pontosan illeszkedik az adattenzor dimenzióihoz. Ez a maszk jelzi a Transformer architektúra önfigyelmi </w:t>
+      </w:r>
+      <w:r>
+        <w:t xml:space="preserve"> (self-attention)</w:t>
+      </w:r>
+      <w:r>
+        <w:t xml:space="preserve"> </w:t>
+      </w:r>
+      <w:r>
+        <w:t>mechanizmusa számára, hogy a tenzor minden eleme valós és releváns adat, amelyet figyelembe kell venni a beágyazások (embeddingek) kiszámítása során. Abban az esetben ha valahol nulla értéket adtam volna meg, az azt jelentette volna a modellnek, hogy az az érték nem releváns, és nem kell figyelembe venni a jellemzőkinyerés folyamatban.</w:t>
       </w:r>
     </w:p>
     <w:p>
@@ -6289,7 +6403,9 @@
       </w:r>
       <w:r>
         <w:rPr>
-          <w:i/>
+          <w:b/>
+          <w:bCs/>
+          <w:iCs/>
         </w:rPr>
         <w:t>momentfm</w:t>
       </w:r>
@@ -6318,6 +6434,8 @@
         <w:rPr>
           <w:rStyle w:val="SourceText"/>
           <w:rFonts w:ascii="Times New Roman" w:hAnsi="Times New Roman"/>
+          <w:i/>
+          <w:iCs/>
         </w:rPr>
         <w:t>model.to(device)</w:t>
       </w:r>
@@ -6330,6 +6448,7 @@
         <w:pStyle w:val="BodyText"/>
       </w:pPr>
       <w:r>
+        <w:lastRenderedPageBreak/>
         <w:t>A kísérlet során kritikus szempont volt, hogy a modell ne tanuljon tovább, hanem fix jellemzőkinyerőként működjön, ezért a hálózatot kiértékelő (</w:t>
       </w:r>
       <w:r>
@@ -6408,7 +6527,6 @@
           <w:b/>
           <w:bCs/>
         </w:rPr>
-        <w:lastRenderedPageBreak/>
         <w:t>Alapeset</w:t>
       </w:r>
       <w:r>
@@ -6503,6 +6621,7 @@
         <w:pStyle w:val="BodyText"/>
       </w:pPr>
       <w:r>
+        <w:lastRenderedPageBreak/>
         <w:t>A MOMENT-1-large modell használata során a szűk keresztmetszetet a videomemória (VRAM) véges kapacitása jelentette. Annak érdekében, hogy elkerüljem a kritikus memóriatúlcsordulási hibákat (</w:t>
       </w:r>
       <w:r>
@@ -6598,7 +6717,13 @@
         <w:pStyle w:val="BodyText"/>
       </w:pPr>
       <w:r>
-        <w:t xml:space="preserve">Az inferencia eredményén elvégzett trnaszformációk következtében minden egyes méréshez egy 1024 dimenziójú kimeneti vektort kaptam. Ezek a sűrű, absztrakt reprezentációkat az </w:t>
+        <w:t>Az inferencia eredményén elvégzett trnaszformációk következtében minden egyes méréshez egy 1024 dimenziójú kimeneti vektort kaptam. Ezek</w:t>
+      </w:r>
+      <w:r>
+        <w:t>et</w:t>
+      </w:r>
+      <w:r>
+        <w:t xml:space="preserve"> a sűrű, absztrakt reprezentációkat az </w:t>
       </w:r>
       <w:r>
         <w:rPr>
@@ -6650,17 +6775,31 @@
         <w:pStyle w:val="BodyText"/>
       </w:pPr>
       <w:r>
+        <w:t>A kísérleti folyamatot egy szisztematikus, több lépcsőből álló folyamat szerint építettem fel. Első lépésként egy alapvonal (baseline) kísérletet végeztem a klasszikus K-Means algoritmus segítségével, hogy referenciapontot kapjak a klaszterezési metrikák (Sziluett-pontszám, ARI, NMI) tekintetében. Mivel azonban a felügyelet nélküli tanulás sikere nagyban függ az adatok belső struktúrájától, elengedhetetlennek tartottam a beágyazások minőségének validálását is. Ezt a validációt felügyelt tanulási algoritmusokkal (Logisztikus Regresszió és Random Forest) végeztem el. Úgy tekintettem ezekre a modellekre, mint a beágyazó tér „információtartalmának mérőeszközeire”: ha egy felügyelt modell képes nagy pontossággal elkülöníteni a diagnosztikai osztályokat, az bizonyítja, hogy a klaszterezési nehézségek nem a jellemzőkinyerési folyamat sikertelenségéből, hanem az algoritmusok paraméterezéséből, az adatok nem megfelelő, nem tiszta klaszterekbe való elkülönéséből, vagy a dimenziók átkából fakadhatnak.</w:t>
+      </w:r>
+    </w:p>
+    <w:p>
+      <w:pPr>
+        <w:pStyle w:val="BodyText"/>
+      </w:pPr>
+      <w:r>
+        <w:t>A kezdeti eredmények alapján a kísérleteket kiterjesztettem modernebb, sűrűségalapú megközelítésekre (DBSCAN, HDBSCAN), valamint vizsgáltam a dimenziócsökkentés (PCA, UMAP) és a normalizáció hatását a szétválasztható csoportok kialakulására. Külön figyelmet fordítottam az adathalmaz egyenetlen eloszlására, ezért a teljes adathalmazon végzett mérések mellett kiegyensúlyozott (balanced) almintákon is lefuttattam a használt algoritmusokat, és modelleket. Végezetül a merev klaszterhatárok feloldása érdekében valószínűségi modellezéssel (GMM) és mély beágyazott klaszterezéssel (DEC) próbáltam optimalizálni az eredményeket, keresve azt a konfigurációt, amely a leginkább fedi a klinikai valóságot.</w:t>
+      </w:r>
+      <w:r>
+        <w:t xml:space="preserve"> </w:t>
+      </w:r>
+      <w:r>
+        <w:t xml:space="preserve">A </w:t>
+      </w:r>
+      <w:r>
         <w:lastRenderedPageBreak/>
-        <w:t>A kísérleti folyamatot egy szisztematikus, több lépcsőből álló folyamat szerint építettem fel. Első lépésként egy alapvonal (baseline) kísérletet végeztem a klasszikus K-Means algoritmus segítségével, hogy referenciapontot kapjak a klaszterezési metrikák (Sziluett-pontszám, ARI, NMI) tekintetében. Mivel azonban a felügyelet nélküli tanulás sikere nagyban függ az adatok belső struktúrájától, elengedhetetlennek tartottam a beágyazások minőségének validálását is. Ezt a validációt felügyelt tanulási algoritmusokkal (Logisztikus Regresszió és Random Forest) végeztem el. Úgy tekintettem ezekre a modellekre, mint a beágyazó tér „információtartalmának mérőeszközeire”: ha egy felügyelt modell képes nagy pontossággal elkülöníteni a diagnosztikai osztályokat, az bizonyítja, hogy a klaszterezési nehézségek nem a jellemzőkinyerési folyamat sikertelenségéből, hanem az algoritmusok paraméterezéséből, az adatok nem megfelelő, nem tiszta klaszterekbe való elkülönéséből, vagy a dimenziók átkából fakadhatnak.</w:t>
-      </w:r>
-    </w:p>
-    <w:p>
-      <w:pPr>
-        <w:pStyle w:val="BodyText"/>
-      </w:pPr>
-      <w:r>
-        <w:t>A kezdeti eredmények alapján a kísérleteket kiterjesztettem modernebb, sűrűségalapú megközelítésekre (DBSCAN, HDBSCAN), valamint vizsgáltam a dimenziócsökkentés (PCA, UMAP) és a normalizáció hatását a szétválasztható csoportok kialakulására. Külön figyelmet fordítottam az adathalmaz egyenetlen eloszlására, ezért a teljes adathalmazon végzett mérések mellett kiegyensúlyozott (balanced) almintákon is lefuttattam a használt algoritmusokat, és modelleket. Végezetül a merev klaszterhatárok feloldása érdekében valószínűségi modellezéssel (GMM) és mély beágyazott klaszterezéssel (DEC) próbáltam optimalizálni az eredményeket, keresve azt a konfigurációt, amely a leginkább fedi a klinikai valóságot.</w:t>
-      </w:r>
+        <w:t>felügyelt és felügyelet nélküli klaszterezési kísérletek teljes kódja a repozitórium /pipeline_scripts/data_classification/ mappájában található. Az egyes módszerek részletes bemutatásakor pontosan hivatkozom majd a vonatkozó fájlokra.</w:t>
+      </w:r>
+    </w:p>
+    <w:p>
+      <w:pPr>
+        <w:pStyle w:val="BodyText"/>
+      </w:pPr>
     </w:p>
     <w:p>
       <w:pPr>
@@ -6802,7 +6941,6 @@
         <w:rPr>
           <w:b/>
         </w:rPr>
-        <w:lastRenderedPageBreak/>
         <w:t>Silhouette Score:</w:t>
       </w:r>
       <w:r>
@@ -6863,6 +7001,15 @@
       <w:r>
         <w:t>Az így kapott eredmények és a baseline kísérlet kiértékelése a 4. fejezetben kerülnek bemutatásra.</w:t>
       </w:r>
+      <w:r>
+        <w:t xml:space="preserve"> (</w:t>
+      </w:r>
+      <w:r>
+        <w:t>/pipeline_scripts/data_classification/</w:t>
+      </w:r>
+      <w:r>
+        <w:t>data_clustering.ipynb)</w:t>
+      </w:r>
     </w:p>
     <w:p>
       <w:pPr>
@@ -6891,7 +7038,11 @@
         <w:pStyle w:val="BodyText"/>
       </w:pPr>
       <w:r>
-        <w:t>A K-Means algoritmus kezdeti gyenge teljesítménye (amelyet a 4. fejezetben részletezek) kritikus döntési pont elé állított a kutatásom során. Felmerült bennem a kérdés, hogy a MOMENT modell által generált 1024 dimenziós beágyazások egyáltalán tartalmaznak-e elegendő klinikai információt a betegségek elkülönítéséhez. Tisztában voltam vele, hogy amennyiben a beágyazások nem reprezentálják megfelelően az EKG jelek sajátosságait, a kutatásom további része – a felügyelet nélküli klaszterezés finomhangolása – értelmetlenné válik, amennyiben nem tudtam volna megoldani, hogy a MOMENT valóban tanulható reprezentációkat tudjon előállítani. Emiatt egy felügyelt tanulási (</w:t>
+        <w:t xml:space="preserve">A K-Means algoritmus kezdeti gyenge teljesítménye (amelyet a 4. fejezetben részletezek) kritikus döntési pont elé állított a kutatásom során. Felmerült bennem a kérdés, hogy a </w:t>
+      </w:r>
+      <w:r>
+        <w:lastRenderedPageBreak/>
+        <w:t>MOMENT modell által generált 1024 dimenziós beágyazások egyáltalán tartalmaznak-e elegendő klinikai információt a betegségek elkülönítéséhez. Tisztában voltam vele, hogy amennyiben a beágyazások nem reprezentálják megfelelően az EKG jelek sajátosságait, a kutatásom további része – a felügyelet nélküli klaszterezés finomhangolása – értelmetlenné válik, amennyiben nem tudtam volna megoldani, hogy a MOMENT valóban tanulható reprezentációkat tudjon előállítani. Emiatt egy felügyelt tanulási (</w:t>
       </w:r>
       <w:r>
         <w:rPr>
@@ -6922,6 +7073,7 @@
       <w:r>
         <w:rPr>
           <w:rStyle w:val="SourceText"/>
+          <w:rFonts w:ascii="Times New Roman" w:hAnsi="Times New Roman" w:cs="Times New Roman"/>
         </w:rPr>
         <w:t>train_test_split</w:t>
       </w:r>
@@ -7013,143 +7165,158 @@
         <w:t>Recall</w:t>
       </w:r>
       <w:r>
-        <w:t xml:space="preserve">) határoztam meg fő metrikákként, amelyeket könnyen a Scikit-learn könyvtár classification_report függvényével ki tudtam </w:t>
-      </w:r>
+        <w:t>) határoztam meg fő metrikákként, amelyeket könnyen a Scikit-learn könyvtár classification_report függvényével ki tudtam számolni. Úgy véltem, ezek a mutatók fogják valódi pontossággal megmutatni, hogy a MOMENT modell képes-e a ritka diagnosztikai mintázatokat is sűrített formában megőrizni.</w:t>
+      </w:r>
+    </w:p>
+    <w:p>
+      <w:pPr>
+        <w:pStyle w:val="BodyText"/>
+      </w:pPr>
+      <w:r>
+        <w:t>Ez a validációs lépés szolgált alapul a további munkámhoz. Úgy tekintettem rá, mint egy biztosítékra: ha a felügyelt modellek képesek sikeresen tanulni ezekből a vektorokból, akkor igazoltnak látom a beágyazások minőségét, és folytathatom a kísérleteket a sűrűségalapú és valószínűségi klaszterező modellek irányába.</w:t>
+      </w:r>
+      <w:r>
+        <w:t xml:space="preserve"> (</w:t>
+      </w:r>
+      <w:r>
+        <w:t>/pipeline_scripts/data_classification/</w:t>
+      </w:r>
+      <w:r>
+        <w:t>data_cl</w:t>
+      </w:r>
+      <w:r>
+        <w:t>assification</w:t>
+      </w:r>
+      <w:r>
+        <w:t>.ipynb)</w:t>
+      </w:r>
+    </w:p>
+    <w:p>
+      <w:pPr>
+        <w:pStyle w:val="Heading3"/>
+      </w:pPr>
+      <w:bookmarkStart w:id="32" w:name="_Toc230163370"/>
+      <w:r>
+        <w:t>2.</w:t>
+      </w:r>
+      <w:r>
+        <w:t>4</w:t>
+      </w:r>
+      <w:r>
+        <w:t>.3. Sűrűségalapú megközelítés</w:t>
+      </w:r>
+      <w:bookmarkEnd w:id="32"/>
+    </w:p>
+    <w:p>
+      <w:pPr>
+        <w:pStyle w:val="BodyText"/>
+      </w:pPr>
+      <w:r>
+        <w:t>A K-Means algoritmus távolságalapú megközelítésének metodikai korlátai miatt a kutatásomat a sűrűségalapú (</w:t>
+      </w:r>
+      <w:r>
+        <w:rPr>
+          <w:i/>
+        </w:rPr>
+        <w:t>density-based</w:t>
+      </w:r>
+      <w:r>
+        <w:t>) klaszterező eljárások irányába folytattam. Ezek az algoritmusok – ellentétben a K-Means-szel – elméletben nem feltételeznek rögzített, gömbszimmetrikus klaszterformát, képesek az adatok közötti folytonos átmenetek kezelésére, valamint a kiugró értékek (anomáliák) zajként (</w:t>
+      </w:r>
+      <w:r>
+        <w:rPr>
+          <w:i/>
+        </w:rPr>
+        <w:t>noise</w:t>
+      </w:r>
+      <w:r>
+        <w:t>) történő azonosítására.</w:t>
+      </w:r>
+    </w:p>
+    <w:p>
+      <w:pPr>
+        <w:pStyle w:val="BodyText"/>
+      </w:pPr>
       <w:r>
         <w:lastRenderedPageBreak/>
-        <w:t>számolni. Úgy véltem, ezek a mutatók fogják valódi pontossággal megmutatni, hogy a MOMENT modell képes-e a ritka diagnosztikai mintázatokat is sűrített formában megőrizni.</w:t>
-      </w:r>
-    </w:p>
-    <w:p>
-      <w:pPr>
-        <w:pStyle w:val="BodyText"/>
-      </w:pPr>
-      <w:r>
-        <w:t>Ez a validációs lépés szolgált alapul a további munkámhoz. Úgy tekintettem rá, mint egy biztosítékra: ha a felügyelt modellek képesek sikeresen tanulni ezekből a vektorokból, akkor igazoltnak látom a beágyazások minőségét, és folytathatom a kísérleteket a sűrűségalapú és valószínűségi klaszterező modellek irányába.</w:t>
-      </w:r>
-    </w:p>
-    <w:p>
-      <w:pPr>
-        <w:pStyle w:val="Heading3"/>
-      </w:pPr>
-      <w:bookmarkStart w:id="32" w:name="_Toc230163370"/>
-      <w:r>
-        <w:t>2.</w:t>
-      </w:r>
-      <w:r>
-        <w:t>4</w:t>
-      </w:r>
-      <w:r>
-        <w:t>.3. Sűrűségalapú megközelítés</w:t>
-      </w:r>
-      <w:bookmarkEnd w:id="32"/>
-    </w:p>
-    <w:p>
-      <w:pPr>
-        <w:pStyle w:val="BodyText"/>
-      </w:pPr>
-      <w:r>
-        <w:t>A K-Means algoritmus távolságalapú megközelítésének metodikai korlátai miatt a kutatásomat a sűrűségalapú (</w:t>
+        <w:t>Első kísérletként a hagyományos DBSCAN (</w:t>
       </w:r>
       <w:r>
         <w:rPr>
           <w:i/>
         </w:rPr>
-        <w:t>density-based</w:t>
-      </w:r>
-      <w:r>
-        <w:t>) klaszterező eljárások irányába folytattam. Ezek az algoritmusok – ellentétben a K-Means-szel – elméletben nem feltételeznek rögzített, gömbszimmetrikus klaszterformát, képesek az adatok közötti folytonos átmenetek kezelésére, valamint a kiugró értékek (anomáliák) zajként (</w:t>
+        <w:t>Density-Based Spatial Clustering of Applications with Noise</w:t>
+      </w:r>
+      <w:r>
+        <w:t xml:space="preserve">) algoritmust alkalmaztam közvetlenül az 1024 dimenziós beágyazási téren. A kísérleti beállítások során az algoritmus legfontosabb hiperparaméterét, az </w:t>
+      </w:r>
+      <w:r>
+        <w:rPr>
+          <w:rStyle w:val="SourceText"/>
+          <w:rFonts w:ascii="Times New Roman" w:hAnsi="Times New Roman" w:cs="Times New Roman"/>
+        </w:rPr>
+        <w:t>eps</w:t>
+      </w:r>
+      <w:r>
+        <w:t xml:space="preserve"> (a klaszterezéshez vizsgált környezet sugara) távolságot egy rácskeresés (</w:t>
       </w:r>
       <w:r>
         <w:rPr>
           <w:i/>
         </w:rPr>
-        <w:t>noise</w:t>
-      </w:r>
-      <w:r>
-        <w:t>) történő azonosítására.</w:t>
-      </w:r>
-    </w:p>
-    <w:p>
-      <w:pPr>
-        <w:pStyle w:val="BodyText"/>
-      </w:pPr>
-      <w:r>
-        <w:t>Első kísérletként a hagyományos DBSCAN (</w:t>
+        <w:t>grid search</w:t>
+      </w:r>
+      <w:r>
+        <w:t>) keretében 5,0 és 50,0 közötti tartományban variáltam. Célom az volt, hogy azonosítsam a magas dimenziójú térben azt a sűrűségi küszöböt, amely mentén az orvosi diagnózisok elválnak egymástól.</w:t>
+      </w:r>
+    </w:p>
+    <w:p>
+      <w:pPr>
+        <w:pStyle w:val="BodyText"/>
+      </w:pPr>
+      <w:r>
+        <w:t>Mivel a magas dimenziószám (a „dimenziók átka”) miatt a sűrűségalapú távolságmérés veszít a hatékonyságából, a folyamatba integráltam egy dimenziócsökkentési lépést. A kezdeti, lineáris PCA transzformációkat követően egy fejlettebb, nemlineáris eljárást, az UMAP-ot (</w:t>
       </w:r>
       <w:r>
         <w:rPr>
           <w:i/>
         </w:rPr>
-        <w:t>Density-Based Spatial Clustering of Applications with Noise</w:t>
-      </w:r>
-      <w:r>
-        <w:t xml:space="preserve">) algoritmust alkalmaztam közvetlenül az 1024 dimenziós beágyazási téren. A kísérleti beállítások során az algoritmus legfontosabb hiperparaméterét, az </w:t>
+        <w:t>Uniform Manifold Approximation and Projection</w:t>
+      </w:r>
+      <w:r>
+        <w:t>) alkalmaztam. Ennek az algoritmusnak a kiválasztását az indokolta, hogy a transzformáció során a globális struktúrák mellett képes megőrizni az adatok lokális topológiai viszonyait is. Az UMAP segítségével a 1024 dimenziós beágyazásokat egy nagyságrendekkel kisebb, 10–15 dimenziós térbe sűrítettem.</w:t>
+      </w:r>
+    </w:p>
+    <w:p>
+      <w:pPr>
+        <w:pStyle w:val="BodyText"/>
+      </w:pPr>
+      <w:r>
+        <w:t>A dimenziócsökkentett adatokon a fejlettebb HDBSCAN (</w:t>
+      </w:r>
+      <w:r>
+        <w:rPr>
+          <w:i/>
+        </w:rPr>
+        <w:t>Hierarchical DBSCAN</w:t>
+      </w:r>
+      <w:r>
+        <w:t>) algoritmust alkalmaztam, amely hierarchikus megközelítésének köszönhetően kevésbé érzékeny a globális sűrűségi paraméterekre, mint a sima DBSCAN. Az optimális konfiguráció megtalálása érdekében egy kiterjesztett, 576 kombinációból álló hiperparaméter-keresést hajtottam végre. A keresés során egyidejűleg optimalizáltam az UMAP dimenziócsökkentő paramétereit (például a szomszédok számát és a minimális távolságot), valamint a HDBSCAN klaszterezési paramétereit (</w:t>
       </w:r>
       <w:r>
         <w:rPr>
           <w:rStyle w:val="SourceText"/>
-        </w:rPr>
-        <w:t>eps</w:t>
-      </w:r>
-      <w:r>
-        <w:t xml:space="preserve"> (a klaszterezéshez vizsgált környezet sugara) távolságot egy rácskeresés (</w:t>
-      </w:r>
-      <w:r>
-        <w:rPr>
-          <w:i/>
-        </w:rPr>
-        <w:t>grid search</w:t>
-      </w:r>
-      <w:r>
-        <w:t>) keretében 5,0 és 50,0 közötti tartományban variáltam. Célom az volt, hogy azonosítsam a magas dimenziójú térben azt a sűrűségi küszöböt, amely mentén az orvosi diagnózisok elválnak egymástól.</w:t>
-      </w:r>
-    </w:p>
-    <w:p>
-      <w:pPr>
-        <w:pStyle w:val="BodyText"/>
-      </w:pPr>
-      <w:r>
-        <w:t>Mivel a magas dimenziószám (a „dimenziók átka”) miatt a sűrűségalapú távolságmérés veszít a hatékonyságából, a folyamatba integráltam egy dimenziócsökkentési lépést. A kezdeti, lineáris PCA transzformációkat követően egy fejlettebb, nemlineáris eljárást, az UMAP-ot (</w:t>
-      </w:r>
-      <w:r>
-        <w:rPr>
-          <w:i/>
-        </w:rPr>
-        <w:t>Uniform Manifold Approximation and Projection</w:t>
-      </w:r>
-      <w:r>
-        <w:t>) alkalmaztam. Ennek az algoritmusnak a kiválasztását az indokolta, hogy a transzformáció során a globális struktúrák mellett képes megőrizni az adatok lokális topológiai viszonyait is. Az UMAP segítségével a 1024 dimenziós beágyazásokat egy nagyságrendekkel kisebb, 10–15 dimenziós térbe sűrítettem.</w:t>
-      </w:r>
-    </w:p>
-    <w:p>
-      <w:pPr>
-        <w:pStyle w:val="BodyText"/>
-      </w:pPr>
-      <w:r>
-        <w:t>A dimenziócsökkentett adatokon a fejlettebb HDBSCAN (</w:t>
-      </w:r>
-      <w:r>
-        <w:rPr>
-          <w:i/>
-        </w:rPr>
-        <w:t>Hierarchical DBSCAN</w:t>
-      </w:r>
-      <w:r>
-        <w:t>) algoritmust alkalmaztam, amely hierarchikus megközelítésének köszönhetően kevésbé érzékeny a globális sűrűségi paraméterekre, mint a sima DBSCAN. Az optimális konfiguráció megtalálása érdekében egy kiterjesztett, 576 kombinációból álló hiperparaméter-keresést hajtottam végre. A keresés során egyidejűleg optimalizáltam az UMAP dimenziócsökkentő paramétereit (például a szomszédok számát és a minimális távolságot), valamint a HDBSCAN klaszterezési paramétereit (</w:t>
+          <w:rFonts w:ascii="Times New Roman" w:hAnsi="Times New Roman" w:cs="Times New Roman"/>
+        </w:rPr>
+        <w:t>min_cluster_size</w:t>
+      </w:r>
+      <w:r>
+        <w:t xml:space="preserve">, </w:t>
       </w:r>
       <w:r>
         <w:rPr>
           <w:rStyle w:val="SourceText"/>
-        </w:rPr>
-        <w:t>min_cluster_size</w:t>
-      </w:r>
-      <w:r>
-        <w:t xml:space="preserve">, </w:t>
-      </w:r>
-      <w:r>
-        <w:rPr>
-          <w:rStyle w:val="SourceText"/>
+          <w:rFonts w:ascii="Times New Roman" w:hAnsi="Times New Roman" w:cs="Times New Roman"/>
         </w:rPr>
         <w:t>min_samples</w:t>
       </w:r>
@@ -7190,7 +7357,6 @@
         <w:rPr>
           <w:b/>
         </w:rPr>
-        <w:lastRenderedPageBreak/>
         <w:t>MAX_NOISE_RATIO (0.30):</w:t>
       </w:r>
       <w:r>
@@ -7222,12 +7388,42 @@
     <w:p>
       <w:pPr>
         <w:pStyle w:val="BodyText"/>
-      </w:pPr>
-      <w:r>
-        <w:rPr>
-          <w:i/>
-        </w:rPr>
-        <w:t>(Ezekkel a beállításokkal elért klaszterezési metrikák, a dimenziók átkának gyakorlati megnyilvánulásai, valamint a beágyazási tér folytonosságára vonatkozó konklúziók a 4. fejezetben kerülnek részletes bemutatásra.)</w:t>
+        <w:tabs>
+          <w:tab w:val="left" w:pos="0"/>
+        </w:tabs>
+      </w:pPr>
+      <w:r>
+        <w:t>(</w:t>
+      </w:r>
+      <w:r>
+        <w:t>/pipeline_scripts/data_classification/</w:t>
+      </w:r>
+      <w:r>
+        <w:t>data_clustering</w:t>
+      </w:r>
+      <w:r>
+        <w:t>_dbscan</w:t>
+      </w:r>
+      <w:r>
+        <w:t>.ipynb</w:t>
+      </w:r>
+      <w:r>
+        <w:t xml:space="preserve">, </w:t>
+      </w:r>
+      <w:r>
+        <w:t>(</w:t>
+      </w:r>
+      <w:r>
+        <w:t>/pipeline_scripts/data_classification/</w:t>
+      </w:r>
+      <w:r>
+        <w:t>data_clustering</w:t>
+      </w:r>
+      <w:r>
+        <w:t>_umap_hdbscan</w:t>
+      </w:r>
+      <w:r>
+        <w:t>.ipynb))</w:t>
       </w:r>
     </w:p>
     <w:p>
@@ -7270,6 +7466,7 @@
         <w:rPr>
           <w:rFonts w:ascii="Times New Roman" w:eastAsia="Times New Roman" w:hAnsi="Times New Roman" w:cs="Times New Roman"/>
         </w:rPr>
+        <w:lastRenderedPageBreak/>
         <w:t>Alapbeállítások és a konfigurációs blokk kialakítása</w:t>
       </w:r>
     </w:p>
@@ -7356,11 +7553,7 @@
         <w:pStyle w:val="BodyText"/>
       </w:pPr>
       <w:r>
-        <w:t xml:space="preserve">Bár a felügyelet nélküli tanulás (unsupervised learning) során az algoritmusok nem használják fel a címkéket a tanuláshoz, az adatok eloszlásának sűrűsége drámai hatással van az eredményre. </w:t>
-      </w:r>
-      <w:r>
-        <w:lastRenderedPageBreak/>
-        <w:t>A sűrűségalapú klaszterező algoritmusok, mint amilyen a HDBSCAN is, az erősen alulreprezentált osztályokat hajlamosak pusztán izolált, alacsony denzitású zajként (noise) értelmezni és eldobni, vagy ami még rosszabb: egyszerűen beolvasztani őket a masszívan domináns osztályok kiterjedt klasztereibe. Annak érdekében, hogy a modellek a ritkább betegségtípusok rejtett mintázatait (manifold) is eséllyel észrevegyék, a kiegyensúlyozatlan adathalmazon történő futtatások mellett elengedhetetlenné vált egy mesterségesen kiegyensúlyozott adathalmaz (Balanced Dataset) megalkotása.</w:t>
+        <w:t>Bár a felügyelet nélküli tanulás (unsupervised learning) során az algoritmusok nem használják fel a címkéket a tanuláshoz, az adatok eloszlásának sűrűsége drámai hatással van az eredményre. A sűrűségalapú klaszterező algoritmusok, mint amilyen a HDBSCAN is, az erősen alulreprezentált osztályokat hajlamosak pusztán izolált, alacsony denzitású zajként (noise) értelmezni és eldobni, vagy ami még rosszabb: egyszerűen beolvasztani őket a masszívan domináns osztályok kiterjedt klasztereibe. Annak érdekében, hogy a modellek a ritkább betegségtípusok rejtett mintázatait (manifold) is eséllyel észrevegyék, a kiegyensúlyozatlan adathalmazon történő futtatások mellett elengedhetetlenné vált egy mesterségesen kiegyensúlyozott adathalmaz (Balanced Dataset) megalkotása.</w:t>
       </w:r>
     </w:p>
     <w:p>
@@ -7386,7 +7579,11 @@
         <w:pStyle w:val="BodyText"/>
       </w:pPr>
       <w:r>
-        <w:t xml:space="preserve">A mintavételezést követően az adatok megfelelő matematikai reprezentációjának kialakítása következett. Mivel a dimenziócsökkentéshez használt UMAP jellemzően koszinusz-távolságot (cosine distance), a HDBSCAN pedig euklideszi távolságot (euclidean distance) használ, a bemeneti tér skálázása elengedhetetlen volt. A jellemzőket (features) először egy </w:t>
+        <w:t xml:space="preserve">A mintavételezést követően az adatok megfelelő matematikai reprezentációjának kialakítása következett. Mivel a dimenziócsökkentéshez használt UMAP jellemzően koszinusz-távolságot </w:t>
+      </w:r>
+      <w:r>
+        <w:lastRenderedPageBreak/>
+        <w:t xml:space="preserve">(cosine distance), a HDBSCAN pedig euklideszi távolságot (euclidean distance) használ, a bemeneti tér skálázása elengedhetetlen volt. A jellemzőket (features) először egy </w:t>
       </w:r>
       <w:r>
         <w:rPr>
@@ -7553,7 +7750,6 @@
       </w:pPr>
       <w:bookmarkStart w:id="34" w:name="_Toc230163372"/>
       <w:r>
-        <w:lastRenderedPageBreak/>
         <w:t>2.</w:t>
       </w:r>
       <w:r>
@@ -7700,7 +7896,11 @@
         <w:t>noise_ratio</w:t>
       </w:r>
       <w:r>
-        <w:t xml:space="preserve">). Ha a modell átlépi a konfigurációban megadott zaj-limitet (pl. túl sok a zaj), vagy nem találja meg a minimálisan elvárt klaszterszámot (esetleg túl sokat talál), a függvény azonnal egy </w:t>
+        <w:t xml:space="preserve">). Ha a modell átlépi a konfigurációban megadott zaj-limitet (pl. túl sok a zaj), vagy </w:t>
+      </w:r>
+      <w:r>
+        <w:lastRenderedPageBreak/>
+        <w:t xml:space="preserve">nem találja meg a minimálisan elvárt klaszterszámot (esetleg túl sokat talál), a függvény azonnal egy </w:t>
       </w:r>
       <w:r>
         <w:rPr>
@@ -7838,11 +8038,7 @@
         <w:t>evaluate_final_model</w:t>
       </w:r>
       <w:r>
-        <w:t xml:space="preserve"> nevű </w:t>
-      </w:r>
-      <w:r>
-        <w:lastRenderedPageBreak/>
-        <w:t>egyedi kiértékelő függvényt, amely bemenetként a valós osztálycímkéket (</w:t>
+        <w:t xml:space="preserve"> nevű egyedi kiértékelő függvényt, amely bemenetként a valós osztálycímkéket (</w:t>
       </w:r>
       <w:r>
         <w:rPr>
@@ -7926,6 +8122,7 @@
         <w:pStyle w:val="BodyText"/>
       </w:pPr>
       <w:r>
+        <w:lastRenderedPageBreak/>
         <w:t>A függvény legösszetetteb lépése, az úgynevezett Klaszter Tisztaság (Cluster Purity Accuracy) kiszámítása volt. Mivel a felügyelet nélküli tanulás során a modellek nem a valós címkék (pl. betegségnevek) alapján prediktálnak, a hagyományos pontosság (accuracy) közvetlenül nem értelmezhető.</w:t>
       </w:r>
     </w:p>
@@ -7993,6 +8190,24 @@
       </w:r>
       <w:r>
         <w:t xml:space="preserve"> függvényt (szigorúan csak a valid pontokra szűrve). Ez a metrika végeredményben azt az értéket mutatta meg számomra, hogy ha minden egyes talált klasztert a benne lévő leggyakoribb betegséggel azonosítanék, akkor a zajmentes adatpontok hány százalékát diagnosztizálnám helyesen. A robusztus működés érdekében a függvényt elláttam egy hibakezelő (edge-case) ággal is, amely figyelmeztetést dob, ha a modell egyetlen valid klasztert sem talál, és mindent zajként azonosít.</w:t>
+      </w:r>
+      <w:r>
+        <w:t xml:space="preserve"> </w:t>
+      </w:r>
+      <w:r>
+        <w:t>(</w:t>
+      </w:r>
+      <w:r>
+        <w:t>/pipeline_scripts/data_classification/</w:t>
+      </w:r>
+      <w:r>
+        <w:t>data_clustering</w:t>
+      </w:r>
+      <w:r>
+        <w:t>_umap_hdbscan_balanced</w:t>
+      </w:r>
+      <w:r>
+        <w:t>.ipynb)</w:t>
       </w:r>
     </w:p>
     <w:p>
@@ -8026,6 +8241,27 @@
       <w:r>
         <w:t>A hagyományos és sűrűségalapú gépi tanulási kísérletek rávilágítottak arra, hogy az osztályok közötti geometriai átfedések miatt a beágyazási tér további, célzott finomhangolására (fine-tuning) van szükség. Ennek megvalósítására a mélytanulás alapú klaszterezés (Deep Clustering) felé fordultam, megvizsgálva a DEC (Deep Embedding Clustering) és az IDEC (Improved Deep Embedding Clustering) architektúrákat.</w:t>
       </w:r>
+      <w:r>
+        <w:t xml:space="preserve"> Az ebben a fejezetben leírtak a repozitórium </w:t>
+      </w:r>
+      <w:r>
+        <w:t xml:space="preserve"> </w:t>
+      </w:r>
+      <w:r>
+        <w:t>/pipeline_scripts/data_classification/</w:t>
+      </w:r>
+      <w:r>
+        <w:t>data_clustering</w:t>
+      </w:r>
+      <w:r>
+        <w:t>_dec</w:t>
+      </w:r>
+      <w:r>
+        <w:t>.ipynb</w:t>
+      </w:r>
+      <w:r>
+        <w:t xml:space="preserve"> fájljában található.</w:t>
+      </w:r>
     </w:p>
     <w:p>
       <w:pPr>
@@ -8033,38 +8269,38 @@
       </w:pPr>
       <w:bookmarkStart w:id="38" w:name="_Toc230163374"/>
       <w:r>
+        <w:t>2.</w:t>
+      </w:r>
+      <w:r>
+        <w:t>5</w:t>
+      </w:r>
+      <w:r>
+        <w:t>.1. Adatelőkészítés és az Autoencoder felépítése</w:t>
+      </w:r>
+      <w:bookmarkEnd w:id="38"/>
+    </w:p>
+    <w:p>
+      <w:pPr>
+        <w:pStyle w:val="BodyText"/>
+      </w:pPr>
+      <w:r>
+        <w:t>A korábbi tapasztalatokra építve a tanítási folyamathoz a többségi osztályok torzító hatásának elkerülése érdekében a feladatmegoldásnak ebben a részében csak a teljesen kiegyensúlyozott (balanced) adatsort használtam. A NORM, MI, STTC, CD és HYP osztályok mindegyikéből pontosan 536 mintát választottam ki véletlenszerűen, így egy 2680 elemből álló, standardizált (StandardScaler) bemeneti tenzort hoztam létre.</w:t>
+      </w:r>
+    </w:p>
+    <w:p>
+      <w:pPr>
+        <w:pStyle w:val="BodyText"/>
+      </w:pPr>
+      <w:r>
+        <w:t>A DEC és IDEC modellek alapját egy mély alulkomplett autoencoder (Undercomplete Autoencoder) képezi, amelynek feladata a 1024 dimenziós MOMENT beágyazások további tömörítése egy 10 dimenziós látens térbe, ezzel a tömörítési ráta 102,4-szeres. Az Encoder (kódoló) rétegei a következőképpen épültek fel: 1024 -&gt; 500 -&gt; 100 -&gt; 10 neuron. A nemlineáris reprezentációk tanulása érdekében ReLU aktivációs függvényeket, az eltolódások elkerülésére pedig BatchNorm1d rétegeket alkalmaztam.</w:t>
+      </w:r>
+    </w:p>
+    <w:p>
+      <w:pPr>
+        <w:pStyle w:val="BodyText"/>
+      </w:pPr>
+      <w:r>
         <w:lastRenderedPageBreak/>
-        <w:t>2.</w:t>
-      </w:r>
-      <w:r>
-        <w:t>5</w:t>
-      </w:r>
-      <w:r>
-        <w:t>.1. Adatelőkészítés és az Autoencoder felépítése</w:t>
-      </w:r>
-      <w:bookmarkEnd w:id="38"/>
-    </w:p>
-    <w:p>
-      <w:pPr>
-        <w:pStyle w:val="BodyText"/>
-      </w:pPr>
-      <w:r>
-        <w:t>A korábbi tapasztalatokra építve a tanítási folyamathoz a többségi osztályok torzító hatásának elkerülése érdekében a feladatmegoldásnak ebben a részében csak a teljesen kiegyensúlyozott (balanced) adatsort használtam. A NORM, MI, STTC, CD és HYP osztályok mindegyikéből pontosan 536 mintát választottam ki véletlenszerűen, így egy 2680 elemből álló, standardizált (StandardScaler) bemeneti tenzort hoztam létre.</w:t>
-      </w:r>
-    </w:p>
-    <w:p>
-      <w:pPr>
-        <w:pStyle w:val="BodyText"/>
-      </w:pPr>
-      <w:r>
-        <w:t>A DEC és IDEC modellek alapját egy mély alulkomplett autoencoder (Undercomplete Autoencoder) képezi, amelynek feladata a 1024 dimenziós MOMENT beágyazások további tömörítése egy 10 dimenziós látens térbe, ezzel a tömörítési ráta 102,4-szeres. Az Encoder (kódoló) rétegei a következőképpen épültek fel: 1024 -&gt; 500 -&gt; 100 -&gt; 10 neuron. A nemlineáris reprezentációk tanulása érdekében ReLU aktivációs függvényeket, az eltolódások elkerülésére pedig BatchNorm1d rétegeket alkalmaztam.</w:t>
-      </w:r>
-    </w:p>
-    <w:p>
-      <w:pPr>
-        <w:pStyle w:val="BodyText"/>
-      </w:pPr>
-      <w:r>
         <w:t>A hálózat kódolójának (Encoder) 10 dimenziós kimenetét egy L</w:t>
       </w:r>
       <w:r>
@@ -8192,7 +8428,6 @@
         <w:pStyle w:val="BodyText"/>
       </w:pPr>
       <w:r>
-        <w:lastRenderedPageBreak/>
         <w:t>A tanítási ciklusban a komplexitást a veszteségfüggvények kombinálása jelentette. Egy összetett célfüggvényt határoztam meg, amely a klaszterezési hibát (KL-divergencia) és a rekonstrukciós hibát (MSE) együttesen kezelte. A két komponens súlyozására egy globális „gamma” paramétert vezettem be, melynek értékét a notebookban végzett kísérletek alapján 0,8-ban rögzítettem. Ezzel a megoldással biztosítottam, hogy az optimalizáló algoritmus (Adam) 80%-os súllyal a klaszterek sűrítésére, 20%-os súllyal pedig az EKG adatok eredeti topológiai tulajdonságainak megőrzésére törekedjen. Ez az architektúra garantálta, hogy a modell a látens tér átrendezése közben ne veszítse el a diagnosztikailag releváns információkat.</w:t>
       </w:r>
     </w:p>
@@ -8235,6 +8470,7 @@
           <w:b/>
           <w:bCs/>
         </w:rPr>
+        <w:lastRenderedPageBreak/>
         <w:t>1. Fázis: Az Autoencoder előtanítása (Pre-training)</w:t>
       </w:r>
     </w:p>
@@ -8362,11 +8598,7 @@
         <w:t>150</w:t>
       </w:r>
       <w:r>
-        <w:t xml:space="preserve"> epochon keresztül egyidejűleg kellett minimalizálnia a klaszterezési </w:t>
-      </w:r>
-      <w:r>
-        <w:lastRenderedPageBreak/>
-        <w:t>hibát (KL Loss - L</w:t>
+        <w:t xml:space="preserve"> epochon keresztül egyidejűleg kellett minimalizálnia a klaszterezési hibát (KL Loss - L</w:t>
       </w:r>
       <w:r>
         <w:rPr>
@@ -8468,6 +8700,7 @@
           <w:b/>
           <w:lang w:val="hu-HU"/>
         </w:rPr>
+        <w:lastRenderedPageBreak/>
         <w:t>A beágyazások validálása felügyelt tanulással:</w:t>
       </w:r>
       <w:r>
@@ -8644,81 +8877,87 @@
           <w:sz w:val="24"/>
           <w:szCs w:val="24"/>
         </w:rPr>
+        <w:t>3.1.1. A MOMENT beágyazások validálása felügyelt tanulással</w:t>
+      </w:r>
+      <w:bookmarkEnd w:id="47"/>
+    </w:p>
+    <w:p>
+      <w:pPr>
+        <w:pStyle w:val="BodyText"/>
+        <w:rPr>
+          <w:lang w:val="hu-HU"/>
+        </w:rPr>
+      </w:pPr>
+      <w:r>
+        <w:rPr>
+          <w:lang w:val="hu-HU"/>
+        </w:rPr>
+        <w:t>A felügyelet nélküli klaszterezési kísérletek kezdeti nehézségei (alacsony Sziluett-pontszám és ARI értékek) miatt – amelyet a következő fejezetben fogok kiértékelni – fontosnak tartottam annak ellenőrzését, hogy a MOMENT alapmodell által generált 1024 dimenziós reprezentációk egyáltalán hordoznak-e elegendő diagnosztikai információt. Ehhez a kísérlethez a felügyelt tanulás módszertanát hívtam segítségül, ahol a modellek a tanítás során hozzáfértek a PTB-XL adathalmaz valódi diagnosztikai címkéihez.</w:t>
+      </w:r>
+    </w:p>
+    <w:p>
+      <w:pPr>
+        <w:pStyle w:val="BodyText"/>
+        <w:rPr>
+          <w:lang w:val="hu-HU"/>
+        </w:rPr>
+      </w:pPr>
+      <w:r>
+        <w:rPr>
+          <w:lang w:val="hu-HU"/>
+        </w:rPr>
+        <w:t>A kísérlet során két eltérő logikájú modellt, a Logisztikus Regressziót (LR) és a Random Forestet (RF) tanítottam be a beágyazásokon. Az adathalmazt 80-20% arányban osztottam fel, így a teszthalmazban 3255 minta szerepelt.</w:t>
+      </w:r>
+    </w:p>
+    <w:p>
+      <w:pPr>
+        <w:pStyle w:val="BodyText"/>
+        <w:jc w:val="left"/>
+        <w:rPr>
+          <w:b/>
+          <w:lang w:val="hu-HU"/>
+        </w:rPr>
+      </w:pPr>
+      <w:r>
+        <w:rPr>
+          <w:b/>
+          <w:lang w:val="hu-HU"/>
+        </w:rPr>
+        <w:t>A Random Forest eredményei és a pontosság csapdája</w:t>
+      </w:r>
+    </w:p>
+    <w:p>
+      <w:pPr>
+        <w:pStyle w:val="BodyText"/>
+        <w:rPr>
+          <w:lang w:val="hu-HU"/>
+        </w:rPr>
+      </w:pPr>
+      <w:r>
+        <w:rPr>
+          <w:lang w:val="hu-HU"/>
+        </w:rPr>
+        <w:t xml:space="preserve">A Random Forest osztályozó futtatása után első látásra rendkívül meggyőző, </w:t>
+      </w:r>
+      <w:r>
+        <w:rPr>
+          <w:b/>
+          <w:lang w:val="hu-HU"/>
+        </w:rPr>
+        <w:t>74,44%-os globális pontosságot (Accuracy)</w:t>
+      </w:r>
+      <w:r>
+        <w:rPr>
+          <w:lang w:val="hu-HU"/>
+        </w:rPr>
+        <w:t xml:space="preserve"> kaptam. Ez az érték lényegesen magasabb volt minden </w:t>
+      </w:r>
+      <w:r>
+        <w:rPr>
+          <w:lang w:val="hu-HU"/>
+        </w:rPr>
         <w:lastRenderedPageBreak/>
-        <w:t>3.1.1. A MOMENT beágyazások validálása felügyelt tanulással</w:t>
-      </w:r>
-      <w:bookmarkEnd w:id="47"/>
-    </w:p>
-    <w:p>
-      <w:pPr>
-        <w:pStyle w:val="BodyText"/>
-        <w:rPr>
-          <w:lang w:val="hu-HU"/>
-        </w:rPr>
-      </w:pPr>
-      <w:r>
-        <w:rPr>
-          <w:lang w:val="hu-HU"/>
-        </w:rPr>
-        <w:t>A felügyelet nélküli klaszterezési kísérletek kezdeti nehézségei (alacsony Sziluett-pontszám és ARI értékek) miatt – amelyet a következő fejezetben fogok kiértékelni – fontosnak tartottam annak ellenőrzését, hogy a MOMENT alapmodell által generált 1024 dimenziós reprezentációk egyáltalán hordoznak-e elegendő diagnosztikai információt. Ehhez a kísérlethez a felügyelt tanulás módszertanát hívtam segítségül, ahol a modellek a tanítás során hozzáfértek a PTB-XL adathalmaz valódi diagnosztikai címkéihez.</w:t>
-      </w:r>
-    </w:p>
-    <w:p>
-      <w:pPr>
-        <w:pStyle w:val="BodyText"/>
-        <w:rPr>
-          <w:lang w:val="hu-HU"/>
-        </w:rPr>
-      </w:pPr>
-      <w:r>
-        <w:rPr>
-          <w:lang w:val="hu-HU"/>
-        </w:rPr>
-        <w:t>A kísérlet során két eltérő logikájú modellt, a Logisztikus Regressziót (LR) és a Random Forestet (RF) tanítottam be a beágyazásokon. Az adathalmazt 80-20% arányban osztottam fel, így a teszthalmazban 3255 minta szerepelt.</w:t>
-      </w:r>
-    </w:p>
-    <w:p>
-      <w:pPr>
-        <w:pStyle w:val="BodyText"/>
-        <w:jc w:val="left"/>
-        <w:rPr>
-          <w:b/>
-          <w:lang w:val="hu-HU"/>
-        </w:rPr>
-      </w:pPr>
-      <w:r>
-        <w:rPr>
-          <w:b/>
-          <w:lang w:val="hu-HU"/>
-        </w:rPr>
-        <w:t>A Random Forest eredményei és a pontosság csapdája</w:t>
-      </w:r>
-    </w:p>
-    <w:p>
-      <w:pPr>
-        <w:pStyle w:val="BodyText"/>
-        <w:rPr>
-          <w:lang w:val="hu-HU"/>
-        </w:rPr>
-      </w:pPr>
-      <w:r>
-        <w:rPr>
-          <w:lang w:val="hu-HU"/>
-        </w:rPr>
-        <w:t xml:space="preserve">A Random Forest osztályozó futtatása után első látásra rendkívül meggyőző, </w:t>
-      </w:r>
-      <w:r>
-        <w:rPr>
-          <w:b/>
-          <w:lang w:val="hu-HU"/>
-        </w:rPr>
-        <w:t>74,44%-os globális pontosságot (Accuracy)</w:t>
-      </w:r>
-      <w:r>
-        <w:rPr>
-          <w:lang w:val="hu-HU"/>
-        </w:rPr>
-        <w:t xml:space="preserve"> kaptam. Ez az érték lényegesen magasabb volt minden korábbi kísérletemnél, azonban a részletes osztályozási jelentés (Classification Report) elemzése rávilágított egy súlyos problémára.</w:t>
+        <w:t>korábbi kísérletemnél, azonban a részletes osztályozási jelentés (Classification Report) elemzése rávilágított egy súlyos problémára.</w:t>
       </w:r>
     </w:p>
     <w:tbl>
@@ -9840,7 +10079,6 @@
         <w:rPr>
           <w:noProof/>
         </w:rPr>
-        <w:lastRenderedPageBreak/>
         <w:drawing>
           <wp:inline distT="0" distB="0" distL="0" distR="0" wp14:anchorId="0EEFB9F8" wp14:editId="15672F5B">
             <wp:extent cx="3289890" cy="2520000"/>
@@ -9859,7 +10097,7 @@
                     </pic:cNvPicPr>
                   </pic:nvPicPr>
                   <pic:blipFill>
-                    <a:blip r:embed="rId7" cstate="print">
+                    <a:blip r:embed="rId8" cstate="print">
                       <a:extLst>
                         <a:ext uri="{28A0092B-C50C-407E-A947-70E740481C1C}">
                           <a14:useLocalDpi xmlns:a14="http://schemas.microsoft.com/office/drawing/2010/main" val="0"/>
@@ -9964,6 +10202,7 @@
                 <w:bCs w:val="0"/>
                 <w:color w:val="000000"/>
               </w:rPr>
+              <w:lastRenderedPageBreak/>
               <w:t>Detailed Classification Report – Logistic Regression</w:t>
             </w:r>
           </w:p>
@@ -11045,7 +11284,6 @@
       </w:pPr>
       <w:bookmarkStart w:id="48" w:name="_Toc230163380"/>
       <w:r>
-        <w:lastRenderedPageBreak/>
         <w:t>3.1.2. A távolságalapú klaszterezés korlátai (K-Means alapvonal)</w:t>
       </w:r>
       <w:bookmarkEnd w:id="48"/>
@@ -11146,6 +11384,7 @@
                 <w:bCs w:val="0"/>
                 <w:color w:val="000000"/>
               </w:rPr>
+              <w:lastRenderedPageBreak/>
               <w:t xml:space="preserve">Detailed Classification Report – </w:t>
             </w:r>
             <w:r>
@@ -12354,7 +12593,6 @@
         <w:rPr>
           <w:noProof/>
         </w:rPr>
-        <w:lastRenderedPageBreak/>
         <w:drawing>
           <wp:anchor distT="0" distB="0" distL="114300" distR="114300" simplePos="0" relativeHeight="251663360" behindDoc="0" locked="0" layoutInCell="1" allowOverlap="1" wp14:anchorId="1D25FB0F" wp14:editId="14BF4250">
             <wp:simplePos x="0" y="0"/>
@@ -12381,7 +12619,7 @@
                     </pic:cNvPicPr>
                   </pic:nvPicPr>
                   <pic:blipFill>
-                    <a:blip r:embed="rId8">
+                    <a:blip r:embed="rId9">
                       <a:extLst>
                         <a:ext uri="{28A0092B-C50C-407E-A947-70E740481C1C}">
                           <a14:useLocalDpi xmlns:a14="http://schemas.microsoft.com/office/drawing/2010/main" val="0"/>
@@ -12459,7 +12697,7 @@
                     </pic:cNvPicPr>
                   </pic:nvPicPr>
                   <pic:blipFill>
-                    <a:blip r:embed="rId9" cstate="print">
+                    <a:blip r:embed="rId10" cstate="print">
                       <a:extLst>
                         <a:ext uri="{28A0092B-C50C-407E-A947-70E740481C1C}">
                           <a14:useLocalDpi xmlns:a14="http://schemas.microsoft.com/office/drawing/2010/main" val="0"/>
@@ -12505,7 +12743,11 @@
         <w:pStyle w:val="BodyText"/>
       </w:pPr>
       <w:r>
-        <w:t>Ebből a kísérletből azt a következtetést vontam le, hogy a 1024 dimenziós EKG-beágyazások elemzésekor a hagyományos távolságalapú klaszterezés eléri a módszertani határait. Ennek két fő oka van. Egyrészt a "dimenziók átka" miatt a magas dimenziószámú térben a pontok közötti euklideszi távolságok elmosódnak, és a mutató erejük jelentősen csökken. Másrészt az osztályok közötti egyenlőtlen eloszlás (a NORM dominanciája) miatt a K-Means által feltételezett azonos méretű, gömbszimmetrikus klaszterek fizikailag nem illeszkednek a valódi EKG adatok elrendeződéséhez.</w:t>
+        <w:t xml:space="preserve">Ebből a kísérletből azt a következtetést vontam le, hogy a 1024 dimenziós EKG-beágyazások elemzésekor a hagyományos távolságalapú klaszterezés eléri a módszertani határait. Ennek két fő oka van. Egyrészt a "dimenziók átka" miatt a magas dimenziószámú térben a pontok közötti euklideszi távolságok elmosódnak, és a mutató erejük jelentősen csökken. Másrészt az osztályok közötti egyenlőtlen eloszlás (a NORM dominanciája) miatt a K-Means által </w:t>
+      </w:r>
+      <w:r>
+        <w:lastRenderedPageBreak/>
+        <w:t>feltételezett azonos méretű, gömbszimmetrikus klaszterek fizikailag nem illeszkednek a valódi EKG adatok elrendeződéséhez.</w:t>
       </w:r>
     </w:p>
     <w:p>
@@ -12522,7 +12764,6 @@
       </w:pPr>
       <w:bookmarkStart w:id="49" w:name="_Toc230163381"/>
       <w:r>
-        <w:lastRenderedPageBreak/>
         <w:t>3.1.3. Fejlett klaszterezési eljárások optimalizálása</w:t>
       </w:r>
       <w:bookmarkEnd w:id="49"/>
@@ -12705,11 +12946,8 @@
         <w:pStyle w:val="BodyText"/>
       </w:pPr>
       <w:r>
-        <w:t xml:space="preserve">Az eredmények bizonyították, hogy az elliptikus eloszlásokat feltételező valószínűségi modellezés (GMM) alkalmasabb az EKG-beágyazások struktúrájának leírására, mint a merev távolságokon alapuló vagy a zajokat elvető sűrűségalapú eljárások. Azonban mindkét modellnél megfigyelhető volt, hogy a tisztasági mutató (Purity) 61% körül tetőzött. Ez a statisztikai plafon arra engedett következtetni, hogy a modellek döntéseit még mindig dominálta a NORM osztály hatalmas túlsúlya. Annak érdekében, hogy a modellek valós, </w:t>
-      </w:r>
-      <w:r>
         <w:lastRenderedPageBreak/>
-        <w:t>kisebbségi betegségekre (pl. HYP, MI) vonatkozó szeparáló képességét objektíven meg tudjam ítélni, elengedhetetlenné vált a kísérletek megismétlése egy teljesen kiegyensúlyozott (</w:t>
+        <w:t>Az eredmények bizonyították, hogy az elliptikus eloszlásokat feltételező valószínűségi modellezés (GMM) alkalmasabb az EKG-beágyazások struktúrájának leírására, mint a merev távolságokon alapuló vagy a zajokat elvető sűrűségalapú eljárások. Azonban mindkét modellnél megfigyelhető volt, hogy a tisztasági mutató (Purity) 61% körül tetőzött. Ez a statisztikai plafon arra engedett következtetni, hogy a modellek döntéseit még mindig dominálta a NORM osztály hatalmas túlsúlya. Annak érdekében, hogy a modellek valós, kisebbségi betegségekre (pl. HYP, MI) vonatkozó szeparáló képességét objektíven meg tudjam ítélni, elengedhetetlenné vált a kísérletek megismétlése egy teljesen kiegyensúlyozott (</w:t>
       </w:r>
       <w:r>
         <w:rPr>
@@ -14092,883 +14330,6 @@
                 <pic:pic xmlns:pic="http://schemas.openxmlformats.org/drawingml/2006/picture">
                   <pic:nvPicPr>
                     <pic:cNvPr id="0" name="Picture 9"/>
-                    <pic:cNvPicPr>
-                      <a:picLocks noChangeAspect="1" noChangeArrowheads="1"/>
-                    </pic:cNvPicPr>
-                  </pic:nvPicPr>
-                  <pic:blipFill>
-                    <a:blip r:embed="rId10">
-                      <a:extLst>
-                        <a:ext uri="{28A0092B-C50C-407E-A947-70E740481C1C}">
-                          <a14:useLocalDpi xmlns:a14="http://schemas.microsoft.com/office/drawing/2010/main" val="0"/>
-                        </a:ext>
-                      </a:extLst>
-                    </a:blip>
-                    <a:srcRect/>
-                    <a:stretch>
-                      <a:fillRect/>
-                    </a:stretch>
-                  </pic:blipFill>
-                  <pic:spPr bwMode="auto">
-                    <a:xfrm>
-                      <a:off x="0" y="0"/>
-                      <a:ext cx="3253371" cy="2520000"/>
-                    </a:xfrm>
-                    <a:prstGeom prst="rect">
-                      <a:avLst/>
-                    </a:prstGeom>
-                    <a:noFill/>
-                    <a:ln>
-                      <a:noFill/>
-                    </a:ln>
-                  </pic:spPr>
-                </pic:pic>
-              </a:graphicData>
-            </a:graphic>
-            <wp14:sizeRelH relativeFrom="page">
-              <wp14:pctWidth>0</wp14:pctWidth>
-            </wp14:sizeRelH>
-            <wp14:sizeRelV relativeFrom="page">
-              <wp14:pctHeight>0</wp14:pctHeight>
-            </wp14:sizeRelV>
-          </wp:anchor>
-        </w:drawing>
-      </w:r>
-    </w:p>
-    <w:p>
-      <w:pPr>
-        <w:pStyle w:val="BodyText"/>
-        <w:rPr>
-          <w:b/>
-        </w:rPr>
-      </w:pPr>
-      <w:r>
-        <w:rPr>
-          <w:b/>
-        </w:rPr>
-        <w:t>Szakmai értékelés és átvezetés a mélytanulás felé</w:t>
-      </w:r>
-    </w:p>
-    <w:p>
-      <w:pPr>
-        <w:pStyle w:val="BodyText"/>
-      </w:pPr>
-      <w:r>
-        <w:t>A kiegyensúlyozott adathalmazon kapott eredmények kulcsfontosságú felismeréshez vezettek. Amikor megszüntettem a többségi osztály dominanciájából fakadó statisztikai "illúziót", a metrikák (30-38%-os tisztaság) megmutatták a MOMENT-beágyazások geometriai, és a tanulási algoritmusok módszertani határait. A HDBSCAN kudarca és a GMM szerényebb pontossága matematikailag is igazolta azt a geometriai tényt, hogy a különböző EKG-elváltozások az 1024 dimenziós térben hatalmas átfedésben léteznek.</w:t>
-      </w:r>
-    </w:p>
-    <w:p>
-      <w:pPr>
-        <w:pStyle w:val="BodyText"/>
-      </w:pPr>
-      <w:r>
-        <w:t>Ezek a statikus megközelítések (akár távolság-, akár sűrűség-, akár valószínűségalapúak) elérték a határaikat: elfogadták a teret olyannak, amilyennek az alapmodell generálta azt. A klaszterek közötti élesebb elválasztás és a tisztaság további növelése érdekében egyértelművé vált, hogy fel kell hagyni a statikus jellemzőtér elemzésével. A kutatás következő, legösszetettebb fázisában ezért a tér dinamikus, mélytanulás-alapú átrendezésére (Deep Embedded Clustering) tértem át, ahol a neurális hálózat már kifejezetten a betegségcsoportok szeparálhatóságának maximalizálására optimalizálta a beágyazásokat.</w:t>
-      </w:r>
-    </w:p>
-    <w:p>
-      <w:pPr>
-        <w:pStyle w:val="Heading2"/>
-        <w:rPr>
-          <w:lang w:val="hu-HU"/>
-        </w:rPr>
-      </w:pPr>
-      <w:bookmarkStart w:id="50" w:name="_Toc230163382"/>
-      <w:r>
-        <w:rPr>
-          <w:lang w:val="hu-HU"/>
-        </w:rPr>
-        <w:t xml:space="preserve">3.2. </w:t>
-      </w:r>
-      <w:hyperlink w:anchor="__RefHeading___Toc80443503">
-        <w:r>
-          <w:rPr>
-            <w:lang w:val="hu-HU" w:eastAsia="hu-HU"/>
-          </w:rPr>
-          <w:t>DEC és IDEC modellek eredményei</w:t>
-        </w:r>
-        <w:bookmarkEnd w:id="50"/>
-      </w:hyperlink>
-    </w:p>
-    <w:p>
-      <w:pPr>
-        <w:pStyle w:val="BodyText"/>
-        <w:rPr>
-          <w:lang w:val="hu-HU"/>
-        </w:rPr>
-      </w:pPr>
-      <w:r>
-        <w:rPr>
-          <w:lang w:val="hu-HU"/>
-        </w:rPr>
-        <w:t>A kutatásom utolsó fázisában a hagyományos gépi tanulási modellek által felállított korlátokat a mélytanulás alapú, dinamikus tér-átrendezést alkalmazó architektúrákkal kíséreltem meg áttörni. A vizsgálatot a kiegyensúlyozott (</w:t>
-      </w:r>
-      <w:r>
-        <w:rPr>
-          <w:i/>
-          <w:lang w:val="hu-HU"/>
-        </w:rPr>
-        <w:t>balanced</w:t>
-      </w:r>
-      <w:r>
-        <w:rPr>
-          <w:lang w:val="hu-HU"/>
-        </w:rPr>
-        <w:t>) adathalmazon hajtottam végre, 10 dimenziós látens térben. A kiindulási alap (baseline) meghatározásához a 10 dimenziós reprezentációkon először egy hagyományos K-Means klaszterezést futtattam le, amely 37,5%-os tisztaságot (Purity) és 0,0679-es ARI értéket eredményezett. Ezt az értéket tekintettem a finomhangolás (</w:t>
-      </w:r>
-      <w:r>
-        <w:rPr>
-          <w:i/>
-          <w:lang w:val="hu-HU"/>
-        </w:rPr>
-        <w:t>fine-tuning</w:t>
-      </w:r>
-      <w:r>
-        <w:rPr>
-          <w:lang w:val="hu-HU"/>
-        </w:rPr>
-        <w:t>) előtti referencia-állapotnak.</w:t>
-      </w:r>
-    </w:p>
-    <w:p>
-      <w:pPr>
-        <w:pStyle w:val="BodyText"/>
-        <w:rPr>
-          <w:lang w:val="hu-HU"/>
-        </w:rPr>
-      </w:pPr>
-      <w:r>
-        <w:rPr>
-          <w:lang w:val="hu-HU"/>
-        </w:rPr>
-        <w:t>A DEC és IDEC architektúrák tanítása során a célom az volt, hogy a neurális hálózat az autoenkóderes előtanítást követően iteratívan olyan látens reprezentációt alakítson ki, amelyben a diagnosztikai csoportok jobban elkülönülnek.</w:t>
-      </w:r>
-    </w:p>
-    <w:p>
-      <w:pPr>
-        <w:pStyle w:val="BodyText"/>
-        <w:rPr>
-          <w:b/>
-          <w:lang w:val="hu-HU"/>
-        </w:rPr>
-      </w:pPr>
-      <w:r>
-        <w:rPr>
-          <w:b/>
-          <w:lang w:val="hu-HU"/>
-        </w:rPr>
-        <w:t>Az eredmények összehasonlítása</w:t>
-      </w:r>
-    </w:p>
-    <w:p>
-      <w:pPr>
-        <w:pStyle w:val="BodyText"/>
-        <w:rPr>
-          <w:lang w:val="hu-HU"/>
-        </w:rPr>
-      </w:pPr>
-      <w:r>
-        <w:rPr>
-          <w:lang w:val="hu-HU"/>
-        </w:rPr>
-        <w:lastRenderedPageBreak/>
-        <w:t>A két modell teljesítményét az alábbi táblázatban foglaltam össze, ahol a végső, öt klaszterre történő leképezés utáni mutatókat tüntettem fel:</w:t>
-      </w:r>
-    </w:p>
-    <w:tbl>
-      <w:tblPr>
-        <w:tblW w:w="7088" w:type="dxa"/>
-        <w:jc w:val="center"/>
-        <w:tblLayout w:type="fixed"/>
-        <w:tblCellMar>
-          <w:left w:w="0" w:type="dxa"/>
-          <w:right w:w="0" w:type="dxa"/>
-        </w:tblCellMar>
-        <w:tblLook w:val="04A0" w:firstRow="1" w:lastRow="0" w:firstColumn="1" w:lastColumn="0" w:noHBand="0" w:noVBand="1"/>
-      </w:tblPr>
-      <w:tblGrid>
-        <w:gridCol w:w="1772"/>
-        <w:gridCol w:w="1772"/>
-        <w:gridCol w:w="1772"/>
-        <w:gridCol w:w="1772"/>
-      </w:tblGrid>
-      <w:tr>
-        <w:trPr>
-          <w:trHeight w:val="277"/>
-          <w:jc w:val="center"/>
-        </w:trPr>
-        <w:tc>
-          <w:tcPr>
-            <w:tcW w:w="7088" w:type="dxa"/>
-            <w:gridSpan w:val="4"/>
-            <w:tcBorders>
-              <w:top w:val="single" w:sz="6" w:space="0" w:color="000000"/>
-              <w:bottom w:val="single" w:sz="6" w:space="0" w:color="000000"/>
-            </w:tcBorders>
-          </w:tcPr>
-          <w:p>
-            <w:pPr>
-              <w:pStyle w:val="TableHeading"/>
-              <w:keepNext/>
-              <w:spacing w:line="276" w:lineRule="auto"/>
-              <w:jc w:val="both"/>
-              <w:rPr>
-                <w:b w:val="0"/>
-                <w:bCs w:val="0"/>
-                <w:color w:val="000000"/>
-              </w:rPr>
-            </w:pPr>
-            <w:r>
-              <w:rPr>
-                <w:b w:val="0"/>
-                <w:bCs w:val="0"/>
-                <w:color w:val="000000"/>
-              </w:rPr>
-              <w:t>Baseline – DEC – IDEC comparison</w:t>
-            </w:r>
-          </w:p>
-        </w:tc>
-      </w:tr>
-      <w:tr>
-        <w:trPr>
-          <w:trHeight w:val="277"/>
-          <w:jc w:val="center"/>
-        </w:trPr>
-        <w:tc>
-          <w:tcPr>
-            <w:tcW w:w="1772" w:type="dxa"/>
-            <w:tcBorders>
-              <w:top w:val="single" w:sz="6" w:space="0" w:color="000000"/>
-              <w:bottom w:val="single" w:sz="4" w:space="0" w:color="auto"/>
-            </w:tcBorders>
-          </w:tcPr>
-          <w:p>
-            <w:pPr>
-              <w:pStyle w:val="TableHeading"/>
-              <w:keepNext/>
-              <w:spacing w:line="276" w:lineRule="auto"/>
-              <w:jc w:val="both"/>
-              <w:rPr>
-                <w:b w:val="0"/>
-                <w:bCs w:val="0"/>
-                <w:color w:val="000000"/>
-              </w:rPr>
-            </w:pPr>
-            <w:r>
-              <w:rPr>
-                <w:b w:val="0"/>
-                <w:bCs w:val="0"/>
-                <w:color w:val="000000"/>
-              </w:rPr>
-              <w:t>Modell</w:t>
-            </w:r>
-          </w:p>
-        </w:tc>
-        <w:tc>
-          <w:tcPr>
-            <w:tcW w:w="1772" w:type="dxa"/>
-            <w:tcBorders>
-              <w:top w:val="single" w:sz="6" w:space="0" w:color="000000"/>
-              <w:bottom w:val="single" w:sz="4" w:space="0" w:color="auto"/>
-            </w:tcBorders>
-          </w:tcPr>
-          <w:p>
-            <w:pPr>
-              <w:pStyle w:val="TableHeading"/>
-              <w:keepNext/>
-              <w:spacing w:line="276" w:lineRule="auto"/>
-              <w:jc w:val="both"/>
-              <w:rPr>
-                <w:b w:val="0"/>
-                <w:bCs w:val="0"/>
-                <w:color w:val="000000"/>
-              </w:rPr>
-            </w:pPr>
-            <w:r>
-              <w:rPr>
-                <w:b w:val="0"/>
-                <w:bCs w:val="0"/>
-                <w:color w:val="000000"/>
-              </w:rPr>
-              <w:t>Ari</w:t>
-            </w:r>
-          </w:p>
-        </w:tc>
-        <w:tc>
-          <w:tcPr>
-            <w:tcW w:w="1772" w:type="dxa"/>
-            <w:tcBorders>
-              <w:top w:val="single" w:sz="6" w:space="0" w:color="000000"/>
-              <w:bottom w:val="single" w:sz="4" w:space="0" w:color="auto"/>
-            </w:tcBorders>
-          </w:tcPr>
-          <w:p>
-            <w:pPr>
-              <w:pStyle w:val="TableHeading"/>
-              <w:keepNext/>
-              <w:spacing w:line="276" w:lineRule="auto"/>
-              <w:jc w:val="both"/>
-              <w:rPr>
-                <w:b w:val="0"/>
-                <w:bCs w:val="0"/>
-                <w:color w:val="000000"/>
-              </w:rPr>
-            </w:pPr>
-            <w:r>
-              <w:rPr>
-                <w:b w:val="0"/>
-                <w:bCs w:val="0"/>
-                <w:color w:val="000000"/>
-              </w:rPr>
-              <w:t>Purity</w:t>
-            </w:r>
-          </w:p>
-        </w:tc>
-        <w:tc>
-          <w:tcPr>
-            <w:tcW w:w="1772" w:type="dxa"/>
-            <w:tcBorders>
-              <w:top w:val="single" w:sz="6" w:space="0" w:color="000000"/>
-              <w:bottom w:val="single" w:sz="4" w:space="0" w:color="auto"/>
-            </w:tcBorders>
-          </w:tcPr>
-          <w:p>
-            <w:pPr>
-              <w:pStyle w:val="TableHeading"/>
-              <w:keepNext/>
-              <w:spacing w:line="276" w:lineRule="auto"/>
-              <w:jc w:val="both"/>
-              <w:rPr>
-                <w:b w:val="0"/>
-                <w:bCs w:val="0"/>
-                <w:color w:val="000000"/>
-              </w:rPr>
-            </w:pPr>
-            <w:r>
-              <w:rPr>
-                <w:b w:val="0"/>
-                <w:bCs w:val="0"/>
-                <w:color w:val="000000"/>
-              </w:rPr>
-              <w:t>Clusters found</w:t>
-            </w:r>
-          </w:p>
-        </w:tc>
-      </w:tr>
-      <w:tr>
-        <w:trPr>
-          <w:trHeight w:val="277"/>
-          <w:jc w:val="center"/>
-        </w:trPr>
-        <w:tc>
-          <w:tcPr>
-            <w:tcW w:w="1772" w:type="dxa"/>
-            <w:tcBorders>
-              <w:top w:val="single" w:sz="4" w:space="0" w:color="auto"/>
-            </w:tcBorders>
-          </w:tcPr>
-          <w:p>
-            <w:pPr>
-              <w:pStyle w:val="TableHeading"/>
-              <w:keepNext/>
-              <w:spacing w:line="276" w:lineRule="auto"/>
-              <w:jc w:val="both"/>
-              <w:rPr>
-                <w:b w:val="0"/>
-                <w:bCs w:val="0"/>
-                <w:color w:val="000000"/>
-              </w:rPr>
-            </w:pPr>
-            <w:r>
-              <w:rPr>
-                <w:b w:val="0"/>
-                <w:bCs w:val="0"/>
-                <w:color w:val="000000"/>
-              </w:rPr>
-              <w:t>Baseline</w:t>
-            </w:r>
-          </w:p>
-        </w:tc>
-        <w:tc>
-          <w:tcPr>
-            <w:tcW w:w="1772" w:type="dxa"/>
-            <w:tcBorders>
-              <w:top w:val="single" w:sz="4" w:space="0" w:color="auto"/>
-            </w:tcBorders>
-          </w:tcPr>
-          <w:p>
-            <w:pPr>
-              <w:pStyle w:val="TableHeading"/>
-              <w:keepNext/>
-              <w:spacing w:line="276" w:lineRule="auto"/>
-              <w:jc w:val="both"/>
-              <w:rPr>
-                <w:b w:val="0"/>
-                <w:bCs w:val="0"/>
-                <w:color w:val="000000"/>
-              </w:rPr>
-            </w:pPr>
-            <w:r>
-              <w:rPr>
-                <w:b w:val="0"/>
-                <w:bCs w:val="0"/>
-                <w:color w:val="000000"/>
-              </w:rPr>
-              <w:t>0.0679</w:t>
-            </w:r>
-          </w:p>
-        </w:tc>
-        <w:tc>
-          <w:tcPr>
-            <w:tcW w:w="1772" w:type="dxa"/>
-            <w:tcBorders>
-              <w:top w:val="single" w:sz="4" w:space="0" w:color="auto"/>
-            </w:tcBorders>
-          </w:tcPr>
-          <w:p>
-            <w:pPr>
-              <w:pStyle w:val="TableHeading"/>
-              <w:keepNext/>
-              <w:spacing w:line="276" w:lineRule="auto"/>
-              <w:jc w:val="both"/>
-              <w:rPr>
-                <w:b w:val="0"/>
-                <w:bCs w:val="0"/>
-                <w:color w:val="000000"/>
-              </w:rPr>
-            </w:pPr>
-            <w:r>
-              <w:rPr>
-                <w:b w:val="0"/>
-                <w:bCs w:val="0"/>
-                <w:color w:val="000000"/>
-              </w:rPr>
-              <w:t>37.5%</w:t>
-            </w:r>
-          </w:p>
-        </w:tc>
-        <w:tc>
-          <w:tcPr>
-            <w:tcW w:w="1772" w:type="dxa"/>
-            <w:tcBorders>
-              <w:top w:val="single" w:sz="4" w:space="0" w:color="auto"/>
-            </w:tcBorders>
-          </w:tcPr>
-          <w:p>
-            <w:pPr>
-              <w:pStyle w:val="TableHeading"/>
-              <w:keepNext/>
-              <w:spacing w:line="276" w:lineRule="auto"/>
-              <w:jc w:val="both"/>
-              <w:rPr>
-                <w:b w:val="0"/>
-                <w:bCs w:val="0"/>
-                <w:color w:val="000000"/>
-              </w:rPr>
-            </w:pPr>
-            <w:r>
-              <w:rPr>
-                <w:b w:val="0"/>
-                <w:bCs w:val="0"/>
-                <w:color w:val="000000"/>
-              </w:rPr>
-              <w:t>5</w:t>
-            </w:r>
-          </w:p>
-        </w:tc>
-      </w:tr>
-      <w:tr>
-        <w:trPr>
-          <w:trHeight w:val="277"/>
-          <w:jc w:val="center"/>
-        </w:trPr>
-        <w:tc>
-          <w:tcPr>
-            <w:tcW w:w="1772" w:type="dxa"/>
-          </w:tcPr>
-          <w:p>
-            <w:pPr>
-              <w:pStyle w:val="TableHeading"/>
-              <w:keepNext/>
-              <w:spacing w:line="276" w:lineRule="auto"/>
-              <w:jc w:val="both"/>
-              <w:rPr>
-                <w:b w:val="0"/>
-                <w:bCs w:val="0"/>
-                <w:color w:val="000000"/>
-              </w:rPr>
-            </w:pPr>
-            <w:r>
-              <w:rPr>
-                <w:b w:val="0"/>
-                <w:bCs w:val="0"/>
-                <w:color w:val="000000"/>
-              </w:rPr>
-              <w:t>DEC</w:t>
-            </w:r>
-          </w:p>
-        </w:tc>
-        <w:tc>
-          <w:tcPr>
-            <w:tcW w:w="1772" w:type="dxa"/>
-          </w:tcPr>
-          <w:p>
-            <w:pPr>
-              <w:pStyle w:val="TableHeading"/>
-              <w:keepNext/>
-              <w:spacing w:line="276" w:lineRule="auto"/>
-              <w:jc w:val="both"/>
-              <w:rPr>
-                <w:b w:val="0"/>
-                <w:bCs w:val="0"/>
-                <w:color w:val="000000"/>
-              </w:rPr>
-            </w:pPr>
-            <w:r>
-              <w:rPr>
-                <w:b w:val="0"/>
-                <w:bCs w:val="0"/>
-                <w:color w:val="000000"/>
-              </w:rPr>
-              <w:t>0.0682</w:t>
-            </w:r>
-          </w:p>
-        </w:tc>
-        <w:tc>
-          <w:tcPr>
-            <w:tcW w:w="1772" w:type="dxa"/>
-          </w:tcPr>
-          <w:p>
-            <w:pPr>
-              <w:pStyle w:val="TableHeading"/>
-              <w:keepNext/>
-              <w:spacing w:line="276" w:lineRule="auto"/>
-              <w:jc w:val="both"/>
-              <w:rPr>
-                <w:b w:val="0"/>
-                <w:bCs w:val="0"/>
-                <w:color w:val="000000"/>
-              </w:rPr>
-            </w:pPr>
-            <w:r>
-              <w:rPr>
-                <w:b w:val="0"/>
-                <w:bCs w:val="0"/>
-                <w:color w:val="000000"/>
-              </w:rPr>
-              <w:t>36.6%</w:t>
-            </w:r>
-          </w:p>
-        </w:tc>
-        <w:tc>
-          <w:tcPr>
-            <w:tcW w:w="1772" w:type="dxa"/>
-          </w:tcPr>
-          <w:p>
-            <w:pPr>
-              <w:pStyle w:val="TableHeading"/>
-              <w:keepNext/>
-              <w:spacing w:line="276" w:lineRule="auto"/>
-              <w:jc w:val="both"/>
-              <w:rPr>
-                <w:b w:val="0"/>
-                <w:bCs w:val="0"/>
-                <w:color w:val="000000"/>
-              </w:rPr>
-            </w:pPr>
-            <w:r>
-              <w:rPr>
-                <w:b w:val="0"/>
-                <w:bCs w:val="0"/>
-                <w:color w:val="000000"/>
-              </w:rPr>
-              <w:t>5</w:t>
-            </w:r>
-          </w:p>
-        </w:tc>
-      </w:tr>
-      <w:tr>
-        <w:trPr>
-          <w:trHeight w:val="277"/>
-          <w:jc w:val="center"/>
-        </w:trPr>
-        <w:tc>
-          <w:tcPr>
-            <w:tcW w:w="1772" w:type="dxa"/>
-            <w:tcBorders>
-              <w:bottom w:val="single" w:sz="4" w:space="0" w:color="auto"/>
-            </w:tcBorders>
-          </w:tcPr>
-          <w:p>
-            <w:pPr>
-              <w:pStyle w:val="TableHeading"/>
-              <w:keepNext/>
-              <w:spacing w:line="276" w:lineRule="auto"/>
-              <w:jc w:val="both"/>
-              <w:rPr>
-                <w:b w:val="0"/>
-                <w:bCs w:val="0"/>
-                <w:color w:val="000000"/>
-              </w:rPr>
-            </w:pPr>
-            <w:r>
-              <w:rPr>
-                <w:b w:val="0"/>
-                <w:bCs w:val="0"/>
-                <w:color w:val="000000"/>
-              </w:rPr>
-              <w:t>IDEC</w:t>
-            </w:r>
-          </w:p>
-        </w:tc>
-        <w:tc>
-          <w:tcPr>
-            <w:tcW w:w="1772" w:type="dxa"/>
-            <w:tcBorders>
-              <w:bottom w:val="single" w:sz="4" w:space="0" w:color="auto"/>
-            </w:tcBorders>
-          </w:tcPr>
-          <w:p>
-            <w:pPr>
-              <w:pStyle w:val="TableHeading"/>
-              <w:keepNext/>
-              <w:spacing w:line="276" w:lineRule="auto"/>
-              <w:jc w:val="both"/>
-              <w:rPr>
-                <w:b w:val="0"/>
-                <w:bCs w:val="0"/>
-                <w:color w:val="000000"/>
-              </w:rPr>
-            </w:pPr>
-            <w:r>
-              <w:rPr>
-                <w:b w:val="0"/>
-                <w:bCs w:val="0"/>
-                <w:color w:val="000000"/>
-              </w:rPr>
-              <w:t>0.0811</w:t>
-            </w:r>
-          </w:p>
-        </w:tc>
-        <w:tc>
-          <w:tcPr>
-            <w:tcW w:w="1772" w:type="dxa"/>
-            <w:tcBorders>
-              <w:bottom w:val="single" w:sz="4" w:space="0" w:color="auto"/>
-            </w:tcBorders>
-          </w:tcPr>
-          <w:p>
-            <w:pPr>
-              <w:pStyle w:val="TableHeading"/>
-              <w:keepNext/>
-              <w:spacing w:line="276" w:lineRule="auto"/>
-              <w:jc w:val="both"/>
-              <w:rPr>
-                <w:b w:val="0"/>
-                <w:bCs w:val="0"/>
-                <w:color w:val="000000"/>
-              </w:rPr>
-            </w:pPr>
-            <w:r>
-              <w:rPr>
-                <w:b w:val="0"/>
-                <w:bCs w:val="0"/>
-                <w:color w:val="000000"/>
-              </w:rPr>
-              <w:t>38.1%</w:t>
-            </w:r>
-          </w:p>
-        </w:tc>
-        <w:tc>
-          <w:tcPr>
-            <w:tcW w:w="1772" w:type="dxa"/>
-            <w:tcBorders>
-              <w:bottom w:val="single" w:sz="4" w:space="0" w:color="auto"/>
-            </w:tcBorders>
-          </w:tcPr>
-          <w:p>
-            <w:pPr>
-              <w:pStyle w:val="TableHeading"/>
-              <w:keepNext/>
-              <w:spacing w:line="276" w:lineRule="auto"/>
-              <w:jc w:val="both"/>
-              <w:rPr>
-                <w:b w:val="0"/>
-                <w:bCs w:val="0"/>
-                <w:color w:val="000000"/>
-              </w:rPr>
-            </w:pPr>
-            <w:r>
-              <w:rPr>
-                <w:b w:val="0"/>
-                <w:bCs w:val="0"/>
-                <w:color w:val="000000"/>
-              </w:rPr>
-              <w:t>5</w:t>
-            </w:r>
-          </w:p>
-        </w:tc>
-      </w:tr>
-    </w:tbl>
-    <w:p>
-      <w:pPr>
-        <w:pStyle w:val="BodyText"/>
-        <w:rPr>
-          <w:lang w:val="hu-HU"/>
-        </w:rPr>
-      </w:pPr>
-      <w:r>
-        <w:rPr>
-          <w:lang w:val="hu-HU"/>
-        </w:rPr>
-        <w:t>A kapott eredményekből egyértelmű különbség rajzolódott ki a két architektúra között:</w:t>
-      </w:r>
-    </w:p>
-    <w:p>
-      <w:pPr>
-        <w:pStyle w:val="BodyText"/>
-        <w:numPr>
-          <w:ilvl w:val="0"/>
-          <w:numId w:val="11"/>
-        </w:numPr>
-        <w:tabs>
-          <w:tab w:val="clear" w:pos="709"/>
-          <w:tab w:val="left" w:pos="0"/>
-        </w:tabs>
-        <w:rPr>
-          <w:lang w:val="hu-HU"/>
-        </w:rPr>
-      </w:pPr>
-      <w:r>
-        <w:rPr>
-          <w:b/>
-          <w:lang w:val="hu-HU"/>
-        </w:rPr>
-        <w:t>DEC modell:</w:t>
-      </w:r>
-      <w:r>
-        <w:rPr>
-          <w:lang w:val="hu-HU"/>
-        </w:rPr>
-        <w:t xml:space="preserve"> A tisztán klaszterezési hibára optimalizált DEC modell eredményei alulmúlták a várakozásaimat. A 36,6%-os tisztaság és a 0,0682-es ARI érték szinte teljesen megegyezett a K-Means baseline-nal. Ez arra utalt, hogy a dekódoló réteg elhagyása és a kizárólagos klaszterezési irányú optimalizáció miatt a hálózat olyan mértékben torzította a reprezentációt, hogy az elvesztette eredeti strukturális integritását.</w:t>
-      </w:r>
-    </w:p>
-    <w:p>
-      <w:pPr>
-        <w:pStyle w:val="BodyText"/>
-        <w:numPr>
-          <w:ilvl w:val="0"/>
-          <w:numId w:val="11"/>
-        </w:numPr>
-        <w:tabs>
-          <w:tab w:val="clear" w:pos="709"/>
-          <w:tab w:val="left" w:pos="0"/>
-        </w:tabs>
-        <w:rPr>
-          <w:lang w:val="hu-HU"/>
-        </w:rPr>
-      </w:pPr>
-      <w:r>
-        <w:rPr>
-          <w:b/>
-          <w:lang w:val="hu-HU"/>
-        </w:rPr>
-        <w:t>IDEC modell:</w:t>
-      </w:r>
-      <w:r>
-        <w:rPr>
-          <w:lang w:val="hu-HU"/>
-        </w:rPr>
-        <w:t xml:space="preserve"> Az IDEC architektúra ezzel szemben pozitív irányba mozdította a teljesítményt. A 0,0811-es ARI érték és a 38,1%-os tisztaság (Purity) egyaránt meghaladta a baseline eredményeit, bár nem sokkal</w:t>
-      </w:r>
-    </w:p>
-    <w:p>
-      <w:pPr>
-        <w:pStyle w:val="BodyText"/>
-        <w:rPr>
-          <w:b/>
-          <w:lang w:val="hu-HU"/>
-        </w:rPr>
-      </w:pPr>
-      <w:r>
-        <w:rPr>
-          <w:b/>
-          <w:lang w:val="hu-HU"/>
-        </w:rPr>
-        <w:t>Értékelés és szakmai konklúzió</w:t>
-      </w:r>
-    </w:p>
-    <w:p>
-      <w:pPr>
-        <w:pStyle w:val="BodyText"/>
-        <w:rPr>
-          <w:lang w:val="hu-HU"/>
-        </w:rPr>
-      </w:pPr>
-      <w:r>
-        <w:rPr>
-          <w:lang w:val="hu-HU"/>
-        </w:rPr>
-        <w:t>A kísérletsorozat egyik legfontosabb tanulsága, hogy az IDEC modell mérhetően jobban teljesített a DEC-nél. Ez a különbség megerősíti azt a hipotézist, hogy a rekonstrukciós hiba (</w:t>
-      </w:r>
-      <w:r>
-        <w:rPr>
-          <w:i/>
-          <w:lang w:val="hu-HU"/>
-        </w:rPr>
-        <w:t>MSE Loss</w:t>
-      </w:r>
-      <w:r>
-        <w:rPr>
-          <w:lang w:val="hu-HU"/>
-        </w:rPr>
-        <w:t>) megtartása a finomhangolás során kritikus jelentőségű: az IDEC a klaszterezési célok mellett kényszerítette a hálózatot, hogy tartsa meg az EKG-beágyazások eredeti struktúráját.</w:t>
-      </w:r>
-    </w:p>
-    <w:p>
-      <w:pPr>
-        <w:pStyle w:val="BodyText"/>
-        <w:rPr>
-          <w:lang w:val="hu-HU"/>
-        </w:rPr>
-      </w:pPr>
-      <w:r>
-        <w:rPr>
-          <w:lang w:val="hu-HU"/>
-        </w:rPr>
-        <w:t xml:space="preserve">Bár az ARI és a tisztasági mutatók növekedése a mélytanulásos modellek esetén is visszafogott maradt (maximum 38,1%), a kísérlet rávilágított arra a tényre, hogy a MOMENT beágyazások eleve egy olyan nagy pontosságú, sűrített reprezentációt adnak, amelyen a klaszterezési hibák további csökkentése már csak minimális mértékben lehetséges. A mélytanulásos architektúra alkalmazása tehát igazolta, hogy az orvosi adatokban lévő összefonódott mintázatok nem egy </w:t>
-      </w:r>
-      <w:r>
-        <w:rPr>
-          <w:lang w:val="hu-HU"/>
-        </w:rPr>
-        <w:lastRenderedPageBreak/>
-        <w:t xml:space="preserve">technikai hiba, hanem a klinikai valóság része: a betegségek közötti határvonalak a fiziológiai </w:t>
-      </w:r>
-      <w:r>
-        <w:rPr>
-          <w:noProof/>
-        </w:rPr>
-        <w:drawing>
-          <wp:anchor distT="0" distB="0" distL="114300" distR="114300" simplePos="0" relativeHeight="251662336" behindDoc="0" locked="0" layoutInCell="1" allowOverlap="1" wp14:anchorId="38E6CAE7" wp14:editId="5B358F19">
-            <wp:simplePos x="0" y="0"/>
-            <wp:positionH relativeFrom="margin">
-              <wp:align>center</wp:align>
-            </wp:positionH>
-            <wp:positionV relativeFrom="paragraph">
-              <wp:posOffset>449580</wp:posOffset>
-            </wp:positionV>
-            <wp:extent cx="3253371" cy="2520000"/>
-            <wp:effectExtent l="0" t="0" r="4445" b="0"/>
-            <wp:wrapTopAndBottom/>
-            <wp:docPr id="7" name="Picture 7"/>
-            <wp:cNvGraphicFramePr>
-              <a:graphicFrameLocks xmlns:a="http://schemas.openxmlformats.org/drawingml/2006/main" noChangeAspect="1"/>
-            </wp:cNvGraphicFramePr>
-            <a:graphic xmlns:a="http://schemas.openxmlformats.org/drawingml/2006/main">
-              <a:graphicData uri="http://schemas.openxmlformats.org/drawingml/2006/picture">
-                <pic:pic xmlns:pic="http://schemas.openxmlformats.org/drawingml/2006/picture">
-                  <pic:nvPicPr>
-                    <pic:cNvPr id="0" name="Picture 11"/>
                     <pic:cNvPicPr>
                       <a:picLocks noChangeAspect="1" noChangeArrowheads="1"/>
                     </pic:cNvPicPr>
@@ -15011,6 +14372,883 @@
           </wp:anchor>
         </w:drawing>
       </w:r>
+    </w:p>
+    <w:p>
+      <w:pPr>
+        <w:pStyle w:val="BodyText"/>
+        <w:rPr>
+          <w:b/>
+        </w:rPr>
+      </w:pPr>
+      <w:r>
+        <w:rPr>
+          <w:b/>
+        </w:rPr>
+        <w:t>Szakmai értékelés és átvezetés a mélytanulás felé</w:t>
+      </w:r>
+    </w:p>
+    <w:p>
+      <w:pPr>
+        <w:pStyle w:val="BodyText"/>
+      </w:pPr>
+      <w:r>
+        <w:t>A kiegyensúlyozott adathalmazon kapott eredmények kulcsfontosságú felismeréshez vezettek. Amikor megszüntettem a többségi osztály dominanciájából fakadó statisztikai "illúziót", a metrikák (30-38%-os tisztaság) megmutatták a MOMENT-beágyazások geometriai, és a tanulási algoritmusok módszertani határait. A HDBSCAN kudarca és a GMM szerényebb pontossága matematikailag is igazolta azt a geometriai tényt, hogy a különböző EKG-elváltozások az 1024 dimenziós térben hatalmas átfedésben léteznek.</w:t>
+      </w:r>
+    </w:p>
+    <w:p>
+      <w:pPr>
+        <w:pStyle w:val="BodyText"/>
+      </w:pPr>
+      <w:r>
+        <w:t>Ezek a statikus megközelítések (akár távolság-, akár sűrűség-, akár valószínűségalapúak) elérték a határaikat: elfogadták a teret olyannak, amilyennek az alapmodell generálta azt. A klaszterek közötti élesebb elválasztás és a tisztaság további növelése érdekében egyértelművé vált, hogy fel kell hagyni a statikus jellemzőtér elemzésével. A kutatás következő, legösszetettebb fázisában ezért a tér dinamikus, mélytanulás-alapú átrendezésére (Deep Embedded Clustering) tértem át, ahol a neurális hálózat már kifejezetten a betegségcsoportok szeparálhatóságának maximalizálására optimalizálta a beágyazásokat.</w:t>
+      </w:r>
+    </w:p>
+    <w:p>
+      <w:pPr>
+        <w:pStyle w:val="Heading2"/>
+        <w:rPr>
+          <w:lang w:val="hu-HU"/>
+        </w:rPr>
+      </w:pPr>
+      <w:bookmarkStart w:id="50" w:name="_Toc230163382"/>
+      <w:r>
+        <w:rPr>
+          <w:lang w:val="hu-HU"/>
+        </w:rPr>
+        <w:t xml:space="preserve">3.2. </w:t>
+      </w:r>
+      <w:hyperlink w:anchor="__RefHeading___Toc80443503">
+        <w:r>
+          <w:rPr>
+            <w:lang w:val="hu-HU" w:eastAsia="hu-HU"/>
+          </w:rPr>
+          <w:t>DEC és IDEC modellek eredményei</w:t>
+        </w:r>
+        <w:bookmarkEnd w:id="50"/>
+      </w:hyperlink>
+    </w:p>
+    <w:p>
+      <w:pPr>
+        <w:pStyle w:val="BodyText"/>
+        <w:rPr>
+          <w:lang w:val="hu-HU"/>
+        </w:rPr>
+      </w:pPr>
+      <w:r>
+        <w:rPr>
+          <w:lang w:val="hu-HU"/>
+        </w:rPr>
+        <w:t>A kutatásom utolsó fázisában a hagyományos gépi tanulási modellek által felállított korlátokat a mélytanulás alapú, dinamikus tér-átrendezést alkalmazó architektúrákkal kíséreltem meg áttörni. A vizsgálatot a kiegyensúlyozott (</w:t>
+      </w:r>
+      <w:r>
+        <w:rPr>
+          <w:i/>
+          <w:lang w:val="hu-HU"/>
+        </w:rPr>
+        <w:t>balanced</w:t>
+      </w:r>
+      <w:r>
+        <w:rPr>
+          <w:lang w:val="hu-HU"/>
+        </w:rPr>
+        <w:t>) adathalmazon hajtottam végre, 10 dimenziós látens térben. A kiindulási alap (baseline) meghatározásához a 10 dimenziós reprezentációkon először egy hagyományos K-Means klaszterezést futtattam le, amely 37,5%-os tisztaságot (Purity) és 0,0679-es ARI értéket eredményezett. Ezt az értéket tekintettem a finomhangolás (</w:t>
+      </w:r>
+      <w:r>
+        <w:rPr>
+          <w:i/>
+          <w:lang w:val="hu-HU"/>
+        </w:rPr>
+        <w:t>fine-tuning</w:t>
+      </w:r>
+      <w:r>
+        <w:rPr>
+          <w:lang w:val="hu-HU"/>
+        </w:rPr>
+        <w:t>) előtti referencia-állapotnak.</w:t>
+      </w:r>
+    </w:p>
+    <w:p>
+      <w:pPr>
+        <w:pStyle w:val="BodyText"/>
+        <w:rPr>
+          <w:lang w:val="hu-HU"/>
+        </w:rPr>
+      </w:pPr>
+      <w:r>
+        <w:rPr>
+          <w:lang w:val="hu-HU"/>
+        </w:rPr>
+        <w:t>A DEC és IDEC architektúrák tanítása során a célom az volt, hogy a neurális hálózat az autoenkóderes előtanítást követően iteratívan olyan látens reprezentációt alakítson ki, amelyben a diagnosztikai csoportok jobban elkülönülnek.</w:t>
+      </w:r>
+    </w:p>
+    <w:p>
+      <w:pPr>
+        <w:pStyle w:val="BodyText"/>
+        <w:rPr>
+          <w:b/>
+          <w:lang w:val="hu-HU"/>
+        </w:rPr>
+      </w:pPr>
+      <w:r>
+        <w:rPr>
+          <w:b/>
+          <w:lang w:val="hu-HU"/>
+        </w:rPr>
+        <w:t>Az eredmények összehasonlítása</w:t>
+      </w:r>
+    </w:p>
+    <w:p>
+      <w:pPr>
+        <w:pStyle w:val="BodyText"/>
+        <w:rPr>
+          <w:lang w:val="hu-HU"/>
+        </w:rPr>
+      </w:pPr>
+      <w:r>
+        <w:rPr>
+          <w:lang w:val="hu-HU"/>
+        </w:rPr>
+        <w:lastRenderedPageBreak/>
+        <w:t>A két modell teljesítményét az alábbi táblázatban foglaltam össze, ahol a végső, öt klaszterre történő leképezés utáni mutatókat tüntettem fel:</w:t>
+      </w:r>
+    </w:p>
+    <w:tbl>
+      <w:tblPr>
+        <w:tblW w:w="7088" w:type="dxa"/>
+        <w:jc w:val="center"/>
+        <w:tblLayout w:type="fixed"/>
+        <w:tblCellMar>
+          <w:left w:w="0" w:type="dxa"/>
+          <w:right w:w="0" w:type="dxa"/>
+        </w:tblCellMar>
+        <w:tblLook w:val="04A0" w:firstRow="1" w:lastRow="0" w:firstColumn="1" w:lastColumn="0" w:noHBand="0" w:noVBand="1"/>
+      </w:tblPr>
+      <w:tblGrid>
+        <w:gridCol w:w="1772"/>
+        <w:gridCol w:w="1772"/>
+        <w:gridCol w:w="1772"/>
+        <w:gridCol w:w="1772"/>
+      </w:tblGrid>
+      <w:tr>
+        <w:trPr>
+          <w:trHeight w:val="277"/>
+          <w:jc w:val="center"/>
+        </w:trPr>
+        <w:tc>
+          <w:tcPr>
+            <w:tcW w:w="7088" w:type="dxa"/>
+            <w:gridSpan w:val="4"/>
+            <w:tcBorders>
+              <w:top w:val="single" w:sz="6" w:space="0" w:color="000000"/>
+              <w:bottom w:val="single" w:sz="6" w:space="0" w:color="000000"/>
+            </w:tcBorders>
+          </w:tcPr>
+          <w:p>
+            <w:pPr>
+              <w:pStyle w:val="TableHeading"/>
+              <w:keepNext/>
+              <w:spacing w:line="276" w:lineRule="auto"/>
+              <w:jc w:val="both"/>
+              <w:rPr>
+                <w:b w:val="0"/>
+                <w:bCs w:val="0"/>
+                <w:color w:val="000000"/>
+              </w:rPr>
+            </w:pPr>
+            <w:r>
+              <w:rPr>
+                <w:b w:val="0"/>
+                <w:bCs w:val="0"/>
+                <w:color w:val="000000"/>
+              </w:rPr>
+              <w:t>Baseline – DEC – IDEC comparison</w:t>
+            </w:r>
+          </w:p>
+        </w:tc>
+      </w:tr>
+      <w:tr>
+        <w:trPr>
+          <w:trHeight w:val="277"/>
+          <w:jc w:val="center"/>
+        </w:trPr>
+        <w:tc>
+          <w:tcPr>
+            <w:tcW w:w="1772" w:type="dxa"/>
+            <w:tcBorders>
+              <w:top w:val="single" w:sz="6" w:space="0" w:color="000000"/>
+              <w:bottom w:val="single" w:sz="4" w:space="0" w:color="auto"/>
+            </w:tcBorders>
+          </w:tcPr>
+          <w:p>
+            <w:pPr>
+              <w:pStyle w:val="TableHeading"/>
+              <w:keepNext/>
+              <w:spacing w:line="276" w:lineRule="auto"/>
+              <w:jc w:val="both"/>
+              <w:rPr>
+                <w:b w:val="0"/>
+                <w:bCs w:val="0"/>
+                <w:color w:val="000000"/>
+              </w:rPr>
+            </w:pPr>
+            <w:r>
+              <w:rPr>
+                <w:b w:val="0"/>
+                <w:bCs w:val="0"/>
+                <w:color w:val="000000"/>
+              </w:rPr>
+              <w:t>Modell</w:t>
+            </w:r>
+          </w:p>
+        </w:tc>
+        <w:tc>
+          <w:tcPr>
+            <w:tcW w:w="1772" w:type="dxa"/>
+            <w:tcBorders>
+              <w:top w:val="single" w:sz="6" w:space="0" w:color="000000"/>
+              <w:bottom w:val="single" w:sz="4" w:space="0" w:color="auto"/>
+            </w:tcBorders>
+          </w:tcPr>
+          <w:p>
+            <w:pPr>
+              <w:pStyle w:val="TableHeading"/>
+              <w:keepNext/>
+              <w:spacing w:line="276" w:lineRule="auto"/>
+              <w:jc w:val="both"/>
+              <w:rPr>
+                <w:b w:val="0"/>
+                <w:bCs w:val="0"/>
+                <w:color w:val="000000"/>
+              </w:rPr>
+            </w:pPr>
+            <w:r>
+              <w:rPr>
+                <w:b w:val="0"/>
+                <w:bCs w:val="0"/>
+                <w:color w:val="000000"/>
+              </w:rPr>
+              <w:t>Ari</w:t>
+            </w:r>
+          </w:p>
+        </w:tc>
+        <w:tc>
+          <w:tcPr>
+            <w:tcW w:w="1772" w:type="dxa"/>
+            <w:tcBorders>
+              <w:top w:val="single" w:sz="6" w:space="0" w:color="000000"/>
+              <w:bottom w:val="single" w:sz="4" w:space="0" w:color="auto"/>
+            </w:tcBorders>
+          </w:tcPr>
+          <w:p>
+            <w:pPr>
+              <w:pStyle w:val="TableHeading"/>
+              <w:keepNext/>
+              <w:spacing w:line="276" w:lineRule="auto"/>
+              <w:jc w:val="both"/>
+              <w:rPr>
+                <w:b w:val="0"/>
+                <w:bCs w:val="0"/>
+                <w:color w:val="000000"/>
+              </w:rPr>
+            </w:pPr>
+            <w:r>
+              <w:rPr>
+                <w:b w:val="0"/>
+                <w:bCs w:val="0"/>
+                <w:color w:val="000000"/>
+              </w:rPr>
+              <w:t>Purity</w:t>
+            </w:r>
+          </w:p>
+        </w:tc>
+        <w:tc>
+          <w:tcPr>
+            <w:tcW w:w="1772" w:type="dxa"/>
+            <w:tcBorders>
+              <w:top w:val="single" w:sz="6" w:space="0" w:color="000000"/>
+              <w:bottom w:val="single" w:sz="4" w:space="0" w:color="auto"/>
+            </w:tcBorders>
+          </w:tcPr>
+          <w:p>
+            <w:pPr>
+              <w:pStyle w:val="TableHeading"/>
+              <w:keepNext/>
+              <w:spacing w:line="276" w:lineRule="auto"/>
+              <w:jc w:val="both"/>
+              <w:rPr>
+                <w:b w:val="0"/>
+                <w:bCs w:val="0"/>
+                <w:color w:val="000000"/>
+              </w:rPr>
+            </w:pPr>
+            <w:r>
+              <w:rPr>
+                <w:b w:val="0"/>
+                <w:bCs w:val="0"/>
+                <w:color w:val="000000"/>
+              </w:rPr>
+              <w:t>Clusters found</w:t>
+            </w:r>
+          </w:p>
+        </w:tc>
+      </w:tr>
+      <w:tr>
+        <w:trPr>
+          <w:trHeight w:val="277"/>
+          <w:jc w:val="center"/>
+        </w:trPr>
+        <w:tc>
+          <w:tcPr>
+            <w:tcW w:w="1772" w:type="dxa"/>
+            <w:tcBorders>
+              <w:top w:val="single" w:sz="4" w:space="0" w:color="auto"/>
+            </w:tcBorders>
+          </w:tcPr>
+          <w:p>
+            <w:pPr>
+              <w:pStyle w:val="TableHeading"/>
+              <w:keepNext/>
+              <w:spacing w:line="276" w:lineRule="auto"/>
+              <w:jc w:val="both"/>
+              <w:rPr>
+                <w:b w:val="0"/>
+                <w:bCs w:val="0"/>
+                <w:color w:val="000000"/>
+              </w:rPr>
+            </w:pPr>
+            <w:r>
+              <w:rPr>
+                <w:b w:val="0"/>
+                <w:bCs w:val="0"/>
+                <w:color w:val="000000"/>
+              </w:rPr>
+              <w:t>Baseline</w:t>
+            </w:r>
+          </w:p>
+        </w:tc>
+        <w:tc>
+          <w:tcPr>
+            <w:tcW w:w="1772" w:type="dxa"/>
+            <w:tcBorders>
+              <w:top w:val="single" w:sz="4" w:space="0" w:color="auto"/>
+            </w:tcBorders>
+          </w:tcPr>
+          <w:p>
+            <w:pPr>
+              <w:pStyle w:val="TableHeading"/>
+              <w:keepNext/>
+              <w:spacing w:line="276" w:lineRule="auto"/>
+              <w:jc w:val="both"/>
+              <w:rPr>
+                <w:b w:val="0"/>
+                <w:bCs w:val="0"/>
+                <w:color w:val="000000"/>
+              </w:rPr>
+            </w:pPr>
+            <w:r>
+              <w:rPr>
+                <w:b w:val="0"/>
+                <w:bCs w:val="0"/>
+                <w:color w:val="000000"/>
+              </w:rPr>
+              <w:t>0.0679</w:t>
+            </w:r>
+          </w:p>
+        </w:tc>
+        <w:tc>
+          <w:tcPr>
+            <w:tcW w:w="1772" w:type="dxa"/>
+            <w:tcBorders>
+              <w:top w:val="single" w:sz="4" w:space="0" w:color="auto"/>
+            </w:tcBorders>
+          </w:tcPr>
+          <w:p>
+            <w:pPr>
+              <w:pStyle w:val="TableHeading"/>
+              <w:keepNext/>
+              <w:spacing w:line="276" w:lineRule="auto"/>
+              <w:jc w:val="both"/>
+              <w:rPr>
+                <w:b w:val="0"/>
+                <w:bCs w:val="0"/>
+                <w:color w:val="000000"/>
+              </w:rPr>
+            </w:pPr>
+            <w:r>
+              <w:rPr>
+                <w:b w:val="0"/>
+                <w:bCs w:val="0"/>
+                <w:color w:val="000000"/>
+              </w:rPr>
+              <w:t>37.5%</w:t>
+            </w:r>
+          </w:p>
+        </w:tc>
+        <w:tc>
+          <w:tcPr>
+            <w:tcW w:w="1772" w:type="dxa"/>
+            <w:tcBorders>
+              <w:top w:val="single" w:sz="4" w:space="0" w:color="auto"/>
+            </w:tcBorders>
+          </w:tcPr>
+          <w:p>
+            <w:pPr>
+              <w:pStyle w:val="TableHeading"/>
+              <w:keepNext/>
+              <w:spacing w:line="276" w:lineRule="auto"/>
+              <w:jc w:val="both"/>
+              <w:rPr>
+                <w:b w:val="0"/>
+                <w:bCs w:val="0"/>
+                <w:color w:val="000000"/>
+              </w:rPr>
+            </w:pPr>
+            <w:r>
+              <w:rPr>
+                <w:b w:val="0"/>
+                <w:bCs w:val="0"/>
+                <w:color w:val="000000"/>
+              </w:rPr>
+              <w:t>5</w:t>
+            </w:r>
+          </w:p>
+        </w:tc>
+      </w:tr>
+      <w:tr>
+        <w:trPr>
+          <w:trHeight w:val="277"/>
+          <w:jc w:val="center"/>
+        </w:trPr>
+        <w:tc>
+          <w:tcPr>
+            <w:tcW w:w="1772" w:type="dxa"/>
+          </w:tcPr>
+          <w:p>
+            <w:pPr>
+              <w:pStyle w:val="TableHeading"/>
+              <w:keepNext/>
+              <w:spacing w:line="276" w:lineRule="auto"/>
+              <w:jc w:val="both"/>
+              <w:rPr>
+                <w:b w:val="0"/>
+                <w:bCs w:val="0"/>
+                <w:color w:val="000000"/>
+              </w:rPr>
+            </w:pPr>
+            <w:r>
+              <w:rPr>
+                <w:b w:val="0"/>
+                <w:bCs w:val="0"/>
+                <w:color w:val="000000"/>
+              </w:rPr>
+              <w:t>DEC</w:t>
+            </w:r>
+          </w:p>
+        </w:tc>
+        <w:tc>
+          <w:tcPr>
+            <w:tcW w:w="1772" w:type="dxa"/>
+          </w:tcPr>
+          <w:p>
+            <w:pPr>
+              <w:pStyle w:val="TableHeading"/>
+              <w:keepNext/>
+              <w:spacing w:line="276" w:lineRule="auto"/>
+              <w:jc w:val="both"/>
+              <w:rPr>
+                <w:b w:val="0"/>
+                <w:bCs w:val="0"/>
+                <w:color w:val="000000"/>
+              </w:rPr>
+            </w:pPr>
+            <w:r>
+              <w:rPr>
+                <w:b w:val="0"/>
+                <w:bCs w:val="0"/>
+                <w:color w:val="000000"/>
+              </w:rPr>
+              <w:t>0.0682</w:t>
+            </w:r>
+          </w:p>
+        </w:tc>
+        <w:tc>
+          <w:tcPr>
+            <w:tcW w:w="1772" w:type="dxa"/>
+          </w:tcPr>
+          <w:p>
+            <w:pPr>
+              <w:pStyle w:val="TableHeading"/>
+              <w:keepNext/>
+              <w:spacing w:line="276" w:lineRule="auto"/>
+              <w:jc w:val="both"/>
+              <w:rPr>
+                <w:b w:val="0"/>
+                <w:bCs w:val="0"/>
+                <w:color w:val="000000"/>
+              </w:rPr>
+            </w:pPr>
+            <w:r>
+              <w:rPr>
+                <w:b w:val="0"/>
+                <w:bCs w:val="0"/>
+                <w:color w:val="000000"/>
+              </w:rPr>
+              <w:t>36.6%</w:t>
+            </w:r>
+          </w:p>
+        </w:tc>
+        <w:tc>
+          <w:tcPr>
+            <w:tcW w:w="1772" w:type="dxa"/>
+          </w:tcPr>
+          <w:p>
+            <w:pPr>
+              <w:pStyle w:val="TableHeading"/>
+              <w:keepNext/>
+              <w:spacing w:line="276" w:lineRule="auto"/>
+              <w:jc w:val="both"/>
+              <w:rPr>
+                <w:b w:val="0"/>
+                <w:bCs w:val="0"/>
+                <w:color w:val="000000"/>
+              </w:rPr>
+            </w:pPr>
+            <w:r>
+              <w:rPr>
+                <w:b w:val="0"/>
+                <w:bCs w:val="0"/>
+                <w:color w:val="000000"/>
+              </w:rPr>
+              <w:t>5</w:t>
+            </w:r>
+          </w:p>
+        </w:tc>
+      </w:tr>
+      <w:tr>
+        <w:trPr>
+          <w:trHeight w:val="277"/>
+          <w:jc w:val="center"/>
+        </w:trPr>
+        <w:tc>
+          <w:tcPr>
+            <w:tcW w:w="1772" w:type="dxa"/>
+            <w:tcBorders>
+              <w:bottom w:val="single" w:sz="4" w:space="0" w:color="auto"/>
+            </w:tcBorders>
+          </w:tcPr>
+          <w:p>
+            <w:pPr>
+              <w:pStyle w:val="TableHeading"/>
+              <w:keepNext/>
+              <w:spacing w:line="276" w:lineRule="auto"/>
+              <w:jc w:val="both"/>
+              <w:rPr>
+                <w:b w:val="0"/>
+                <w:bCs w:val="0"/>
+                <w:color w:val="000000"/>
+              </w:rPr>
+            </w:pPr>
+            <w:r>
+              <w:rPr>
+                <w:b w:val="0"/>
+                <w:bCs w:val="0"/>
+                <w:color w:val="000000"/>
+              </w:rPr>
+              <w:t>IDEC</w:t>
+            </w:r>
+          </w:p>
+        </w:tc>
+        <w:tc>
+          <w:tcPr>
+            <w:tcW w:w="1772" w:type="dxa"/>
+            <w:tcBorders>
+              <w:bottom w:val="single" w:sz="4" w:space="0" w:color="auto"/>
+            </w:tcBorders>
+          </w:tcPr>
+          <w:p>
+            <w:pPr>
+              <w:pStyle w:val="TableHeading"/>
+              <w:keepNext/>
+              <w:spacing w:line="276" w:lineRule="auto"/>
+              <w:jc w:val="both"/>
+              <w:rPr>
+                <w:b w:val="0"/>
+                <w:bCs w:val="0"/>
+                <w:color w:val="000000"/>
+              </w:rPr>
+            </w:pPr>
+            <w:r>
+              <w:rPr>
+                <w:b w:val="0"/>
+                <w:bCs w:val="0"/>
+                <w:color w:val="000000"/>
+              </w:rPr>
+              <w:t>0.0811</w:t>
+            </w:r>
+          </w:p>
+        </w:tc>
+        <w:tc>
+          <w:tcPr>
+            <w:tcW w:w="1772" w:type="dxa"/>
+            <w:tcBorders>
+              <w:bottom w:val="single" w:sz="4" w:space="0" w:color="auto"/>
+            </w:tcBorders>
+          </w:tcPr>
+          <w:p>
+            <w:pPr>
+              <w:pStyle w:val="TableHeading"/>
+              <w:keepNext/>
+              <w:spacing w:line="276" w:lineRule="auto"/>
+              <w:jc w:val="both"/>
+              <w:rPr>
+                <w:b w:val="0"/>
+                <w:bCs w:val="0"/>
+                <w:color w:val="000000"/>
+              </w:rPr>
+            </w:pPr>
+            <w:r>
+              <w:rPr>
+                <w:b w:val="0"/>
+                <w:bCs w:val="0"/>
+                <w:color w:val="000000"/>
+              </w:rPr>
+              <w:t>38.1%</w:t>
+            </w:r>
+          </w:p>
+        </w:tc>
+        <w:tc>
+          <w:tcPr>
+            <w:tcW w:w="1772" w:type="dxa"/>
+            <w:tcBorders>
+              <w:bottom w:val="single" w:sz="4" w:space="0" w:color="auto"/>
+            </w:tcBorders>
+          </w:tcPr>
+          <w:p>
+            <w:pPr>
+              <w:pStyle w:val="TableHeading"/>
+              <w:keepNext/>
+              <w:spacing w:line="276" w:lineRule="auto"/>
+              <w:jc w:val="both"/>
+              <w:rPr>
+                <w:b w:val="0"/>
+                <w:bCs w:val="0"/>
+                <w:color w:val="000000"/>
+              </w:rPr>
+            </w:pPr>
+            <w:r>
+              <w:rPr>
+                <w:b w:val="0"/>
+                <w:bCs w:val="0"/>
+                <w:color w:val="000000"/>
+              </w:rPr>
+              <w:t>5</w:t>
+            </w:r>
+          </w:p>
+        </w:tc>
+      </w:tr>
+    </w:tbl>
+    <w:p>
+      <w:pPr>
+        <w:pStyle w:val="BodyText"/>
+        <w:rPr>
+          <w:lang w:val="hu-HU"/>
+        </w:rPr>
+      </w:pPr>
+      <w:r>
+        <w:rPr>
+          <w:lang w:val="hu-HU"/>
+        </w:rPr>
+        <w:t>A kapott eredményekből egyértelmű különbség rajzolódott ki a két architektúra között:</w:t>
+      </w:r>
+    </w:p>
+    <w:p>
+      <w:pPr>
+        <w:pStyle w:val="BodyText"/>
+        <w:numPr>
+          <w:ilvl w:val="0"/>
+          <w:numId w:val="11"/>
+        </w:numPr>
+        <w:tabs>
+          <w:tab w:val="clear" w:pos="709"/>
+          <w:tab w:val="left" w:pos="0"/>
+        </w:tabs>
+        <w:rPr>
+          <w:lang w:val="hu-HU"/>
+        </w:rPr>
+      </w:pPr>
+      <w:r>
+        <w:rPr>
+          <w:b/>
+          <w:lang w:val="hu-HU"/>
+        </w:rPr>
+        <w:t>DEC modell:</w:t>
+      </w:r>
+      <w:r>
+        <w:rPr>
+          <w:lang w:val="hu-HU"/>
+        </w:rPr>
+        <w:t xml:space="preserve"> A tisztán klaszterezési hibára optimalizált DEC modell eredményei alulmúlták a várakozásaimat. A 36,6%-os tisztaság és a 0,0682-es ARI érték szinte teljesen megegyezett a K-Means baseline-nal. Ez arra utalt, hogy a dekódoló réteg elhagyása és a kizárólagos klaszterezési irányú optimalizáció miatt a hálózat olyan mértékben torzította a reprezentációt, hogy az elvesztette eredeti strukturális integritását.</w:t>
+      </w:r>
+    </w:p>
+    <w:p>
+      <w:pPr>
+        <w:pStyle w:val="BodyText"/>
+        <w:numPr>
+          <w:ilvl w:val="0"/>
+          <w:numId w:val="11"/>
+        </w:numPr>
+        <w:tabs>
+          <w:tab w:val="clear" w:pos="709"/>
+          <w:tab w:val="left" w:pos="0"/>
+        </w:tabs>
+        <w:rPr>
+          <w:lang w:val="hu-HU"/>
+        </w:rPr>
+      </w:pPr>
+      <w:r>
+        <w:rPr>
+          <w:b/>
+          <w:lang w:val="hu-HU"/>
+        </w:rPr>
+        <w:t>IDEC modell:</w:t>
+      </w:r>
+      <w:r>
+        <w:rPr>
+          <w:lang w:val="hu-HU"/>
+        </w:rPr>
+        <w:t xml:space="preserve"> Az IDEC architektúra ezzel szemben pozitív irányba mozdította a teljesítményt. A 0,0811-es ARI érték és a 38,1%-os tisztaság (Purity) egyaránt meghaladta a baseline eredményeit, bár nem sokkal</w:t>
+      </w:r>
+    </w:p>
+    <w:p>
+      <w:pPr>
+        <w:pStyle w:val="BodyText"/>
+        <w:rPr>
+          <w:b/>
+          <w:lang w:val="hu-HU"/>
+        </w:rPr>
+      </w:pPr>
+      <w:r>
+        <w:rPr>
+          <w:b/>
+          <w:lang w:val="hu-HU"/>
+        </w:rPr>
+        <w:t>Értékelés és szakmai konklúzió</w:t>
+      </w:r>
+    </w:p>
+    <w:p>
+      <w:pPr>
+        <w:pStyle w:val="BodyText"/>
+        <w:rPr>
+          <w:lang w:val="hu-HU"/>
+        </w:rPr>
+      </w:pPr>
+      <w:r>
+        <w:rPr>
+          <w:lang w:val="hu-HU"/>
+        </w:rPr>
+        <w:t>A kísérletsorozat egyik legfontosabb tanulsága, hogy az IDEC modell mérhetően jobban teljesített a DEC-nél. Ez a különbség megerősíti azt a hipotézist, hogy a rekonstrukciós hiba (</w:t>
+      </w:r>
+      <w:r>
+        <w:rPr>
+          <w:i/>
+          <w:lang w:val="hu-HU"/>
+        </w:rPr>
+        <w:t>MSE Loss</w:t>
+      </w:r>
+      <w:r>
+        <w:rPr>
+          <w:lang w:val="hu-HU"/>
+        </w:rPr>
+        <w:t>) megtartása a finomhangolás során kritikus jelentőségű: az IDEC a klaszterezési célok mellett kényszerítette a hálózatot, hogy tartsa meg az EKG-beágyazások eredeti struktúráját.</w:t>
+      </w:r>
+    </w:p>
+    <w:p>
+      <w:pPr>
+        <w:pStyle w:val="BodyText"/>
+        <w:rPr>
+          <w:lang w:val="hu-HU"/>
+        </w:rPr>
+      </w:pPr>
+      <w:r>
+        <w:rPr>
+          <w:lang w:val="hu-HU"/>
+        </w:rPr>
+        <w:t xml:space="preserve">Bár az ARI és a tisztasági mutatók növekedése a mélytanulásos modellek esetén is visszafogott maradt (maximum 38,1%), a kísérlet rávilágított arra a tényre, hogy a MOMENT beágyazások eleve egy olyan nagy pontosságú, sűrített reprezentációt adnak, amelyen a klaszterezési hibák további csökkentése már csak minimális mértékben lehetséges. A mélytanulásos architektúra alkalmazása tehát igazolta, hogy az orvosi adatokban lévő összefonódott mintázatok nem egy </w:t>
+      </w:r>
+      <w:r>
+        <w:rPr>
+          <w:lang w:val="hu-HU"/>
+        </w:rPr>
+        <w:lastRenderedPageBreak/>
+        <w:t xml:space="preserve">technikai hiba, hanem a klinikai valóság része: a betegségek közötti határvonalak a fiziológiai </w:t>
+      </w:r>
+      <w:r>
+        <w:rPr>
+          <w:noProof/>
+        </w:rPr>
+        <w:drawing>
+          <wp:anchor distT="0" distB="0" distL="114300" distR="114300" simplePos="0" relativeHeight="251662336" behindDoc="0" locked="0" layoutInCell="1" allowOverlap="1" wp14:anchorId="38E6CAE7" wp14:editId="5B358F19">
+            <wp:simplePos x="0" y="0"/>
+            <wp:positionH relativeFrom="margin">
+              <wp:align>center</wp:align>
+            </wp:positionH>
+            <wp:positionV relativeFrom="paragraph">
+              <wp:posOffset>449580</wp:posOffset>
+            </wp:positionV>
+            <wp:extent cx="3253371" cy="2520000"/>
+            <wp:effectExtent l="0" t="0" r="4445" b="0"/>
+            <wp:wrapTopAndBottom/>
+            <wp:docPr id="7" name="Picture 7"/>
+            <wp:cNvGraphicFramePr>
+              <a:graphicFrameLocks xmlns:a="http://schemas.openxmlformats.org/drawingml/2006/main" noChangeAspect="1"/>
+            </wp:cNvGraphicFramePr>
+            <a:graphic xmlns:a="http://schemas.openxmlformats.org/drawingml/2006/main">
+              <a:graphicData uri="http://schemas.openxmlformats.org/drawingml/2006/picture">
+                <pic:pic xmlns:pic="http://schemas.openxmlformats.org/drawingml/2006/picture">
+                  <pic:nvPicPr>
+                    <pic:cNvPr id="0" name="Picture 11"/>
+                    <pic:cNvPicPr>
+                      <a:picLocks noChangeAspect="1" noChangeArrowheads="1"/>
+                    </pic:cNvPicPr>
+                  </pic:nvPicPr>
+                  <pic:blipFill>
+                    <a:blip r:embed="rId12">
+                      <a:extLst>
+                        <a:ext uri="{28A0092B-C50C-407E-A947-70E740481C1C}">
+                          <a14:useLocalDpi xmlns:a14="http://schemas.microsoft.com/office/drawing/2010/main" val="0"/>
+                        </a:ext>
+                      </a:extLst>
+                    </a:blip>
+                    <a:srcRect/>
+                    <a:stretch>
+                      <a:fillRect/>
+                    </a:stretch>
+                  </pic:blipFill>
+                  <pic:spPr bwMode="auto">
+                    <a:xfrm>
+                      <a:off x="0" y="0"/>
+                      <a:ext cx="3253371" cy="2520000"/>
+                    </a:xfrm>
+                    <a:prstGeom prst="rect">
+                      <a:avLst/>
+                    </a:prstGeom>
+                    <a:noFill/>
+                    <a:ln>
+                      <a:noFill/>
+                    </a:ln>
+                  </pic:spPr>
+                </pic:pic>
+              </a:graphicData>
+            </a:graphic>
+            <wp14:sizeRelH relativeFrom="page">
+              <wp14:pctWidth>0</wp14:pctWidth>
+            </wp14:sizeRelH>
+            <wp14:sizeRelV relativeFrom="page">
+              <wp14:pctHeight>0</wp14:pctHeight>
+            </wp14:sizeRelV>
+          </wp:anchor>
+        </w:drawing>
+      </w:r>
       <w:r>
         <w:rPr>
           <w:lang w:val="hu-HU"/>
@@ -15566,7 +15804,7 @@
       <w:r>
         <w:t xml:space="preserve"> </w:t>
       </w:r>
-      <w:hyperlink r:id="rId12" w:history="1">
+      <w:hyperlink r:id="rId13" w:history="1">
         <w:r>
           <w:rPr>
             <w:rStyle w:val="Hyperlink"/>
@@ -15598,7 +15836,7 @@
       <w:r>
         <w:t xml:space="preserve"> </w:t>
       </w:r>
-      <w:hyperlink r:id="rId13" w:history="1">
+      <w:hyperlink r:id="rId14" w:history="1">
         <w:r>
           <w:rPr>
             <w:rStyle w:val="Hyperlink"/>
@@ -15630,7 +15868,7 @@
       <w:r>
         <w:t xml:space="preserve"> </w:t>
       </w:r>
-      <w:hyperlink r:id="rId14" w:history="1">
+      <w:hyperlink r:id="rId15" w:history="1">
         <w:r>
           <w:rPr>
             <w:rStyle w:val="Hyperlink"/>
@@ -15659,7 +15897,7 @@
       <w:r>
         <w:t xml:space="preserve">, 2018. Elérhető: </w:t>
       </w:r>
-      <w:hyperlink r:id="rId15" w:history="1">
+      <w:hyperlink r:id="rId16" w:history="1">
         <w:r>
           <w:rPr>
             <w:rStyle w:val="Hyperlink"/>
@@ -15691,7 +15929,7 @@
       <w:r>
         <w:t xml:space="preserve"> </w:t>
       </w:r>
-      <w:hyperlink r:id="rId16" w:history="1">
+      <w:hyperlink r:id="rId17" w:history="1">
         <w:r>
           <w:rPr>
             <w:rStyle w:val="Hyperlink"/>
@@ -15723,7 +15961,7 @@
       <w:r>
         <w:t xml:space="preserve"> </w:t>
       </w:r>
-      <w:hyperlink r:id="rId17" w:history="1">
+      <w:hyperlink r:id="rId18" w:history="1">
         <w:r>
           <w:rPr>
             <w:rStyle w:val="Hyperlink"/>
@@ -15755,7 +15993,7 @@
       <w:r>
         <w:t xml:space="preserve"> </w:t>
       </w:r>
-      <w:hyperlink r:id="rId18" w:history="1">
+      <w:hyperlink r:id="rId19" w:history="1">
         <w:r>
           <w:rPr>
             <w:rStyle w:val="Hyperlink"/>
@@ -15784,7 +16022,7 @@
       <w:r>
         <w:t xml:space="preserve">, 2019. Elérhető: </w:t>
       </w:r>
-      <w:hyperlink r:id="rId19" w:history="1">
+      <w:hyperlink r:id="rId20" w:history="1">
         <w:r>
           <w:rPr>
             <w:rStyle w:val="Hyperlink"/>
@@ -15816,7 +16054,7 @@
       <w:r>
         <w:t xml:space="preserve"> </w:t>
       </w:r>
-      <w:hyperlink r:id="rId20" w:history="1">
+      <w:hyperlink r:id="rId21" w:history="1">
         <w:r>
           <w:rPr>
             <w:rStyle w:val="Hyperlink"/>
@@ -15848,7 +16086,7 @@
       <w:r>
         <w:t xml:space="preserve"> </w:t>
       </w:r>
-      <w:hyperlink r:id="rId21" w:history="1">
+      <w:hyperlink r:id="rId22" w:history="1">
         <w:r>
           <w:rPr>
             <w:rStyle w:val="Hyperlink"/>
@@ -15862,6 +16100,97 @@
     </w:p>
     <w:p>
       <w:r>
+        <w:t xml:space="preserve">[11] Giricz Vince, </w:t>
+      </w:r>
+      <w:r>
+        <w:t>"</w:t>
+      </w:r>
+      <w:r>
+        <w:t>Multidimenzionális id</w:t>
+      </w:r>
+      <w:r>
+        <w:t>ő</w:t>
+      </w:r>
+      <w:r>
+        <w:t>sorok el</w:t>
+      </w:r>
+      <w:r>
+        <w:t>ő</w:t>
+      </w:r>
+      <w:r>
+        <w:t>feldolgozása és osztályozása deep</w:t>
+      </w:r>
+      <w:r>
+        <w:t xml:space="preserve"> </w:t>
+      </w:r>
+      <w:r>
+        <w:t>learning alapú megközelítésekkel</w:t>
+      </w:r>
+      <w:r>
+        <w:t>,</w:t>
+      </w:r>
+      <w:r>
+        <w:t>"</w:t>
+      </w:r>
+      <w:r>
+        <w:t xml:space="preserve"> </w:t>
+      </w:r>
+      <w:r>
+        <w:rPr>
+          <w:i/>
+          <w:iCs/>
+        </w:rPr>
+        <w:t>GitHub repozitórium</w:t>
+      </w:r>
+      <w:r>
+        <w:t xml:space="preserve">, 2026. Elérhető: </w:t>
+      </w:r>
+      <w:hyperlink r:id="rId23" w:history="1">
+        <w:r>
+          <w:rPr>
+            <w:rStyle w:val="Hyperlink"/>
+          </w:rPr>
+          <w:t>https://github.com/Gvince04/Szakdolgozat/tree/main</w:t>
+        </w:r>
+      </w:hyperlink>
+      <w:r>
+        <w:t xml:space="preserve"> </w:t>
+      </w:r>
+    </w:p>
+    <w:p>
+      <w:r>
+        <w:t xml:space="preserve">[12] </w:t>
+      </w:r>
+      <w:r>
+        <w:t xml:space="preserve">M. Goswami és mtsai., "MOMENT hivatalos forráskód," </w:t>
+      </w:r>
+      <w:r>
+        <w:rPr>
+          <w:i/>
+          <w:iCs/>
+        </w:rPr>
+        <w:t>GitHub repozitórium</w:t>
+      </w:r>
+      <w:r>
+        <w:t>, 2024. Elérhető:</w:t>
+      </w:r>
+      <w:r>
+        <w:t xml:space="preserve"> </w:t>
+      </w:r>
+      <w:hyperlink r:id="rId24" w:history="1">
+        <w:r>
+          <w:rPr>
+            <w:rStyle w:val="Hyperlink"/>
+          </w:rPr>
+          <w:t>https://github.com/moment-timeseries-foundation-model/moment</w:t>
+        </w:r>
+      </w:hyperlink>
+      <w:r>
+        <w:t xml:space="preserve"> </w:t>
+      </w:r>
+    </w:p>
+    <w:p>
+      <w:r>
         <w:br w:type="page"/>
       </w:r>
     </w:p>
@@ -16204,7 +16533,7 @@
       </w:pPr>
     </w:p>
     <w:sectPr>
-      <w:footerReference w:type="default" r:id="rId22"/>
+      <w:footerReference w:type="default" r:id="rId25"/>
       <w:pgSz w:w="11906" w:h="16838"/>
       <w:pgMar w:top="1417" w:right="1417" w:bottom="1417" w:left="1417" w:header="0" w:footer="708" w:gutter="0"/>
       <w:pgNumType w:start="2"/>
@@ -18963,6 +19292,7 @@
   <w:style w:type="paragraph" w:styleId="BodyText">
     <w:name w:val="Body Text"/>
     <w:basedOn w:val="Normal"/>
+    <w:link w:val="BodyTextChar"/>
     <w:pPr>
       <w:spacing w:after="140" w:line="276" w:lineRule="auto"/>
       <w:jc w:val="both"/>
@@ -19568,6 +19898,62 @@
       <w:u w:val="single"/>
     </w:rPr>
   </w:style>
+  <w:style w:type="paragraph" w:customStyle="1" w:styleId="pf0">
+    <w:name w:val="pf0"/>
+    <w:basedOn w:val="Normal"/>
+    <w:rsid w:val="009919DB"/>
+    <w:pPr>
+      <w:suppressAutoHyphens w:val="0"/>
+      <w:spacing w:before="100" w:beforeAutospacing="1" w:after="100" w:afterAutospacing="1"/>
+    </w:pPr>
+    <w:rPr>
+      <w:lang w:val="hu-HU" w:eastAsia="hu-HU"/>
+    </w:rPr>
+  </w:style>
+  <w:style w:type="character" w:customStyle="1" w:styleId="cf01">
+    <w:name w:val="cf01"/>
+    <w:basedOn w:val="DefaultParagraphFont"/>
+    <w:rsid w:val="009919DB"/>
+    <w:rPr>
+      <w:rFonts w:ascii="Segoe UI" w:hAnsi="Segoe UI" w:cs="Segoe UI" w:hint="default"/>
+      <w:sz w:val="18"/>
+      <w:szCs w:val="18"/>
+    </w:rPr>
+  </w:style>
+  <w:style w:type="paragraph" w:styleId="NormalWeb">
+    <w:name w:val="Normal (Web)"/>
+    <w:basedOn w:val="Normal"/>
+    <w:uiPriority w:val="99"/>
+    <w:unhideWhenUsed/>
+    <w:rsid w:val="009919DB"/>
+    <w:pPr>
+      <w:suppressAutoHyphens w:val="0"/>
+      <w:spacing w:before="100" w:beforeAutospacing="1" w:after="100" w:afterAutospacing="1"/>
+    </w:pPr>
+    <w:rPr>
+      <w:lang w:val="hu-HU" w:eastAsia="hu-HU"/>
+    </w:rPr>
+  </w:style>
+  <w:style w:type="character" w:customStyle="1" w:styleId="cf11">
+    <w:name w:val="cf11"/>
+    <w:basedOn w:val="DefaultParagraphFont"/>
+    <w:rsid w:val="009919DB"/>
+    <w:rPr>
+      <w:rFonts w:ascii="Segoe UI" w:hAnsi="Segoe UI" w:cs="Segoe UI" w:hint="default"/>
+      <w:sz w:val="18"/>
+      <w:szCs w:val="18"/>
+    </w:rPr>
+  </w:style>
+  <w:style w:type="character" w:customStyle="1" w:styleId="BodyTextChar">
+    <w:name w:val="Body Text Char"/>
+    <w:basedOn w:val="DefaultParagraphFont"/>
+    <w:link w:val="BodyText"/>
+    <w:rsid w:val="00C53E7C"/>
+    <w:rPr>
+      <w:rFonts w:ascii="Times New Roman" w:eastAsia="Times New Roman" w:hAnsi="Times New Roman" w:cs="Times New Roman"/>
+      <w:lang w:val="en-US" w:bidi="ar-SA"/>
+    </w:rPr>
+  </w:style>
 </w:styles>
 </file>
 
@@ -19677,4 +20063,16 @@
   <a:objectDefaults/>
   <a:extraClrSchemeLst/>
 </a:theme>
+</file>
+
+<file path=customXml/item1.xml><?xml version="1.0" encoding="utf-8"?>
+<b:Sources xmlns:b="http://schemas.openxmlformats.org/officeDocument/2006/bibliography" xmlns="http://schemas.openxmlformats.org/officeDocument/2006/bibliography" SelectedStyle="\APASixthEditionOfficeOnline.xsl" StyleName="APA" Version="6"/>
+</file>
+
+<file path=customXml/itemProps1.xml><?xml version="1.0" encoding="utf-8"?>
+<ds:datastoreItem xmlns:ds="http://schemas.openxmlformats.org/officeDocument/2006/customXml" ds:itemID="{5F3BEAE8-6980-4B29-B9AC-5DF9C5BCAEC2}">
+  <ds:schemaRefs>
+    <ds:schemaRef ds:uri="http://schemas.openxmlformats.org/officeDocument/2006/bibliography"/>
+  </ds:schemaRefs>
+</ds:datastoreItem>
 </file>
</xml_diff>

<commit_message>
Szakdolgozat - pdf feltöltése
</commit_message>
<xml_diff>
--- a/Szakdolgozat/szakdolgozat.docx
+++ b/Szakdolgozat/szakdolgozat.docx
@@ -2326,21 +2326,7 @@
                 <w:rStyle w:val="Hyperlink"/>
                 <w:noProof/>
               </w:rPr>
-              <w:t xml:space="preserve">2.3.1. A MOMENT alapmodell elméleti háttere </w:t>
-            </w:r>
-            <w:r>
-              <w:rPr>
-                <w:rStyle w:val="Hyperlink"/>
-                <w:noProof/>
-              </w:rPr>
-              <w:t>é</w:t>
-            </w:r>
-            <w:r>
-              <w:rPr>
-                <w:rStyle w:val="Hyperlink"/>
-                <w:noProof/>
-              </w:rPr>
-              <w:t>s működése</w:t>
+              <w:t>2.3.1. A MOMENT alapmodell elméleti háttere és működése</w:t>
             </w:r>
             <w:r>
               <w:rPr>
@@ -4226,7 +4212,7 @@
               <w:rPr>
                 <w:noProof/>
               </w:rPr>
-              <w:t>44</w:t>
+              <w:t>45</w:t>
             </w:r>
             <w:r>
               <w:rPr>
@@ -5207,7 +5193,27 @@
           <w:bCs/>
           <w:lang w:val="hu-HU"/>
         </w:rPr>
-        <w:t>[</w:t>
+        <w:t>[9]</w:t>
+      </w:r>
+      <w:r>
+        <w:rPr>
+          <w:lang w:val="hu-HU"/>
+        </w:rPr>
+        <w:t>. Ez a metrika azt méri, hogy egy adott adatpont mennyire hasonlít a saját klaszterébe tartozó többi ponthoz (kohézió), összehasonlítva a legközelebbi szomszédos klaszter pontjaival (szeparáció). Értéke -1 és +1 között mozog: a +1 közeli érték jól elkülönült, sűrű klasztereket jelez, a 0 körüli érték egymásra lógó csoportokra utal, míg a negatív értékek azt mutatják, hogy a pontok rossz klaszterbe kerültek. Mivel ehhez nem kellenek a valós címkék, ez a mutató magát a geometriai szerkezetet értékeli.</w:t>
+      </w:r>
+    </w:p>
+    <w:p>
+      <w:pPr>
+        <w:pStyle w:val="BodyText"/>
+        <w:rPr>
+          <w:lang w:val="hu-HU"/>
+        </w:rPr>
+      </w:pPr>
+      <w:r>
+        <w:rPr>
+          <w:lang w:val="hu-HU"/>
+        </w:rPr>
+        <w:t xml:space="preserve">A külső validációhoz – vagyis a megtalált klaszterek és a megtartott valós diagnosztikai főosztályok összevetéséhez – a Korrigált Rand-indexet (Adjusted Rand Index – ARI) használtam </w:t>
       </w:r>
       <w:r>
         <w:rPr>
@@ -5215,7 +5221,27 @@
           <w:bCs/>
           <w:lang w:val="hu-HU"/>
         </w:rPr>
-        <w:t>9</w:t>
+        <w:t>[10]</w:t>
+      </w:r>
+      <w:r>
+        <w:rPr>
+          <w:lang w:val="hu-HU"/>
+        </w:rPr>
+        <w:t>. Az ARI a modell által jósolt klaszterek és a valós címkék közötti hasonlóságot méri azáltal, hogy párba állítja az adatpontokat, és megnézi, hogy a modell és a valóság ugyanoda sorolta-e őket. A mutató nagy előnye, hogy tartalmaz egy javító tényezőt, amely kiszűri a tisztán véletlenszerű egybeesések esélyét. Értéke leggyakrabban 0 és 1 között alakul, ahol az 1 a tökéletes egyezést, a 0 pedig a teljesen véletlenszerű csoportosítást jelenti.</w:t>
+      </w:r>
+    </w:p>
+    <w:p>
+      <w:pPr>
+        <w:pStyle w:val="BodyText"/>
+        <w:rPr>
+          <w:lang w:val="hu-HU"/>
+        </w:rPr>
+      </w:pPr>
+      <w:r>
+        <w:rPr>
+          <w:lang w:val="hu-HU"/>
+        </w:rPr>
+        <w:t xml:space="preserve">Ugyancsak a külső kiértékelést szolgálja a Normalizált Kölcsönös Információ (Normalized Mutual Information – NMI) metrika </w:t>
       </w:r>
       <w:r>
         <w:rPr>
@@ -5223,95 +5249,7 @@
           <w:bCs/>
           <w:lang w:val="hu-HU"/>
         </w:rPr>
-        <w:t>]</w:t>
-      </w:r>
-      <w:r>
-        <w:rPr>
-          <w:lang w:val="hu-HU"/>
-        </w:rPr>
-        <w:t>. Ez a metrika azt méri, hogy egy adott adatpont mennyire hasonlít a saját klaszterébe tartozó többi ponthoz (kohézió), összehasonlítva a legközelebbi szomszédos klaszter pontjaival (szeparáció). Értéke -1 és +1 között mozog: a +1 közeli érték jól elkülönült, sűrű klasztereket jelez, a 0 körüli érték egymásra lógó csoportokra utal, míg a negatív értékek azt mutatják, hogy a pontok rossz klaszterbe kerültek. Mivel ehhez nem kellenek a valós címkék, ez a mutató magát a geometriai szerkezetet értékeli.</w:t>
-      </w:r>
-    </w:p>
-    <w:p>
-      <w:pPr>
-        <w:pStyle w:val="BodyText"/>
-        <w:rPr>
-          <w:lang w:val="hu-HU"/>
-        </w:rPr>
-      </w:pPr>
-      <w:r>
-        <w:rPr>
-          <w:lang w:val="hu-HU"/>
-        </w:rPr>
-        <w:t xml:space="preserve">A külső validációhoz – vagyis a megtalált klaszterek és a megtartott valós diagnosztikai főosztályok összevetéséhez – a Korrigált Rand-indexet (Adjusted Rand Index – ARI) használtam </w:t>
-      </w:r>
-      <w:r>
-        <w:rPr>
-          <w:b/>
-          <w:bCs/>
-          <w:lang w:val="hu-HU"/>
-        </w:rPr>
-        <w:t>[1</w:t>
-      </w:r>
-      <w:r>
-        <w:rPr>
-          <w:b/>
-          <w:bCs/>
-          <w:lang w:val="hu-HU"/>
-        </w:rPr>
-        <w:t>0</w:t>
-      </w:r>
-      <w:r>
-        <w:rPr>
-          <w:b/>
-          <w:bCs/>
-          <w:lang w:val="hu-HU"/>
-        </w:rPr>
-        <w:t>]</w:t>
-      </w:r>
-      <w:r>
-        <w:rPr>
-          <w:lang w:val="hu-HU"/>
-        </w:rPr>
-        <w:t>. Az ARI a modell által jósolt klaszterek és a valós címkék közötti hasonlóságot méri azáltal, hogy párba állítja az adatpontokat, és megnézi, hogy a modell és a valóság ugyanoda sorolta-e őket. A mutató nagy előnye, hogy tartalmaz egy javító tényezőt, amely kiszűri a tisztán véletlenszerű egybeesések esélyét. Értéke leggyakrabban 0 és 1 között alakul, ahol az 1 a tökéletes egyezést, a 0 pedig a teljesen véletlenszerű csoportosítást jelenti.</w:t>
-      </w:r>
-    </w:p>
-    <w:p>
-      <w:pPr>
-        <w:pStyle w:val="BodyText"/>
-        <w:rPr>
-          <w:lang w:val="hu-HU"/>
-        </w:rPr>
-      </w:pPr>
-      <w:r>
-        <w:rPr>
-          <w:lang w:val="hu-HU"/>
-        </w:rPr>
-        <w:t xml:space="preserve">Ugyancsak a külső kiértékelést szolgálja a Normalizált Kölcsönös Információ (Normalized Mutual Information – NMI) metrika </w:t>
-      </w:r>
-      <w:r>
-        <w:rPr>
-          <w:b/>
-          <w:bCs/>
-          <w:lang w:val="hu-HU"/>
-        </w:rPr>
-        <w:t>[1</w:t>
-      </w:r>
-      <w:r>
-        <w:rPr>
-          <w:b/>
-          <w:bCs/>
-          <w:lang w:val="hu-HU"/>
-        </w:rPr>
-        <w:t>1</w:t>
-      </w:r>
-      <w:r>
-        <w:rPr>
-          <w:b/>
-          <w:bCs/>
-          <w:lang w:val="hu-HU"/>
-        </w:rPr>
-        <w:t>]</w:t>
+        <w:t>[11]</w:t>
       </w:r>
       <w:r>
         <w:rPr>
@@ -6808,10 +6746,7 @@
         <w:t>Ebben a fejezetben részletesen bemutatom a foundation modell inicializálásának mérnöki lépéseit, beleértve a feladatspecifikus beállításokat is. Ezt követően kitérek a figyelem-mechanizmushoz (attention) szorosan kapcsolódó bemeneti maszkolás (input mask) logikájára, végezetül pedig ismertetem azokat a szigorú memóriakezelési stratégiákat, amelyek elengedhetetlenek voltak a nagyméretű (large) architektúra szűkös memóriakapacitású lokális hardveren történő stabil futtatásához.</w:t>
       </w:r>
       <w:r>
-        <w:t xml:space="preserve"> Ezen fejezetben bemutatott jellemzőkinyerés</w:t>
-      </w:r>
-      <w:r>
-        <w:t xml:space="preserve"> teljes kódja </w:t>
+        <w:t xml:space="preserve"> Ezen fejezetben bemutatott jellemzőkinyerés teljes kódja </w:t>
       </w:r>
       <w:r>
         <w:lastRenderedPageBreak/>
@@ -7207,10 +7142,7 @@
         <w:t xml:space="preserve">), amely pontosan illeszkedik az adattenzor dimenzióihoz. Ez a maszk jelzi a Transformer architektúra önfigyelmi </w:t>
       </w:r>
       <w:r>
-        <w:t xml:space="preserve"> (self-attention)</w:t>
-      </w:r>
-      <w:r>
-        <w:t xml:space="preserve"> </w:t>
+        <w:t xml:space="preserve"> (self-attention) </w:t>
       </w:r>
       <w:r>
         <w:t>mechanizmusa számára, hogy a tenzor minden eleme valós és releváns adat, amelyet figyelembe kell venni a beágyazások (embeddingek) kiszámítása során. Abban az esetben ha valahol nulla értéket adtam volna meg, az azt jelentette volna a modellnek, hogy az az érték nem releváns, és nem kell figyelembe venni a jellemzőkinyerés folyamatban.</w:t>
@@ -8061,13 +7993,7 @@
         <w:t>/pipeline_scripts/data_classification/</w:t>
       </w:r>
       <w:r>
-        <w:t>data_cl</w:t>
-      </w:r>
-      <w:r>
-        <w:t>assification</w:t>
-      </w:r>
-      <w:r>
-        <w:t>.ipynb)</w:t>
+        <w:t>data_classification.ipynb)</w:t>
       </w:r>
     </w:p>
     <w:p>
@@ -8281,31 +8207,13 @@
         <w:t>/pipeline_scripts/data_classification/</w:t>
       </w:r>
       <w:r>
-        <w:t>data_clustering</w:t>
-      </w:r>
-      <w:r>
-        <w:t>_dbscan</w:t>
-      </w:r>
-      <w:r>
-        <w:t>.ipynb</w:t>
-      </w:r>
-      <w:r>
-        <w:t xml:space="preserve">, </w:t>
-      </w:r>
-      <w:r>
-        <w:t>(</w:t>
+        <w:t>data_clustering_dbscan.ipynb, (</w:t>
       </w:r>
       <w:r>
         <w:t>/pipeline_scripts/data_classification/</w:t>
       </w:r>
       <w:r>
-        <w:t>data_clustering</w:t>
-      </w:r>
-      <w:r>
-        <w:t>_umap_hdbscan</w:t>
-      </w:r>
-      <w:r>
-        <w:t>.ipynb))</w:t>
+        <w:t>data_clustering_umap_hdbscan.ipynb))</w:t>
       </w:r>
     </w:p>
     <w:p>
@@ -9092,22 +9000,13 @@
         <w:t xml:space="preserve"> függvényt (szigorúan csak a valid pontokra szűrve). Ez a metrika végeredményben azt az értéket mutatta meg számomra, hogy ha minden egyes talált klasztert a benne lévő leggyakoribb betegséggel azonosítanék, akkor a zajmentes adatpontok hány százalékát diagnosztizálnám helyesen. A robusztus működés érdekében a függvényt elláttam egy hibakezelő (edge-case) ággal is, amely figyelmeztetést dob, ha a modell egyetlen valid klasztert sem talál, és mindent zajként azonosít.</w:t>
       </w:r>
       <w:r>
-        <w:t xml:space="preserve"> </w:t>
-      </w:r>
-      <w:r>
-        <w:t>(</w:t>
+        <w:t xml:space="preserve"> (</w:t>
       </w:r>
       <w:r>
         <w:t>/pipeline_scripts/data_classification/</w:t>
       </w:r>
       <w:r>
-        <w:t>data_clustering</w:t>
-      </w:r>
-      <w:r>
-        <w:t>_umap_hdbscan_balanced</w:t>
-      </w:r>
-      <w:r>
-        <w:t>.ipynb)</w:t>
+        <w:t>data_clustering_umap_hdbscan_balanced.ipynb)</w:t>
       </w:r>
     </w:p>
     <w:p>
@@ -9142,25 +9041,13 @@
         <w:t>A hagyományos és sűrűségalapú gépi tanulási kísérletek rávilágítottak arra, hogy az osztályok közötti geometriai átfedések miatt a beágyazási tér további, célzott finomhangolására (fine-tuning) van szükség. Ennek megvalósítására a mélytanulás alapú klaszterezés (Deep Clustering) felé fordultam, megvizsgálva a DEC (Deep Embedding Clustering) és az IDEC (Improved Deep Embedding Clustering) architektúrákat.</w:t>
       </w:r>
       <w:r>
-        <w:t xml:space="preserve"> Az ebben a fejezetben leírtak a repozitórium </w:t>
-      </w:r>
-      <w:r>
-        <w:t xml:space="preserve"> </w:t>
+        <w:t xml:space="preserve"> Az ebben a fejezetben leírtak a repozitórium  </w:t>
       </w:r>
       <w:r>
         <w:t>/pipeline_scripts/data_classification/</w:t>
       </w:r>
       <w:r>
-        <w:t>data_clustering</w:t>
-      </w:r>
-      <w:r>
-        <w:t>_dec</w:t>
-      </w:r>
-      <w:r>
-        <w:t>.ipynb</w:t>
-      </w:r>
-      <w:r>
-        <w:t xml:space="preserve"> fájljában található.</w:t>
+        <w:t>data_clustering_dec.ipynb fájljában található.</w:t>
       </w:r>
     </w:p>
     <w:p>
@@ -12356,15 +12243,7 @@
                 <w:color w:val="000000"/>
               </w:rPr>
               <w:lastRenderedPageBreak/>
-              <w:t xml:space="preserve">Detailed Classification Report – </w:t>
-            </w:r>
-            <w:r>
-              <w:rPr>
-                <w:b w:val="0"/>
-                <w:bCs w:val="0"/>
-                <w:color w:val="000000"/>
-              </w:rPr>
-              <w:t>K-Means (baseline)</w:t>
+              <w:t>Detailed Classification Report – K-Means (baseline)</w:t>
             </w:r>
           </w:p>
         </w:tc>
@@ -12543,13 +12422,7 @@
               <w:rPr>
                 <w:color w:val="000000"/>
               </w:rPr>
-              <w:t>0.</w:t>
-            </w:r>
-            <w:r>
-              <w:rPr>
-                <w:color w:val="000000"/>
-              </w:rPr>
-              <w:t>69</w:t>
+              <w:t>0.69</w:t>
             </w:r>
           </w:p>
         </w:tc>
@@ -12572,13 +12445,7 @@
               <w:rPr>
                 <w:color w:val="000000"/>
               </w:rPr>
-              <w:t>0.</w:t>
-            </w:r>
-            <w:r>
-              <w:rPr>
-                <w:color w:val="000000"/>
-              </w:rPr>
-              <w:t>32</w:t>
+              <w:t>0.32</w:t>
             </w:r>
           </w:p>
         </w:tc>
@@ -12601,13 +12468,7 @@
               <w:rPr>
                 <w:color w:val="000000"/>
               </w:rPr>
-              <w:t>0.</w:t>
-            </w:r>
-            <w:r>
-              <w:rPr>
-                <w:color w:val="000000"/>
-              </w:rPr>
-              <w:t>43</w:t>
+              <w:t>0.43</w:t>
             </w:r>
           </w:p>
         </w:tc>
@@ -14120,15 +13981,7 @@
                 <w:bCs w:val="0"/>
                 <w:color w:val="000000"/>
               </w:rPr>
-              <w:t xml:space="preserve">Detailed Classification Report – </w:t>
-            </w:r>
-            <w:r>
-              <w:rPr>
-                <w:b w:val="0"/>
-                <w:bCs w:val="0"/>
-                <w:color w:val="000000"/>
-              </w:rPr>
-              <w:t>GMM (balanced)</w:t>
+              <w:t>Detailed Classification Report – GMM (balanced)</w:t>
             </w:r>
           </w:p>
         </w:tc>
@@ -14307,13 +14160,7 @@
               <w:rPr>
                 <w:color w:val="000000"/>
               </w:rPr>
-              <w:t>0.</w:t>
-            </w:r>
-            <w:r>
-              <w:rPr>
-                <w:color w:val="000000"/>
-              </w:rPr>
-              <w:t>42</w:t>
+              <w:t>0.42</w:t>
             </w:r>
           </w:p>
         </w:tc>
@@ -14336,13 +14183,7 @@
               <w:rPr>
                 <w:color w:val="000000"/>
               </w:rPr>
-              <w:t>0.</w:t>
-            </w:r>
-            <w:r>
-              <w:rPr>
-                <w:color w:val="000000"/>
-              </w:rPr>
-              <w:t>52</w:t>
+              <w:t>0.52</w:t>
             </w:r>
           </w:p>
         </w:tc>
@@ -14365,13 +14206,7 @@
               <w:rPr>
                 <w:color w:val="000000"/>
               </w:rPr>
-              <w:t>0.4</w:t>
-            </w:r>
-            <w:r>
-              <w:rPr>
-                <w:color w:val="000000"/>
-              </w:rPr>
-              <w:t>7</w:t>
+              <w:t>0.47</w:t>
             </w:r>
           </w:p>
         </w:tc>
@@ -14655,13 +14490,7 @@
               <w:rPr>
                 <w:color w:val="000000"/>
               </w:rPr>
-              <w:t>0.</w:t>
-            </w:r>
-            <w:r>
-              <w:rPr>
-                <w:color w:val="000000"/>
-              </w:rPr>
-              <w:t>36</w:t>
+              <w:t>0.36</w:t>
             </w:r>
           </w:p>
         </w:tc>
@@ -14701,13 +14530,7 @@
               <w:rPr>
                 <w:color w:val="000000"/>
               </w:rPr>
-              <w:t>0.</w:t>
-            </w:r>
-            <w:r>
-              <w:rPr>
-                <w:color w:val="000000"/>
-              </w:rPr>
-              <w:t>44</w:t>
+              <w:t>0.44</w:t>
             </w:r>
           </w:p>
         </w:tc>
@@ -14774,13 +14597,7 @@
               <w:rPr>
                 <w:color w:val="000000"/>
               </w:rPr>
-              <w:t>0.</w:t>
-            </w:r>
-            <w:r>
-              <w:rPr>
-                <w:color w:val="000000"/>
-              </w:rPr>
-              <w:t>34</w:t>
+              <w:t>0.34</w:t>
             </w:r>
           </w:p>
         </w:tc>
@@ -14800,13 +14617,7 @@
               <w:rPr>
                 <w:color w:val="000000"/>
               </w:rPr>
-              <w:t>0.</w:t>
-            </w:r>
-            <w:r>
-              <w:rPr>
-                <w:color w:val="000000"/>
-              </w:rPr>
-              <w:t>73</w:t>
+              <w:t>0.73</w:t>
             </w:r>
           </w:p>
         </w:tc>
@@ -14826,13 +14637,7 @@
               <w:rPr>
                 <w:color w:val="000000"/>
               </w:rPr>
-              <w:t>0.</w:t>
-            </w:r>
-            <w:r>
-              <w:rPr>
-                <w:color w:val="000000"/>
-              </w:rPr>
-              <w:t>46</w:t>
+              <w:t>0.46</w:t>
             </w:r>
           </w:p>
         </w:tc>
@@ -14951,13 +14756,7 @@
               <w:rPr>
                 <w:color w:val="000000"/>
               </w:rPr>
-              <w:t>0.</w:t>
-            </w:r>
-            <w:r>
-              <w:rPr>
-                <w:color w:val="000000"/>
-              </w:rPr>
-              <w:t>36</w:t>
+              <w:t>0.36</w:t>
             </w:r>
           </w:p>
         </w:tc>
@@ -15027,13 +14826,7 @@
               <w:rPr>
                 <w:color w:val="000000"/>
               </w:rPr>
-              <w:t>0.2</w:t>
-            </w:r>
-            <w:r>
-              <w:rPr>
-                <w:color w:val="000000"/>
-              </w:rPr>
-              <w:t>2</w:t>
+              <w:t>0.22</w:t>
             </w:r>
           </w:p>
         </w:tc>
@@ -15053,19 +14846,7 @@
               <w:rPr>
                 <w:color w:val="000000"/>
               </w:rPr>
-              <w:t>0.</w:t>
-            </w:r>
-            <w:r>
-              <w:rPr>
-                <w:color w:val="000000"/>
-              </w:rPr>
-              <w:t>3</w:t>
-            </w:r>
-            <w:r>
-              <w:rPr>
-                <w:color w:val="000000"/>
-              </w:rPr>
-              <w:t>6</w:t>
+              <w:t>0.36</w:t>
             </w:r>
           </w:p>
         </w:tc>
@@ -15085,13 +14866,7 @@
               <w:rPr>
                 <w:color w:val="000000"/>
               </w:rPr>
-              <w:t>0.2</w:t>
-            </w:r>
-            <w:r>
-              <w:rPr>
-                <w:color w:val="000000"/>
-              </w:rPr>
-              <w:t>7</w:t>
+              <w:t>0.27</w:t>
             </w:r>
           </w:p>
         </w:tc>
@@ -15111,13 +14886,7 @@
               <w:rPr>
                 <w:color w:val="000000"/>
               </w:rPr>
-              <w:t>2</w:t>
-            </w:r>
-            <w:r>
-              <w:rPr>
-                <w:color w:val="000000"/>
-              </w:rPr>
-              <w:t>680</w:t>
+              <w:t>2680</w:t>
             </w:r>
           </w:p>
         </w:tc>
@@ -15169,13 +14938,7 @@
               <w:rPr>
                 <w:color w:val="000000"/>
               </w:rPr>
-              <w:t>0.</w:t>
-            </w:r>
-            <w:r>
-              <w:rPr>
-                <w:color w:val="000000"/>
-              </w:rPr>
-              <w:t>22</w:t>
+              <w:t>0.22</w:t>
             </w:r>
           </w:p>
         </w:tc>
@@ -15198,13 +14961,7 @@
               <w:rPr>
                 <w:color w:val="000000"/>
               </w:rPr>
-              <w:t>0.</w:t>
-            </w:r>
-            <w:r>
-              <w:rPr>
-                <w:color w:val="000000"/>
-              </w:rPr>
-              <w:t>36</w:t>
+              <w:t>0.36</w:t>
             </w:r>
           </w:p>
         </w:tc>
@@ -15227,13 +14984,7 @@
               <w:rPr>
                 <w:color w:val="000000"/>
               </w:rPr>
-              <w:t>0.</w:t>
-            </w:r>
-            <w:r>
-              <w:rPr>
-                <w:color w:val="000000"/>
-              </w:rPr>
-              <w:t>27</w:t>
+              <w:t>0.27</w:t>
             </w:r>
           </w:p>
         </w:tc>
@@ -15256,13 +15007,7 @@
               <w:rPr>
                 <w:color w:val="000000"/>
               </w:rPr>
-              <w:t>2</w:t>
-            </w:r>
-            <w:r>
-              <w:rPr>
-                <w:color w:val="000000"/>
-              </w:rPr>
-              <w:t>680</w:t>
+              <w:t>2680</w:t>
             </w:r>
           </w:p>
         </w:tc>
@@ -17077,7 +16822,7 @@
       <w:r>
         <w:t xml:space="preserve"> </w:t>
       </w:r>
-      <w:hyperlink r:id="rId21" w:history="1">
+      <w:hyperlink r:id="rId21" w:anchor="sklearn.metrics.silhouette_score" w:history="1">
         <w:r>
           <w:rPr>
             <w:rStyle w:val="Hyperlink"/>
@@ -17116,7 +16861,7 @@
       <w:r>
         <w:t xml:space="preserve"> </w:t>
       </w:r>
-      <w:hyperlink r:id="rId22" w:history="1">
+      <w:hyperlink r:id="rId22" w:anchor="sklearn.metrics.adjusted_rand_score" w:history="1">
         <w:r>
           <w:rPr>
             <w:rStyle w:val="Hyperlink"/>
@@ -17155,7 +16900,7 @@
       <w:r>
         <w:t xml:space="preserve"> </w:t>
       </w:r>
-      <w:hyperlink r:id="rId23" w:history="1">
+      <w:hyperlink r:id="rId23" w:anchor="sklearn.metrics.normalized_mutual_info_score" w:history="1">
         <w:r>
           <w:rPr>
             <w:rStyle w:val="Hyperlink"/>
@@ -17302,28 +17047,7 @@
         <w:t>"</w:t>
       </w:r>
       <w:r>
-        <w:t>Multidimenzionális id</w:t>
-      </w:r>
-      <w:r>
-        <w:t>ő</w:t>
-      </w:r>
-      <w:r>
-        <w:t>sorok el</w:t>
-      </w:r>
-      <w:r>
-        <w:t>ő</w:t>
-      </w:r>
-      <w:r>
-        <w:t>feldolgozása és osztályozása deep</w:t>
-      </w:r>
-      <w:r>
-        <w:t xml:space="preserve"> </w:t>
-      </w:r>
-      <w:r>
-        <w:t>learning alapú megközelítésekkel</w:t>
-      </w:r>
-      <w:r>
-        <w:t>,</w:t>
+        <w:t>Multidimenzionális idősorok előfeldolgozása és osztályozása deep learning alapú megközelítésekkel,</w:t>
       </w:r>
       <w:r>
         <w:t>"</w:t>
@@ -17399,19 +17123,7 @@
           <w:rPr>
             <w:rStyle w:val="Hyperlink"/>
           </w:rPr>
-          <w:t>https://github.com/moment-ti</w:t>
-        </w:r>
-        <w:r>
-          <w:rPr>
-            <w:rStyle w:val="Hyperlink"/>
-          </w:rPr>
-          <w:t>m</w:t>
-        </w:r>
-        <w:r>
-          <w:rPr>
-            <w:rStyle w:val="Hyperlink"/>
-          </w:rPr>
-          <w:t>eseries-foundation-model/moment</w:t>
+          <w:t>https://github.com/moment-timeseries-foundation-model/moment</w:t>
         </w:r>
       </w:hyperlink>
       <w:r>
@@ -17644,7 +17356,105 @@
     <w:p>
       <w:pPr>
         <w:rPr>
-          <w:lang w:val="hu-HU"/>
+          <w:noProof/>
+        </w:rPr>
+      </w:pPr>
+    </w:p>
+    <w:p>
+      <w:pPr>
+        <w:rPr>
+          <w:noProof/>
+        </w:rPr>
+      </w:pPr>
+    </w:p>
+    <w:p>
+      <w:pPr>
+        <w:rPr>
+          <w:noProof/>
+        </w:rPr>
+      </w:pPr>
+      <w:r>
+        <w:rPr>
+          <w:noProof/>
+        </w:rPr>
+        <w:drawing>
+          <wp:anchor distT="0" distB="0" distL="114300" distR="114300" simplePos="0" relativeHeight="251666432" behindDoc="0" locked="0" layoutInCell="1" allowOverlap="1" wp14:anchorId="5FF42896" wp14:editId="55C2DD83">
+            <wp:simplePos x="0" y="0"/>
+            <wp:positionH relativeFrom="margin">
+              <wp:posOffset>2901315</wp:posOffset>
+            </wp:positionH>
+            <wp:positionV relativeFrom="paragraph">
+              <wp:posOffset>105410</wp:posOffset>
+            </wp:positionV>
+            <wp:extent cx="1775883" cy="290733"/>
+            <wp:effectExtent l="0" t="0" r="0" b="0"/>
+            <wp:wrapNone/>
+            <wp:docPr id="1" name="Picture 1"/>
+            <wp:cNvGraphicFramePr>
+              <a:graphicFrameLocks xmlns:a="http://schemas.openxmlformats.org/drawingml/2006/main" noChangeAspect="1"/>
+            </wp:cNvGraphicFramePr>
+            <a:graphic xmlns:a="http://schemas.openxmlformats.org/drawingml/2006/main">
+              <a:graphicData uri="http://schemas.openxmlformats.org/drawingml/2006/picture">
+                <pic:pic xmlns:pic="http://schemas.openxmlformats.org/drawingml/2006/picture">
+                  <pic:nvPicPr>
+                    <pic:cNvPr id="1" name=""/>
+                    <pic:cNvPicPr/>
+                  </pic:nvPicPr>
+                  <pic:blipFill rotWithShape="1">
+                    <a:blip r:embed="rId30" cstate="print">
+                      <a:clrChange>
+                        <a:clrFrom>
+                          <a:srgbClr val="FCFCFC"/>
+                        </a:clrFrom>
+                        <a:clrTo>
+                          <a:srgbClr val="FCFCFC">
+                            <a:alpha val="0"/>
+                          </a:srgbClr>
+                        </a:clrTo>
+                      </a:clrChange>
+                      <a:extLst>
+                        <a:ext uri="{28A0092B-C50C-407E-A947-70E740481C1C}">
+                          <a14:useLocalDpi xmlns:a14="http://schemas.microsoft.com/office/drawing/2010/main" val="0"/>
+                        </a:ext>
+                      </a:extLst>
+                    </a:blip>
+                    <a:srcRect l="15297" t="23572" r="23153" b="40132"/>
+                    <a:stretch/>
+                  </pic:blipFill>
+                  <pic:spPr bwMode="auto">
+                    <a:xfrm>
+                      <a:off x="0" y="0"/>
+                      <a:ext cx="1775883" cy="290733"/>
+                    </a:xfrm>
+                    <a:prstGeom prst="rect">
+                      <a:avLst/>
+                    </a:prstGeom>
+                    <a:ln>
+                      <a:noFill/>
+                    </a:ln>
+                    <a:extLst>
+                      <a:ext uri="{53640926-AAD7-44D8-BBD7-CCE9431645EC}">
+                        <a14:shadowObscured xmlns:a14="http://schemas.microsoft.com/office/drawing/2010/main"/>
+                      </a:ext>
+                    </a:extLst>
+                  </pic:spPr>
+                </pic:pic>
+              </a:graphicData>
+            </a:graphic>
+            <wp14:sizeRelH relativeFrom="page">
+              <wp14:pctWidth>0</wp14:pctWidth>
+            </wp14:sizeRelH>
+            <wp14:sizeRelV relativeFrom="page">
+              <wp14:pctHeight>0</wp14:pctHeight>
+            </wp14:sizeRelV>
+          </wp:anchor>
+        </w:drawing>
+      </w:r>
+    </w:p>
+    <w:p>
+      <w:pPr>
+        <w:rPr>
+          <w:noProof/>
         </w:rPr>
       </w:pPr>
       <w:r>
@@ -17652,6 +17462,12 @@
           <w:lang w:val="hu-HU"/>
         </w:rPr>
         <w:t>Dátum</w:t>
+      </w:r>
+      <w:r>
+        <w:rPr>
+          <w:lang w:val="hu-HU"/>
+        </w:rPr>
+        <w:t xml:space="preserve">: Kecskemét, 2026. május 22. </w:t>
       </w:r>
     </w:p>
     <w:p>
@@ -17850,7 +17666,7 @@
       </w:pPr>
     </w:p>
     <w:sectPr>
-      <w:footerReference w:type="default" r:id="rId30"/>
+      <w:footerReference w:type="default" r:id="rId31"/>
       <w:pgSz w:w="11906" w:h="16838"/>
       <w:pgMar w:top="1417" w:right="1417" w:bottom="1417" w:left="1417" w:header="0" w:footer="708" w:gutter="0"/>
       <w:pgNumType w:start="0"/>
@@ -20443,6 +20259,7 @@
   <w:style w:type="character" w:default="1" w:styleId="DefaultParagraphFont">
     <w:name w:val="Default Paragraph Font"/>
     <w:uiPriority w:val="1"/>
+    <w:semiHidden/>
     <w:unhideWhenUsed/>
   </w:style>
   <w:style w:type="table" w:default="1" w:styleId="TableNormal">

</xml_diff>